<commit_message>
add chen notation er model
</commit_message>
<xml_diff>
--- a/docs/Dokumentacio.docx
+++ b/docs/Dokumentacio.docx
@@ -79,25 +79,25 @@
       </w:pPr>
       <w:bookmarkStart w:name="__RefHeading___Toc4924_3940868065" w:id="0"/>
       <w:bookmarkEnd w:id="0"/>
-      <w:bookmarkStart w:name="_Toc495284463" w:id="1495306253"/>
+      <w:bookmarkStart w:name="_Toc746906418" w:id="907292142"/>
       <w:r>
         <w:rPr/>
         <w:t>Tartalomjegyzék</w:t>
       </w:r>
       <w:bookmarkStart w:name="__RefHeading___Toc4926_3940868065" w:id="1"/>
       <w:bookmarkEnd w:id="1"/>
-      <w:bookmarkEnd w:id="1495306253"/>
+      <w:bookmarkEnd w:id="907292142"/>
     </w:p>
     <w:sdt>
       <w:sdtPr>
-        <w:id w:val="1486960619"/>
+        <w:id w:val="1824929131"/>
         <w:docPartObj>
           <w:docPartGallery w:val="Table of Contents"/>
           <w:docPartUnique/>
         </w:docPartObj>
       </w:sdtPr>
       <w:sdtContent>
-        <w:p xmlns:wp14="http://schemas.microsoft.com/office/word/2010/wordml" wp14:textId="22512588">
+        <w:p xmlns:wp14="http://schemas.microsoft.com/office/word/2010/wordml" wp14:textId="4B1B5559">
           <w:pPr>
             <w:pStyle w:val="TOC1"/>
             <w:tabs>
@@ -116,7 +116,7 @@
           <w:r>
             <w:fldChar w:fldCharType="separate"/>
           </w:r>
-          <w:hyperlink w:anchor="_Toc495284463">
+          <w:hyperlink w:anchor="_Toc746906418">
             <w:r>
               <w:rPr>
                 <w:rStyle w:val="Hyperlink"/>
@@ -130,7 +130,7 @@
               <w:fldChar w:fldCharType="begin"/>
             </w:r>
             <w:r>
-              <w:instrText xml:space="preserve">PAGEREF _Toc495284463 \h</w:instrText>
+              <w:instrText xml:space="preserve">PAGEREF _Toc746906418 \h</w:instrText>
             </w:r>
             <w:r>
               <w:fldChar w:fldCharType="separate"/>
@@ -146,7 +146,7 @@
             </w:r>
           </w:hyperlink>
         </w:p>
-        <w:p xmlns:wp14="http://schemas.microsoft.com/office/word/2010/wordml" wp14:textId="4293A01E">
+        <w:p xmlns:wp14="http://schemas.microsoft.com/office/word/2010/wordml" wp14:textId="2CD2D3A6">
           <w:pPr>
             <w:pStyle w:val="TOC1"/>
             <w:tabs>
@@ -156,7 +156,7 @@
               <w:rStyle w:val="Hyperlink"/>
             </w:rPr>
           </w:pPr>
-          <w:hyperlink w:anchor="_Toc964201530">
+          <w:hyperlink w:anchor="_Toc530086350">
             <w:r>
               <w:rPr>
                 <w:rStyle w:val="Hyperlink"/>
@@ -170,7 +170,7 @@
               <w:fldChar w:fldCharType="begin"/>
             </w:r>
             <w:r>
-              <w:instrText xml:space="preserve">PAGEREF _Toc964201530 \h</w:instrText>
+              <w:instrText xml:space="preserve">PAGEREF _Toc530086350 \h</w:instrText>
             </w:r>
             <w:r>
               <w:fldChar w:fldCharType="separate"/>
@@ -186,7 +186,7 @@
             </w:r>
           </w:hyperlink>
         </w:p>
-        <w:p xmlns:wp14="http://schemas.microsoft.com/office/word/2010/wordml" wp14:textId="743FA6FE">
+        <w:p xmlns:wp14="http://schemas.microsoft.com/office/word/2010/wordml" wp14:textId="01C189D0">
           <w:pPr>
             <w:pStyle w:val="TOC2"/>
             <w:tabs>
@@ -196,7 +196,7 @@
               <w:rStyle w:val="Hyperlink"/>
             </w:rPr>
           </w:pPr>
-          <w:hyperlink w:anchor="_Toc1350191444">
+          <w:hyperlink w:anchor="_Toc87150431">
             <w:r>
               <w:rPr>
                 <w:rStyle w:val="Hyperlink"/>
@@ -210,7 +210,7 @@
               <w:fldChar w:fldCharType="begin"/>
             </w:r>
             <w:r>
-              <w:instrText xml:space="preserve">PAGEREF _Toc1350191444 \h</w:instrText>
+              <w:instrText xml:space="preserve">PAGEREF _Toc87150431 \h</w:instrText>
             </w:r>
             <w:r>
               <w:fldChar w:fldCharType="separate"/>
@@ -226,7 +226,7 @@
             </w:r>
           </w:hyperlink>
         </w:p>
-        <w:p xmlns:wp14="http://schemas.microsoft.com/office/word/2010/wordml" wp14:textId="694E9638">
+        <w:p xmlns:wp14="http://schemas.microsoft.com/office/word/2010/wordml" wp14:textId="5E365796">
           <w:pPr>
             <w:pStyle w:val="TOC2"/>
             <w:tabs>
@@ -236,7 +236,7 @@
               <w:rStyle w:val="Hyperlink"/>
             </w:rPr>
           </w:pPr>
-          <w:hyperlink w:anchor="_Toc129092815">
+          <w:hyperlink w:anchor="_Toc277638745">
             <w:r>
               <w:rPr>
                 <w:rStyle w:val="Hyperlink"/>
@@ -250,7 +250,7 @@
               <w:fldChar w:fldCharType="begin"/>
             </w:r>
             <w:r>
-              <w:instrText xml:space="preserve">PAGEREF _Toc129092815 \h</w:instrText>
+              <w:instrText xml:space="preserve">PAGEREF _Toc277638745 \h</w:instrText>
             </w:r>
             <w:r>
               <w:fldChar w:fldCharType="separate"/>
@@ -266,7 +266,7 @@
             </w:r>
           </w:hyperlink>
         </w:p>
-        <w:p xmlns:wp14="http://schemas.microsoft.com/office/word/2010/wordml" wp14:textId="32B43DF5">
+        <w:p xmlns:wp14="http://schemas.microsoft.com/office/word/2010/wordml" wp14:textId="0C0BA694">
           <w:pPr>
             <w:pStyle w:val="TOC2"/>
             <w:tabs>
@@ -276,7 +276,7 @@
               <w:rStyle w:val="Hyperlink"/>
             </w:rPr>
           </w:pPr>
-          <w:hyperlink w:anchor="_Toc1946150416">
+          <w:hyperlink w:anchor="_Toc1028152592">
             <w:r>
               <w:rPr>
                 <w:rStyle w:val="Hyperlink"/>
@@ -290,7 +290,7 @@
               <w:fldChar w:fldCharType="begin"/>
             </w:r>
             <w:r>
-              <w:instrText xml:space="preserve">PAGEREF _Toc1946150416 \h</w:instrText>
+              <w:instrText xml:space="preserve">PAGEREF _Toc1028152592 \h</w:instrText>
             </w:r>
             <w:r>
               <w:fldChar w:fldCharType="separate"/>
@@ -306,7 +306,7 @@
             </w:r>
           </w:hyperlink>
         </w:p>
-        <w:p xmlns:wp14="http://schemas.microsoft.com/office/word/2010/wordml" wp14:textId="75DC9644">
+        <w:p xmlns:wp14="http://schemas.microsoft.com/office/word/2010/wordml" wp14:textId="3C0BA9E1">
           <w:pPr>
             <w:pStyle w:val="TOC2"/>
             <w:tabs>
@@ -316,7 +316,7 @@
               <w:rStyle w:val="Hyperlink"/>
             </w:rPr>
           </w:pPr>
-          <w:hyperlink w:anchor="_Toc1253102048">
+          <w:hyperlink w:anchor="_Toc1798781352">
             <w:r>
               <w:rPr>
                 <w:rStyle w:val="Hyperlink"/>
@@ -330,7 +330,7 @@
               <w:fldChar w:fldCharType="begin"/>
             </w:r>
             <w:r>
-              <w:instrText xml:space="preserve">PAGEREF _Toc1253102048 \h</w:instrText>
+              <w:instrText xml:space="preserve">PAGEREF _Toc1798781352 \h</w:instrText>
             </w:r>
             <w:r>
               <w:fldChar w:fldCharType="separate"/>
@@ -346,7 +346,7 @@
             </w:r>
           </w:hyperlink>
         </w:p>
-        <w:p xmlns:wp14="http://schemas.microsoft.com/office/word/2010/wordml" wp14:textId="565950B2">
+        <w:p xmlns:wp14="http://schemas.microsoft.com/office/word/2010/wordml" wp14:textId="1AA8282B">
           <w:pPr>
             <w:pStyle w:val="TOC2"/>
             <w:tabs>
@@ -356,7 +356,7 @@
               <w:rStyle w:val="Hyperlink"/>
             </w:rPr>
           </w:pPr>
-          <w:hyperlink w:anchor="_Toc1705965944">
+          <w:hyperlink w:anchor="_Toc109796080">
             <w:r>
               <w:rPr>
                 <w:rStyle w:val="Hyperlink"/>
@@ -370,7 +370,7 @@
               <w:fldChar w:fldCharType="begin"/>
             </w:r>
             <w:r>
-              <w:instrText xml:space="preserve">PAGEREF _Toc1705965944 \h</w:instrText>
+              <w:instrText xml:space="preserve">PAGEREF _Toc109796080 \h</w:instrText>
             </w:r>
             <w:r>
               <w:fldChar w:fldCharType="separate"/>
@@ -386,7 +386,7 @@
             </w:r>
           </w:hyperlink>
         </w:p>
-        <w:p xmlns:wp14="http://schemas.microsoft.com/office/word/2010/wordml" wp14:textId="0F0CBF52">
+        <w:p xmlns:wp14="http://schemas.microsoft.com/office/word/2010/wordml" wp14:textId="19FD1CA3">
           <w:pPr>
             <w:pStyle w:val="TOC1"/>
             <w:tabs>
@@ -396,7 +396,7 @@
               <w:rStyle w:val="Hyperlink"/>
             </w:rPr>
           </w:pPr>
-          <w:hyperlink w:anchor="_Toc986377942">
+          <w:hyperlink w:anchor="_Toc2099524464">
             <w:r>
               <w:rPr>
                 <w:rStyle w:val="Hyperlink"/>
@@ -410,7 +410,7 @@
               <w:fldChar w:fldCharType="begin"/>
             </w:r>
             <w:r>
-              <w:instrText xml:space="preserve">PAGEREF _Toc986377942 \h</w:instrText>
+              <w:instrText xml:space="preserve">PAGEREF _Toc2099524464 \h</w:instrText>
             </w:r>
             <w:r>
               <w:fldChar w:fldCharType="separate"/>
@@ -426,7 +426,7 @@
             </w:r>
           </w:hyperlink>
         </w:p>
-        <w:p xmlns:wp14="http://schemas.microsoft.com/office/word/2010/wordml" wp14:textId="1206AB2F">
+        <w:p xmlns:wp14="http://schemas.microsoft.com/office/word/2010/wordml" wp14:textId="6ABC7392">
           <w:pPr>
             <w:pStyle w:val="TOC2"/>
             <w:tabs>
@@ -436,7 +436,7 @@
               <w:rStyle w:val="Hyperlink"/>
             </w:rPr>
           </w:pPr>
-          <w:hyperlink w:anchor="_Toc1451014950">
+          <w:hyperlink w:anchor="_Toc1075620185">
             <w:r>
               <w:rPr>
                 <w:rStyle w:val="Hyperlink"/>
@@ -450,7 +450,7 @@
               <w:fldChar w:fldCharType="begin"/>
             </w:r>
             <w:r>
-              <w:instrText xml:space="preserve">PAGEREF _Toc1451014950 \h</w:instrText>
+              <w:instrText xml:space="preserve">PAGEREF _Toc1075620185 \h</w:instrText>
             </w:r>
             <w:r>
               <w:fldChar w:fldCharType="separate"/>
@@ -466,7 +466,7 @@
             </w:r>
           </w:hyperlink>
         </w:p>
-        <w:p xmlns:wp14="http://schemas.microsoft.com/office/word/2010/wordml" wp14:textId="64A80941">
+        <w:p xmlns:wp14="http://schemas.microsoft.com/office/word/2010/wordml" wp14:textId="748E9687">
           <w:pPr>
             <w:pStyle w:val="TOC3"/>
             <w:tabs>
@@ -476,7 +476,7 @@
               <w:rStyle w:val="Hyperlink"/>
             </w:rPr>
           </w:pPr>
-          <w:hyperlink w:anchor="_Toc1221281361">
+          <w:hyperlink w:anchor="_Toc1406078125">
             <w:r>
               <w:rPr>
                 <w:rStyle w:val="Hyperlink"/>
@@ -490,7 +490,7 @@
               <w:fldChar w:fldCharType="begin"/>
             </w:r>
             <w:r>
-              <w:instrText xml:space="preserve">PAGEREF _Toc1221281361 \h</w:instrText>
+              <w:instrText xml:space="preserve">PAGEREF _Toc1406078125 \h</w:instrText>
             </w:r>
             <w:r>
               <w:fldChar w:fldCharType="separate"/>
@@ -506,7 +506,7 @@
             </w:r>
           </w:hyperlink>
         </w:p>
-        <w:p xmlns:wp14="http://schemas.microsoft.com/office/word/2010/wordml" wp14:textId="707561CA">
+        <w:p xmlns:wp14="http://schemas.microsoft.com/office/word/2010/wordml" wp14:textId="54E68CCB">
           <w:pPr>
             <w:pStyle w:val="TOC3"/>
             <w:tabs>
@@ -516,12 +516,12 @@
               <w:rStyle w:val="Hyperlink"/>
             </w:rPr>
           </w:pPr>
-          <w:hyperlink w:anchor="_Toc2100168869">
+          <w:hyperlink w:anchor="_Toc1653491058">
             <w:r>
               <w:rPr>
                 <w:rStyle w:val="Hyperlink"/>
               </w:rPr>
-              <w:t>Adatbázis struktúra (Crow’s foot notation)</w:t>
+              <w:t>Adatbázis struktúra - ER Model</w:t>
             </w:r>
             <w:r>
               <w:tab/>
@@ -530,7 +530,7 @@
               <w:fldChar w:fldCharType="begin"/>
             </w:r>
             <w:r>
-              <w:instrText xml:space="preserve">PAGEREF _Toc2100168869 \h</w:instrText>
+              <w:instrText xml:space="preserve">PAGEREF _Toc1653491058 \h</w:instrText>
             </w:r>
             <w:r>
               <w:fldChar w:fldCharType="separate"/>
@@ -546,7 +546,87 @@
             </w:r>
           </w:hyperlink>
         </w:p>
-        <w:p xmlns:wp14="http://schemas.microsoft.com/office/word/2010/wordml" wp14:textId="2319DC37">
+        <w:p xmlns:wp14="http://schemas.microsoft.com/office/word/2010/wordml" wp14:textId="5AF7251C">
+          <w:pPr>
+            <w:pStyle w:val="TOC4"/>
+            <w:tabs>
+              <w:tab w:val="right" w:leader="dot" w:pos="9630"/>
+            </w:tabs>
+            <w:rPr>
+              <w:rStyle w:val="Hyperlink"/>
+            </w:rPr>
+          </w:pPr>
+          <w:hyperlink w:anchor="_Toc354457891">
+            <w:r>
+              <w:rPr>
+                <w:rStyle w:val="Hyperlink"/>
+              </w:rPr>
+              <w:t>Crow’s foot notation</w:t>
+            </w:r>
+            <w:r>
+              <w:tab/>
+            </w:r>
+            <w:r>
+              <w:fldChar w:fldCharType="begin"/>
+            </w:r>
+            <w:r>
+              <w:instrText xml:space="preserve">PAGEREF _Toc354457891 \h</w:instrText>
+            </w:r>
+            <w:r>
+              <w:fldChar w:fldCharType="separate"/>
+            </w:r>
+            <w:r>
+              <w:rPr>
+                <w:rStyle w:val="Hyperlink"/>
+              </w:rPr>
+              <w:t>4</w:t>
+            </w:r>
+            <w:r>
+              <w:fldChar w:fldCharType="end"/>
+            </w:r>
+          </w:hyperlink>
+        </w:p>
+        <w:p xmlns:wp14="http://schemas.microsoft.com/office/word/2010/wordml" wp14:textId="76E95895">
+          <w:pPr>
+            <w:pStyle w:val="TOC4"/>
+            <w:tabs>
+              <w:tab w:val="right" w:leader="dot" w:pos="9630"/>
+            </w:tabs>
+            <w:rPr>
+              <w:rStyle w:val="Hyperlink"/>
+            </w:rPr>
+          </w:pPr>
+          <w:hyperlink w:anchor="_Toc1390894290">
+            <w:r>
+              <w:rPr>
+                <w:rStyle w:val="Hyperlink"/>
+              </w:rPr>
+              <w:t>Chen notation</w:t>
+            </w:r>
+            <w:r>
+              <w:tab/>
+            </w:r>
+            <w:r>
+              <w:fldChar w:fldCharType="begin"/>
+            </w:r>
+            <w:r>
+              <w:instrText xml:space="preserve">PAGEREF _Toc1390894290 \h</w:instrText>
+            </w:r>
+            <w:r>
+              <w:fldChar w:fldCharType="separate"/>
+            </w:r>
+            <w:r>
+              <w:rPr>
+                <w:rStyle w:val="Hyperlink"/>
+              </w:rPr>
+              <w:t>4</w:t>
+            </w:r>
+            <w:r>
+              <w:fldChar w:fldCharType="end"/>
+            </w:r>
+          </w:hyperlink>
+        </w:p>
+        <w:p xmlns:wp14="http://schemas.microsoft.com/office/word/2010/wordml" wp14:textId="76A8C91A">
           <w:pPr>
             <w:pStyle w:val="TOC3"/>
             <w:tabs>
@@ -556,7 +636,7 @@
               <w:rStyle w:val="Hyperlink"/>
             </w:rPr>
           </w:pPr>
-          <w:hyperlink w:anchor="_Toc490162405">
+          <w:hyperlink w:anchor="_Toc838338487">
             <w:r>
               <w:rPr>
                 <w:rStyle w:val="Hyperlink"/>
@@ -570,7 +650,7 @@
               <w:fldChar w:fldCharType="begin"/>
             </w:r>
             <w:r>
-              <w:instrText xml:space="preserve">PAGEREF _Toc490162405 \h</w:instrText>
+              <w:instrText xml:space="preserve">PAGEREF _Toc838338487 \h</w:instrText>
             </w:r>
             <w:r>
               <w:fldChar w:fldCharType="separate"/>
@@ -579,14 +659,14 @@
               <w:rPr>
                 <w:rStyle w:val="Hyperlink"/>
               </w:rPr>
-              <w:t>5</w:t>
+              <w:t>6</w:t>
             </w:r>
             <w:r>
               <w:fldChar w:fldCharType="end"/>
             </w:r>
           </w:hyperlink>
         </w:p>
-        <w:p xmlns:wp14="http://schemas.microsoft.com/office/word/2010/wordml" wp14:textId="04B16E14">
+        <w:p xmlns:wp14="http://schemas.microsoft.com/office/word/2010/wordml" wp14:textId="6DF9F637">
           <w:pPr>
             <w:pStyle w:val="TOC4"/>
             <w:tabs>
@@ -596,7 +676,7 @@
               <w:rStyle w:val="Hyperlink"/>
             </w:rPr>
           </w:pPr>
-          <w:hyperlink w:anchor="_Toc327338505">
+          <w:hyperlink w:anchor="_Toc2104963647">
             <w:r>
               <w:rPr>
                 <w:rStyle w:val="Hyperlink"/>
@@ -610,7 +690,7 @@
               <w:fldChar w:fldCharType="begin"/>
             </w:r>
             <w:r>
-              <w:instrText xml:space="preserve">PAGEREF _Toc327338505 \h</w:instrText>
+              <w:instrText xml:space="preserve">PAGEREF _Toc2104963647 \h</w:instrText>
             </w:r>
             <w:r>
               <w:fldChar w:fldCharType="separate"/>
@@ -619,14 +699,14 @@
               <w:rPr>
                 <w:rStyle w:val="Hyperlink"/>
               </w:rPr>
-              <w:t>5</w:t>
+              <w:t>6</w:t>
             </w:r>
             <w:r>
               <w:fldChar w:fldCharType="end"/>
             </w:r>
           </w:hyperlink>
         </w:p>
-        <w:p xmlns:wp14="http://schemas.microsoft.com/office/word/2010/wordml" wp14:textId="400FBB2E">
+        <w:p xmlns:wp14="http://schemas.microsoft.com/office/word/2010/wordml" wp14:textId="3C0063F7">
           <w:pPr>
             <w:pStyle w:val="TOC4"/>
             <w:tabs>
@@ -636,7 +716,7 @@
               <w:rStyle w:val="Hyperlink"/>
             </w:rPr>
           </w:pPr>
-          <w:hyperlink w:anchor="_Toc1212072526">
+          <w:hyperlink w:anchor="_Toc2034662573">
             <w:r>
               <w:rPr>
                 <w:rStyle w:val="Hyperlink"/>
@@ -650,7 +730,7 @@
               <w:fldChar w:fldCharType="begin"/>
             </w:r>
             <w:r>
-              <w:instrText xml:space="preserve">PAGEREF _Toc1212072526 \h</w:instrText>
+              <w:instrText xml:space="preserve">PAGEREF _Toc2034662573 \h</w:instrText>
             </w:r>
             <w:r>
               <w:fldChar w:fldCharType="separate"/>
@@ -659,14 +739,14 @@
               <w:rPr>
                 <w:rStyle w:val="Hyperlink"/>
               </w:rPr>
-              <w:t>5</w:t>
+              <w:t>6</w:t>
             </w:r>
             <w:r>
               <w:fldChar w:fldCharType="end"/>
             </w:r>
           </w:hyperlink>
         </w:p>
-        <w:p xmlns:wp14="http://schemas.microsoft.com/office/word/2010/wordml" wp14:textId="06A756B6">
+        <w:p xmlns:wp14="http://schemas.microsoft.com/office/word/2010/wordml" wp14:textId="73D38AE4">
           <w:pPr>
             <w:pStyle w:val="TOC4"/>
             <w:tabs>
@@ -676,7 +756,7 @@
               <w:rStyle w:val="Hyperlink"/>
             </w:rPr>
           </w:pPr>
-          <w:hyperlink w:anchor="_Toc278227514">
+          <w:hyperlink w:anchor="_Toc183638693">
             <w:r>
               <w:rPr>
                 <w:rStyle w:val="Hyperlink"/>
@@ -690,7 +770,7 @@
               <w:fldChar w:fldCharType="begin"/>
             </w:r>
             <w:r>
-              <w:instrText xml:space="preserve">PAGEREF _Toc278227514 \h</w:instrText>
+              <w:instrText xml:space="preserve">PAGEREF _Toc183638693 \h</w:instrText>
             </w:r>
             <w:r>
               <w:fldChar w:fldCharType="separate"/>
@@ -699,14 +779,14 @@
               <w:rPr>
                 <w:rStyle w:val="Hyperlink"/>
               </w:rPr>
-              <w:t>6</w:t>
+              <w:t>7</w:t>
             </w:r>
             <w:r>
               <w:fldChar w:fldCharType="end"/>
             </w:r>
           </w:hyperlink>
         </w:p>
-        <w:p xmlns:wp14="http://schemas.microsoft.com/office/word/2010/wordml" wp14:textId="059A662A">
+        <w:p xmlns:wp14="http://schemas.microsoft.com/office/word/2010/wordml" wp14:textId="4E229C4E">
           <w:pPr>
             <w:pStyle w:val="TOC4"/>
             <w:tabs>
@@ -716,7 +796,7 @@
               <w:rStyle w:val="Hyperlink"/>
             </w:rPr>
           </w:pPr>
-          <w:hyperlink w:anchor="_Toc1027427630">
+          <w:hyperlink w:anchor="_Toc1568822488">
             <w:r>
               <w:rPr>
                 <w:rStyle w:val="Hyperlink"/>
@@ -730,7 +810,7 @@
               <w:fldChar w:fldCharType="begin"/>
             </w:r>
             <w:r>
-              <w:instrText xml:space="preserve">PAGEREF _Toc1027427630 \h</w:instrText>
+              <w:instrText xml:space="preserve">PAGEREF _Toc1568822488 \h</w:instrText>
             </w:r>
             <w:r>
               <w:fldChar w:fldCharType="separate"/>
@@ -739,14 +819,14 @@
               <w:rPr>
                 <w:rStyle w:val="Hyperlink"/>
               </w:rPr>
-              <w:t>6</w:t>
+              <w:t>7</w:t>
             </w:r>
             <w:r>
               <w:fldChar w:fldCharType="end"/>
             </w:r>
           </w:hyperlink>
         </w:p>
-        <w:p xmlns:wp14="http://schemas.microsoft.com/office/word/2010/wordml" wp14:textId="4C4053DE">
+        <w:p xmlns:wp14="http://schemas.microsoft.com/office/word/2010/wordml" wp14:textId="5590268A">
           <w:pPr>
             <w:pStyle w:val="TOC4"/>
             <w:tabs>
@@ -756,7 +836,7 @@
               <w:rStyle w:val="Hyperlink"/>
             </w:rPr>
           </w:pPr>
-          <w:hyperlink w:anchor="_Toc2098059708">
+          <w:hyperlink w:anchor="_Toc1029308870">
             <w:r>
               <w:rPr>
                 <w:rStyle w:val="Hyperlink"/>
@@ -770,7 +850,7 @@
               <w:fldChar w:fldCharType="begin"/>
             </w:r>
             <w:r>
-              <w:instrText xml:space="preserve">PAGEREF _Toc2098059708 \h</w:instrText>
+              <w:instrText xml:space="preserve">PAGEREF _Toc1029308870 \h</w:instrText>
             </w:r>
             <w:r>
               <w:fldChar w:fldCharType="separate"/>
@@ -779,14 +859,14 @@
               <w:rPr>
                 <w:rStyle w:val="Hyperlink"/>
               </w:rPr>
-              <w:t>7</w:t>
+              <w:t>8</w:t>
             </w:r>
             <w:r>
               <w:fldChar w:fldCharType="end"/>
             </w:r>
           </w:hyperlink>
         </w:p>
-        <w:p xmlns:wp14="http://schemas.microsoft.com/office/word/2010/wordml" wp14:textId="19411069">
+        <w:p xmlns:wp14="http://schemas.microsoft.com/office/word/2010/wordml" wp14:textId="34A63863">
           <w:pPr>
             <w:pStyle w:val="TOC4"/>
             <w:tabs>
@@ -796,7 +876,7 @@
               <w:rStyle w:val="Hyperlink"/>
             </w:rPr>
           </w:pPr>
-          <w:hyperlink w:anchor="_Toc1726389206">
+          <w:hyperlink w:anchor="_Toc842797041">
             <w:r>
               <w:rPr>
                 <w:rStyle w:val="Hyperlink"/>
@@ -810,7 +890,7 @@
               <w:fldChar w:fldCharType="begin"/>
             </w:r>
             <w:r>
-              <w:instrText xml:space="preserve">PAGEREF _Toc1726389206 \h</w:instrText>
+              <w:instrText xml:space="preserve">PAGEREF _Toc842797041 \h</w:instrText>
             </w:r>
             <w:r>
               <w:fldChar w:fldCharType="separate"/>
@@ -819,14 +899,14 @@
               <w:rPr>
                 <w:rStyle w:val="Hyperlink"/>
               </w:rPr>
-              <w:t>7</w:t>
+              <w:t>8</w:t>
             </w:r>
             <w:r>
               <w:fldChar w:fldCharType="end"/>
             </w:r>
           </w:hyperlink>
         </w:p>
-        <w:p xmlns:wp14="http://schemas.microsoft.com/office/word/2010/wordml" wp14:textId="6AD12742">
+        <w:p xmlns:wp14="http://schemas.microsoft.com/office/word/2010/wordml" wp14:textId="38838E82">
           <w:pPr>
             <w:pStyle w:val="TOC4"/>
             <w:tabs>
@@ -836,7 +916,7 @@
               <w:rStyle w:val="Hyperlink"/>
             </w:rPr>
           </w:pPr>
-          <w:hyperlink w:anchor="_Toc1668187787">
+          <w:hyperlink w:anchor="_Toc1751784228">
             <w:r>
               <w:rPr>
                 <w:rStyle w:val="Hyperlink"/>
@@ -850,7 +930,7 @@
               <w:fldChar w:fldCharType="begin"/>
             </w:r>
             <w:r>
-              <w:instrText xml:space="preserve">PAGEREF _Toc1668187787 \h</w:instrText>
+              <w:instrText xml:space="preserve">PAGEREF _Toc1751784228 \h</w:instrText>
             </w:r>
             <w:r>
               <w:fldChar w:fldCharType="separate"/>
@@ -859,14 +939,14 @@
               <w:rPr>
                 <w:rStyle w:val="Hyperlink"/>
               </w:rPr>
-              <w:t>8</w:t>
+              <w:t>9</w:t>
             </w:r>
             <w:r>
               <w:fldChar w:fldCharType="end"/>
             </w:r>
           </w:hyperlink>
         </w:p>
-        <w:p xmlns:wp14="http://schemas.microsoft.com/office/word/2010/wordml" wp14:textId="2F21436E">
+        <w:p xmlns:wp14="http://schemas.microsoft.com/office/word/2010/wordml" wp14:textId="2021E073">
           <w:pPr>
             <w:pStyle w:val="TOC4"/>
             <w:tabs>
@@ -876,7 +956,7 @@
               <w:rStyle w:val="Hyperlink"/>
             </w:rPr>
           </w:pPr>
-          <w:hyperlink w:anchor="_Toc143005928">
+          <w:hyperlink w:anchor="_Toc1368974046">
             <w:r>
               <w:rPr>
                 <w:rStyle w:val="Hyperlink"/>
@@ -890,7 +970,7 @@
               <w:fldChar w:fldCharType="begin"/>
             </w:r>
             <w:r>
-              <w:instrText xml:space="preserve">PAGEREF _Toc143005928 \h</w:instrText>
+              <w:instrText xml:space="preserve">PAGEREF _Toc1368974046 \h</w:instrText>
             </w:r>
             <w:r>
               <w:fldChar w:fldCharType="separate"/>
@@ -899,14 +979,14 @@
               <w:rPr>
                 <w:rStyle w:val="Hyperlink"/>
               </w:rPr>
-              <w:t>8</w:t>
+              <w:t>9</w:t>
             </w:r>
             <w:r>
               <w:fldChar w:fldCharType="end"/>
             </w:r>
           </w:hyperlink>
         </w:p>
-        <w:p xmlns:wp14="http://schemas.microsoft.com/office/word/2010/wordml" wp14:textId="45A67D20">
+        <w:p xmlns:wp14="http://schemas.microsoft.com/office/word/2010/wordml" wp14:textId="28044FBC">
           <w:pPr>
             <w:pStyle w:val="TOC3"/>
             <w:tabs>
@@ -916,7 +996,7 @@
               <w:rStyle w:val="Hyperlink"/>
             </w:rPr>
           </w:pPr>
-          <w:hyperlink w:anchor="_Toc1762682308">
+          <w:hyperlink w:anchor="_Toc682032110">
             <w:r>
               <w:rPr>
                 <w:rStyle w:val="Hyperlink"/>
@@ -930,7 +1010,7 @@
               <w:fldChar w:fldCharType="begin"/>
             </w:r>
             <w:r>
-              <w:instrText xml:space="preserve">PAGEREF _Toc1762682308 \h</w:instrText>
+              <w:instrText xml:space="preserve">PAGEREF _Toc682032110 \h</w:instrText>
             </w:r>
             <w:r>
               <w:fldChar w:fldCharType="separate"/>
@@ -939,14 +1019,14 @@
               <w:rPr>
                 <w:rStyle w:val="Hyperlink"/>
               </w:rPr>
-              <w:t>8</w:t>
+              <w:t>9</w:t>
             </w:r>
             <w:r>
               <w:fldChar w:fldCharType="end"/>
             </w:r>
           </w:hyperlink>
         </w:p>
-        <w:p xmlns:wp14="http://schemas.microsoft.com/office/word/2010/wordml" wp14:textId="038E201D">
+        <w:p xmlns:wp14="http://schemas.microsoft.com/office/word/2010/wordml" wp14:textId="1BD1756E">
           <w:pPr>
             <w:pStyle w:val="TOC4"/>
             <w:tabs>
@@ -956,7 +1036,7 @@
               <w:rStyle w:val="Hyperlink"/>
             </w:rPr>
           </w:pPr>
-          <w:hyperlink w:anchor="_Toc773958964">
+          <w:hyperlink w:anchor="_Toc1644294656">
             <w:r>
               <w:rPr>
                 <w:rStyle w:val="Hyperlink"/>
@@ -970,7 +1050,7 @@
               <w:fldChar w:fldCharType="begin"/>
             </w:r>
             <w:r>
-              <w:instrText xml:space="preserve">PAGEREF _Toc773958964 \h</w:instrText>
+              <w:instrText xml:space="preserve">PAGEREF _Toc1644294656 \h</w:instrText>
             </w:r>
             <w:r>
               <w:fldChar w:fldCharType="separate"/>
@@ -979,14 +1059,14 @@
               <w:rPr>
                 <w:rStyle w:val="Hyperlink"/>
               </w:rPr>
-              <w:t>9</w:t>
+              <w:t>10</w:t>
             </w:r>
             <w:r>
               <w:fldChar w:fldCharType="end"/>
             </w:r>
           </w:hyperlink>
         </w:p>
-        <w:p xmlns:wp14="http://schemas.microsoft.com/office/word/2010/wordml" wp14:textId="3108520B">
+        <w:p xmlns:wp14="http://schemas.microsoft.com/office/word/2010/wordml" wp14:textId="3C8CC694">
           <w:pPr>
             <w:pStyle w:val="TOC4"/>
             <w:tabs>
@@ -996,7 +1076,7 @@
               <w:rStyle w:val="Hyperlink"/>
             </w:rPr>
           </w:pPr>
-          <w:hyperlink w:anchor="_Toc1221079029">
+          <w:hyperlink w:anchor="_Toc415403538">
             <w:r>
               <w:rPr>
                 <w:rStyle w:val="Hyperlink"/>
@@ -1010,7 +1090,7 @@
               <w:fldChar w:fldCharType="begin"/>
             </w:r>
             <w:r>
-              <w:instrText xml:space="preserve">PAGEREF _Toc1221079029 \h</w:instrText>
+              <w:instrText xml:space="preserve">PAGEREF _Toc415403538 \h</w:instrText>
             </w:r>
             <w:r>
               <w:fldChar w:fldCharType="separate"/>
@@ -1019,14 +1099,14 @@
               <w:rPr>
                 <w:rStyle w:val="Hyperlink"/>
               </w:rPr>
-              <w:t>9</w:t>
+              <w:t>10</w:t>
             </w:r>
             <w:r>
               <w:fldChar w:fldCharType="end"/>
             </w:r>
           </w:hyperlink>
         </w:p>
-        <w:p xmlns:wp14="http://schemas.microsoft.com/office/word/2010/wordml" wp14:textId="55029284">
+        <w:p xmlns:wp14="http://schemas.microsoft.com/office/word/2010/wordml" wp14:textId="500E7CB7">
           <w:pPr>
             <w:pStyle w:val="TOC4"/>
             <w:tabs>
@@ -1036,7 +1116,7 @@
               <w:rStyle w:val="Hyperlink"/>
             </w:rPr>
           </w:pPr>
-          <w:hyperlink w:anchor="_Toc1208067648">
+          <w:hyperlink w:anchor="_Toc325782049">
             <w:r>
               <w:rPr>
                 <w:rStyle w:val="Hyperlink"/>
@@ -1050,87 +1130,7 @@
               <w:fldChar w:fldCharType="begin"/>
             </w:r>
             <w:r>
-              <w:instrText xml:space="preserve">PAGEREF _Toc1208067648 \h</w:instrText>
-            </w:r>
-            <w:r>
-              <w:fldChar w:fldCharType="separate"/>
-            </w:r>
-            <w:r>
-              <w:rPr>
-                <w:rStyle w:val="Hyperlink"/>
-              </w:rPr>
-              <w:t>9</w:t>
-            </w:r>
-            <w:r>
-              <w:fldChar w:fldCharType="end"/>
-            </w:r>
-          </w:hyperlink>
-        </w:p>
-        <w:p xmlns:wp14="http://schemas.microsoft.com/office/word/2010/wordml" wp14:textId="01CD66A6">
-          <w:pPr>
-            <w:pStyle w:val="TOC4"/>
-            <w:tabs>
-              <w:tab w:val="right" w:leader="dot" w:pos="9630"/>
-            </w:tabs>
-            <w:rPr>
-              <w:rStyle w:val="Hyperlink"/>
-            </w:rPr>
-          </w:pPr>
-          <w:hyperlink w:anchor="_Toc1050190700">
-            <w:r>
-              <w:rPr>
-                <w:rStyle w:val="Hyperlink"/>
-              </w:rPr>
-              <w:t>organization_user – Intézmények dolgozói</w:t>
-            </w:r>
-            <w:r>
-              <w:tab/>
-            </w:r>
-            <w:r>
-              <w:fldChar w:fldCharType="begin"/>
-            </w:r>
-            <w:r>
-              <w:instrText xml:space="preserve">PAGEREF _Toc1050190700 \h</w:instrText>
-            </w:r>
-            <w:r>
-              <w:fldChar w:fldCharType="separate"/>
-            </w:r>
-            <w:r>
-              <w:rPr>
-                <w:rStyle w:val="Hyperlink"/>
-              </w:rPr>
-              <w:t>9</w:t>
-            </w:r>
-            <w:r>
-              <w:fldChar w:fldCharType="end"/>
-            </w:r>
-          </w:hyperlink>
-        </w:p>
-        <w:p xmlns:wp14="http://schemas.microsoft.com/office/word/2010/wordml" wp14:textId="0B17C9EE">
-          <w:pPr>
-            <w:pStyle w:val="TOC4"/>
-            <w:tabs>
-              <w:tab w:val="right" w:leader="dot" w:pos="9630"/>
-            </w:tabs>
-            <w:rPr>
-              <w:rStyle w:val="Hyperlink"/>
-            </w:rPr>
-          </w:pPr>
-          <w:hyperlink w:anchor="_Toc847688160">
-            <w:r>
-              <w:rPr>
-                <w:rStyle w:val="Hyperlink"/>
-              </w:rPr>
-              <w:t>skill_user – Felhasználok készségei</w:t>
-            </w:r>
-            <w:r>
-              <w:tab/>
-            </w:r>
-            <w:r>
-              <w:fldChar w:fldCharType="begin"/>
-            </w:r>
-            <w:r>
-              <w:instrText xml:space="preserve">PAGEREF _Toc847688160 \h</w:instrText>
+              <w:instrText xml:space="preserve">PAGEREF _Toc325782049 \h</w:instrText>
             </w:r>
             <w:r>
               <w:fldChar w:fldCharType="separate"/>
@@ -1157,11 +1157,93 @@
               <w:rStyle w:val="Hyperlink"/>
             </w:rPr>
           </w:pPr>
-          <w:hyperlink w:anchor="_Toc675049544">
+          <w:hyperlink w:anchor="_Toc1060718697">
             <w:r>
               <w:rPr>
                 <w:rStyle w:val="Hyperlink"/>
               </w:rPr>
+              <w:t>organization_user – Intézmények dolgozói</w:t>
+            </w:r>
+            <w:r>
+              <w:tab/>
+            </w:r>
+            <w:r>
+              <w:fldChar w:fldCharType="begin"/>
+            </w:r>
+            <w:r>
+              <w:instrText xml:space="preserve">PAGEREF _Toc1060718697 \h</w:instrText>
+            </w:r>
+            <w:r>
+              <w:fldChar w:fldCharType="separate"/>
+            </w:r>
+            <w:r>
+              <w:rPr>
+                <w:rStyle w:val="Hyperlink"/>
+              </w:rPr>
+              <w:t>10</w:t>
+            </w:r>
+            <w:r>
+              <w:fldChar w:fldCharType="end"/>
+            </w:r>
+          </w:hyperlink>
+        </w:p>
+        <w:p>
+          <w:pPr>
+            <w:pStyle w:val="TOC4"/>
+            <w:tabs>
+              <w:tab w:val="right" w:leader="dot" w:pos="9630"/>
+            </w:tabs>
+            <w:bidi w:val="0"/>
+            <w:rPr>
+              <w:rStyle w:val="Hyperlink"/>
+            </w:rPr>
+          </w:pPr>
+          <w:hyperlink w:anchor="_Toc688748314">
+            <w:r>
+              <w:rPr>
+                <w:rStyle w:val="Hyperlink"/>
+              </w:rPr>
+              <w:t>skill_user – Felhasználok készségei</w:t>
+            </w:r>
+            <w:r>
+              <w:tab/>
+            </w:r>
+            <w:r>
+              <w:fldChar w:fldCharType="begin"/>
+            </w:r>
+            <w:r>
+              <w:instrText xml:space="preserve">PAGEREF _Toc688748314 \h</w:instrText>
+            </w:r>
+            <w:r>
+              <w:fldChar w:fldCharType="separate"/>
+            </w:r>
+            <w:r>
+              <w:rPr>
+                <w:rStyle w:val="Hyperlink"/>
+              </w:rPr>
+              <w:t>11</w:t>
+            </w:r>
+            <w:r>
+              <w:fldChar w:fldCharType="end"/>
+            </w:r>
+          </w:hyperlink>
+        </w:p>
+        <w:p>
+          <w:pPr>
+            <w:pStyle w:val="TOC4"/>
+            <w:tabs>
+              <w:tab w:val="right" w:leader="dot" w:pos="9630"/>
+            </w:tabs>
+            <w:bidi w:val="0"/>
+            <w:rPr>
+              <w:rStyle w:val="Hyperlink"/>
+            </w:rPr>
+          </w:pPr>
+          <w:hyperlink w:anchor="_Toc1784945983">
+            <w:r>
+              <w:rPr>
+                <w:rStyle w:val="Hyperlink"/>
+              </w:rPr>
               <w:t>user_saved_jobs – Felhasználók által elmentett állások</w:t>
             </w:r>
             <w:r>
@@ -1171,7 +1253,7 @@
               <w:fldChar w:fldCharType="begin"/>
             </w:r>
             <w:r>
-              <w:instrText xml:space="preserve">PAGEREF _Toc675049544 \h</w:instrText>
+              <w:instrText xml:space="preserve">PAGEREF _Toc1784945983 \h</w:instrText>
             </w:r>
             <w:r>
               <w:fldChar w:fldCharType="separate"/>
@@ -1180,7 +1262,7 @@
               <w:rPr>
                 <w:rStyle w:val="Hyperlink"/>
               </w:rPr>
-              <w:t>10</w:t>
+              <w:t>11</w:t>
             </w:r>
             <w:r>
               <w:fldChar w:fldCharType="end"/>
@@ -1198,7 +1280,7 @@
               <w:rStyle w:val="Hyperlink"/>
             </w:rPr>
           </w:pPr>
-          <w:hyperlink w:anchor="_Toc865477720">
+          <w:hyperlink w:anchor="_Toc793158788">
             <w:r>
               <w:rPr>
                 <w:rStyle w:val="Hyperlink"/>
@@ -1212,7 +1294,7 @@
               <w:fldChar w:fldCharType="begin"/>
             </w:r>
             <w:r>
-              <w:instrText xml:space="preserve">PAGEREF _Toc865477720 \h</w:instrText>
+              <w:instrText xml:space="preserve">PAGEREF _Toc793158788 \h</w:instrText>
             </w:r>
             <w:r>
               <w:fldChar w:fldCharType="separate"/>
@@ -1221,7 +1303,7 @@
               <w:rPr>
                 <w:rStyle w:val="Hyperlink"/>
               </w:rPr>
-              <w:t>11</w:t>
+              <w:t>12</w:t>
             </w:r>
             <w:r>
               <w:fldChar w:fldCharType="end"/>
@@ -1239,7 +1321,7 @@
               <w:rStyle w:val="Hyperlink"/>
             </w:rPr>
           </w:pPr>
-          <w:hyperlink w:anchor="_Toc901824374">
+          <w:hyperlink w:anchor="_Toc572605997">
             <w:r>
               <w:rPr>
                 <w:rStyle w:val="Hyperlink"/>
@@ -1253,7 +1335,7 @@
               <w:fldChar w:fldCharType="begin"/>
             </w:r>
             <w:r>
-              <w:instrText xml:space="preserve">PAGEREF _Toc901824374 \h</w:instrText>
+              <w:instrText xml:space="preserve">PAGEREF _Toc572605997 \h</w:instrText>
             </w:r>
             <w:r>
               <w:fldChar w:fldCharType="separate"/>
@@ -1262,7 +1344,7 @@
               <w:rPr>
                 <w:rStyle w:val="Hyperlink"/>
               </w:rPr>
-              <w:t>11</w:t>
+              <w:t>12</w:t>
             </w:r>
             <w:r>
               <w:fldChar w:fldCharType="end"/>
@@ -1280,7 +1362,7 @@
               <w:rStyle w:val="Hyperlink"/>
             </w:rPr>
           </w:pPr>
-          <w:hyperlink w:anchor="_Toc501131208">
+          <w:hyperlink w:anchor="_Toc1353375317">
             <w:r>
               <w:rPr>
                 <w:rStyle w:val="Hyperlink"/>
@@ -1294,7 +1376,7 @@
               <w:fldChar w:fldCharType="begin"/>
             </w:r>
             <w:r>
-              <w:instrText xml:space="preserve">PAGEREF _Toc501131208 \h</w:instrText>
+              <w:instrText xml:space="preserve">PAGEREF _Toc1353375317 \h</w:instrText>
             </w:r>
             <w:r>
               <w:fldChar w:fldCharType="separate"/>
@@ -1303,7 +1385,7 @@
               <w:rPr>
                 <w:rStyle w:val="Hyperlink"/>
               </w:rPr>
-              <w:t>11</w:t>
+              <w:t>12</w:t>
             </w:r>
             <w:r>
               <w:fldChar w:fldCharType="end"/>
@@ -1321,7 +1403,7 @@
               <w:rStyle w:val="Hyperlink"/>
             </w:rPr>
           </w:pPr>
-          <w:hyperlink w:anchor="_Toc1061968516">
+          <w:hyperlink w:anchor="_Toc1310303153">
             <w:r>
               <w:rPr>
                 <w:rStyle w:val="Hyperlink"/>
@@ -1335,7 +1417,7 @@
               <w:fldChar w:fldCharType="begin"/>
             </w:r>
             <w:r>
-              <w:instrText xml:space="preserve">PAGEREF _Toc1061968516 \h</w:instrText>
+              <w:instrText xml:space="preserve">PAGEREF _Toc1310303153 \h</w:instrText>
             </w:r>
             <w:r>
               <w:fldChar w:fldCharType="separate"/>
@@ -1344,7 +1426,7 @@
               <w:rPr>
                 <w:rStyle w:val="Hyperlink"/>
               </w:rPr>
-              <w:t>12</w:t>
+              <w:t>13</w:t>
             </w:r>
             <w:r>
               <w:fldChar w:fldCharType="end"/>
@@ -1362,7 +1444,7 @@
               <w:rStyle w:val="Hyperlink"/>
             </w:rPr>
           </w:pPr>
-          <w:hyperlink w:anchor="_Toc524395503">
+          <w:hyperlink w:anchor="_Toc560037919">
             <w:r>
               <w:rPr>
                 <w:rStyle w:val="Hyperlink"/>
@@ -1376,7 +1458,7 @@
               <w:fldChar w:fldCharType="begin"/>
             </w:r>
             <w:r>
-              <w:instrText xml:space="preserve">PAGEREF _Toc524395503 \h</w:instrText>
+              <w:instrText xml:space="preserve">PAGEREF _Toc560037919 \h</w:instrText>
             </w:r>
             <w:r>
               <w:fldChar w:fldCharType="separate"/>
@@ -1385,7 +1467,7 @@
               <w:rPr>
                 <w:rStyle w:val="Hyperlink"/>
               </w:rPr>
-              <w:t>12</w:t>
+              <w:t>13</w:t>
             </w:r>
             <w:r>
               <w:fldChar w:fldCharType="end"/>
@@ -1403,7 +1485,7 @@
               <w:rStyle w:val="Hyperlink"/>
             </w:rPr>
           </w:pPr>
-          <w:hyperlink w:anchor="_Toc1478078539">
+          <w:hyperlink w:anchor="_Toc1674641871">
             <w:r>
               <w:rPr>
                 <w:rStyle w:val="Hyperlink"/>
@@ -1417,7 +1499,7 @@
               <w:fldChar w:fldCharType="begin"/>
             </w:r>
             <w:r>
-              <w:instrText xml:space="preserve">PAGEREF _Toc1478078539 \h</w:instrText>
+              <w:instrText xml:space="preserve">PAGEREF _Toc1674641871 \h</w:instrText>
             </w:r>
             <w:r>
               <w:fldChar w:fldCharType="separate"/>
@@ -1426,7 +1508,7 @@
               <w:rPr>
                 <w:rStyle w:val="Hyperlink"/>
               </w:rPr>
-              <w:t>12</w:t>
+              <w:t>13</w:t>
             </w:r>
             <w:r>
               <w:fldChar w:fldCharType="end"/>
@@ -1444,7 +1526,7 @@
               <w:rStyle w:val="Hyperlink"/>
             </w:rPr>
           </w:pPr>
-          <w:hyperlink w:anchor="_Toc948135853">
+          <w:hyperlink w:anchor="_Toc96118150">
             <w:r>
               <w:rPr>
                 <w:rStyle w:val="Hyperlink"/>
@@ -1458,7 +1540,7 @@
               <w:fldChar w:fldCharType="begin"/>
             </w:r>
             <w:r>
-              <w:instrText xml:space="preserve">PAGEREF _Toc948135853 \h</w:instrText>
+              <w:instrText xml:space="preserve">PAGEREF _Toc96118150 \h</w:instrText>
             </w:r>
             <w:r>
               <w:fldChar w:fldCharType="separate"/>
@@ -1467,7 +1549,7 @@
               <w:rPr>
                 <w:rStyle w:val="Hyperlink"/>
               </w:rPr>
-              <w:t>13</w:t>
+              <w:t>14</w:t>
             </w:r>
             <w:r>
               <w:fldChar w:fldCharType="end"/>
@@ -1485,7 +1567,7 @@
               <w:rStyle w:val="Hyperlink"/>
             </w:rPr>
           </w:pPr>
-          <w:hyperlink w:anchor="_Toc1299056665">
+          <w:hyperlink w:anchor="_Toc734184190">
             <w:r>
               <w:rPr>
                 <w:rStyle w:val="Hyperlink"/>
@@ -1499,7 +1581,7 @@
               <w:fldChar w:fldCharType="begin"/>
             </w:r>
             <w:r>
-              <w:instrText xml:space="preserve">PAGEREF _Toc1299056665 \h</w:instrText>
+              <w:instrText xml:space="preserve">PAGEREF _Toc734184190 \h</w:instrText>
             </w:r>
             <w:r>
               <w:fldChar w:fldCharType="separate"/>
@@ -1508,7 +1590,7 @@
               <w:rPr>
                 <w:rStyle w:val="Hyperlink"/>
               </w:rPr>
-              <w:t>13</w:t>
+              <w:t>14</w:t>
             </w:r>
             <w:r>
               <w:fldChar w:fldCharType="end"/>
@@ -1526,7 +1608,7 @@
               <w:rStyle w:val="Hyperlink"/>
             </w:rPr>
           </w:pPr>
-          <w:hyperlink w:anchor="_Toc662005509">
+          <w:hyperlink w:anchor="_Toc325311483">
             <w:r>
               <w:rPr>
                 <w:rStyle w:val="Hyperlink"/>
@@ -1540,7 +1622,7 @@
               <w:fldChar w:fldCharType="begin"/>
             </w:r>
             <w:r>
-              <w:instrText xml:space="preserve">PAGEREF _Toc662005509 \h</w:instrText>
+              <w:instrText xml:space="preserve">PAGEREF _Toc325311483 \h</w:instrText>
             </w:r>
             <w:r>
               <w:fldChar w:fldCharType="separate"/>
@@ -1549,7 +1631,7 @@
               <w:rPr>
                 <w:rStyle w:val="Hyperlink"/>
               </w:rPr>
-              <w:t>13</w:t>
+              <w:t>14</w:t>
             </w:r>
             <w:r>
               <w:fldChar w:fldCharType="end"/>
@@ -1567,7 +1649,7 @@
               <w:rStyle w:val="Hyperlink"/>
             </w:rPr>
           </w:pPr>
-          <w:hyperlink w:anchor="_Toc2101351320">
+          <w:hyperlink w:anchor="_Toc1764764091">
             <w:r>
               <w:rPr>
                 <w:rStyle w:val="Hyperlink"/>
@@ -1581,7 +1663,7 @@
               <w:fldChar w:fldCharType="begin"/>
             </w:r>
             <w:r>
-              <w:instrText xml:space="preserve">PAGEREF _Toc2101351320 \h</w:instrText>
+              <w:instrText xml:space="preserve">PAGEREF _Toc1764764091 \h</w:instrText>
             </w:r>
             <w:r>
               <w:fldChar w:fldCharType="separate"/>
@@ -1590,7 +1672,7 @@
               <w:rPr>
                 <w:rStyle w:val="Hyperlink"/>
               </w:rPr>
-              <w:t>14</w:t>
+              <w:t>15</w:t>
             </w:r>
             <w:r>
               <w:fldChar w:fldCharType="end"/>
@@ -1608,7 +1690,7 @@
               <w:rStyle w:val="Hyperlink"/>
             </w:rPr>
           </w:pPr>
-          <w:hyperlink w:anchor="_Toc759320370">
+          <w:hyperlink w:anchor="_Toc281838317">
             <w:r>
               <w:rPr>
                 <w:rStyle w:val="Hyperlink"/>
@@ -1622,7 +1704,7 @@
               <w:fldChar w:fldCharType="begin"/>
             </w:r>
             <w:r>
-              <w:instrText xml:space="preserve">PAGEREF _Toc759320370 \h</w:instrText>
+              <w:instrText xml:space="preserve">PAGEREF _Toc281838317 \h</w:instrText>
             </w:r>
             <w:r>
               <w:fldChar w:fldCharType="separate"/>
@@ -1631,7 +1713,7 @@
               <w:rPr>
                 <w:rStyle w:val="Hyperlink"/>
               </w:rPr>
-              <w:t>15</w:t>
+              <w:t>16</w:t>
             </w:r>
             <w:r>
               <w:fldChar w:fldCharType="end"/>
@@ -1649,7 +1731,7 @@
               <w:rStyle w:val="Hyperlink"/>
             </w:rPr>
           </w:pPr>
-          <w:hyperlink w:anchor="_Toc924923395">
+          <w:hyperlink w:anchor="_Toc828266703">
             <w:r>
               <w:rPr>
                 <w:rStyle w:val="Hyperlink"/>
@@ -1663,7 +1745,7 @@
               <w:fldChar w:fldCharType="begin"/>
             </w:r>
             <w:r>
-              <w:instrText xml:space="preserve">PAGEREF _Toc924923395 \h</w:instrText>
+              <w:instrText xml:space="preserve">PAGEREF _Toc828266703 \h</w:instrText>
             </w:r>
             <w:r>
               <w:fldChar w:fldCharType="separate"/>
@@ -1672,7 +1754,7 @@
               <w:rPr>
                 <w:rStyle w:val="Hyperlink"/>
               </w:rPr>
-              <w:t>16</w:t>
+              <w:t>17</w:t>
             </w:r>
             <w:r>
               <w:fldChar w:fldCharType="end"/>
@@ -1690,7 +1772,7 @@
               <w:rStyle w:val="Hyperlink"/>
             </w:rPr>
           </w:pPr>
-          <w:hyperlink w:anchor="_Toc971204917">
+          <w:hyperlink w:anchor="_Toc1552034508">
             <w:r>
               <w:rPr>
                 <w:rStyle w:val="Hyperlink"/>
@@ -1704,7 +1786,7 @@
               <w:fldChar w:fldCharType="begin"/>
             </w:r>
             <w:r>
-              <w:instrText xml:space="preserve">PAGEREF _Toc971204917 \h</w:instrText>
+              <w:instrText xml:space="preserve">PAGEREF _Toc1552034508 \h</w:instrText>
             </w:r>
             <w:r>
               <w:fldChar w:fldCharType="separate"/>
@@ -1713,7 +1795,7 @@
               <w:rPr>
                 <w:rStyle w:val="Hyperlink"/>
               </w:rPr>
-              <w:t>19</w:t>
+              <w:t>20</w:t>
             </w:r>
             <w:r>
               <w:fldChar w:fldCharType="end"/>
@@ -1731,7 +1813,7 @@
               <w:rStyle w:val="Hyperlink"/>
             </w:rPr>
           </w:pPr>
-          <w:hyperlink w:anchor="_Toc1604777747">
+          <w:hyperlink w:anchor="_Toc383548161">
             <w:r>
               <w:rPr>
                 <w:rStyle w:val="Hyperlink"/>
@@ -1745,7 +1827,7 @@
               <w:fldChar w:fldCharType="begin"/>
             </w:r>
             <w:r>
-              <w:instrText xml:space="preserve">PAGEREF _Toc1604777747 \h</w:instrText>
+              <w:instrText xml:space="preserve">PAGEREF _Toc383548161 \h</w:instrText>
             </w:r>
             <w:r>
               <w:fldChar w:fldCharType="separate"/>
@@ -1754,7 +1836,7 @@
               <w:rPr>
                 <w:rStyle w:val="Hyperlink"/>
               </w:rPr>
-              <w:t>20</w:t>
+              <w:t>21</w:t>
             </w:r>
             <w:r>
               <w:fldChar w:fldCharType="end"/>
@@ -1772,7 +1854,7 @@
               <w:rStyle w:val="Hyperlink"/>
             </w:rPr>
           </w:pPr>
-          <w:hyperlink w:anchor="_Toc810857850">
+          <w:hyperlink w:anchor="_Toc210529520">
             <w:r>
               <w:rPr>
                 <w:rStyle w:val="Hyperlink"/>
@@ -1786,7 +1868,7 @@
               <w:fldChar w:fldCharType="begin"/>
             </w:r>
             <w:r>
-              <w:instrText xml:space="preserve">PAGEREF _Toc810857850 \h</w:instrText>
+              <w:instrText xml:space="preserve">PAGEREF _Toc210529520 \h</w:instrText>
             </w:r>
             <w:r>
               <w:fldChar w:fldCharType="separate"/>
@@ -1795,7 +1877,7 @@
               <w:rPr>
                 <w:rStyle w:val="Hyperlink"/>
               </w:rPr>
-              <w:t>20</w:t>
+              <w:t>21</w:t>
             </w:r>
             <w:r>
               <w:fldChar w:fldCharType="end"/>
@@ -1813,7 +1895,7 @@
               <w:rStyle w:val="Hyperlink"/>
             </w:rPr>
           </w:pPr>
-          <w:hyperlink w:anchor="_Toc28628578">
+          <w:hyperlink w:anchor="_Toc864223534">
             <w:r>
               <w:rPr>
                 <w:rStyle w:val="Hyperlink"/>
@@ -1827,7 +1909,7 @@
               <w:fldChar w:fldCharType="begin"/>
             </w:r>
             <w:r>
-              <w:instrText xml:space="preserve">PAGEREF _Toc28628578 \h</w:instrText>
+              <w:instrText xml:space="preserve">PAGEREF _Toc864223534 \h</w:instrText>
             </w:r>
             <w:r>
               <w:fldChar w:fldCharType="separate"/>
@@ -1836,7 +1918,7 @@
               <w:rPr>
                 <w:rStyle w:val="Hyperlink"/>
               </w:rPr>
-              <w:t>20</w:t>
+              <w:t>21</w:t>
             </w:r>
             <w:r>
               <w:fldChar w:fldCharType="end"/>
@@ -1854,7 +1936,7 @@
               <w:rStyle w:val="Hyperlink"/>
             </w:rPr>
           </w:pPr>
-          <w:hyperlink w:anchor="_Toc641517559">
+          <w:hyperlink w:anchor="_Toc948115652">
             <w:r>
               <w:rPr>
                 <w:rStyle w:val="Hyperlink"/>
@@ -1868,7 +1950,7 @@
               <w:fldChar w:fldCharType="begin"/>
             </w:r>
             <w:r>
-              <w:instrText xml:space="preserve">PAGEREF _Toc641517559 \h</w:instrText>
+              <w:instrText xml:space="preserve">PAGEREF _Toc948115652 \h</w:instrText>
             </w:r>
             <w:r>
               <w:fldChar w:fldCharType="separate"/>
@@ -1877,7 +1959,7 @@
               <w:rPr>
                 <w:rStyle w:val="Hyperlink"/>
               </w:rPr>
-              <w:t>21</w:t>
+              <w:t>22</w:t>
             </w:r>
             <w:r>
               <w:fldChar w:fldCharType="end"/>
@@ -1895,7 +1977,7 @@
               <w:rStyle w:val="Hyperlink"/>
             </w:rPr>
           </w:pPr>
-          <w:hyperlink w:anchor="_Toc129411484">
+          <w:hyperlink w:anchor="_Toc2111348024">
             <w:r>
               <w:rPr>
                 <w:rStyle w:val="Hyperlink"/>
@@ -1909,7 +1991,7 @@
               <w:fldChar w:fldCharType="begin"/>
             </w:r>
             <w:r>
-              <w:instrText xml:space="preserve">PAGEREF _Toc129411484 \h</w:instrText>
+              <w:instrText xml:space="preserve">PAGEREF _Toc2111348024 \h</w:instrText>
             </w:r>
             <w:r>
               <w:fldChar w:fldCharType="separate"/>
@@ -1918,7 +2000,7 @@
               <w:rPr>
                 <w:rStyle w:val="Hyperlink"/>
               </w:rPr>
-              <w:t>22</w:t>
+              <w:t>23</w:t>
             </w:r>
             <w:r>
               <w:fldChar w:fldCharType="end"/>
@@ -1936,7 +2018,7 @@
               <w:rStyle w:val="Hyperlink"/>
             </w:rPr>
           </w:pPr>
-          <w:hyperlink w:anchor="_Toc2082363652">
+          <w:hyperlink w:anchor="_Toc597567856">
             <w:r>
               <w:rPr>
                 <w:rStyle w:val="Hyperlink"/>
@@ -1950,7 +2032,7 @@
               <w:fldChar w:fldCharType="begin"/>
             </w:r>
             <w:r>
-              <w:instrText xml:space="preserve">PAGEREF _Toc2082363652 \h</w:instrText>
+              <w:instrText xml:space="preserve">PAGEREF _Toc597567856 \h</w:instrText>
             </w:r>
             <w:r>
               <w:fldChar w:fldCharType="separate"/>
@@ -1959,7 +2041,7 @@
               <w:rPr>
                 <w:rStyle w:val="Hyperlink"/>
               </w:rPr>
-              <w:t>22</w:t>
+              <w:t>23</w:t>
             </w:r>
             <w:r>
               <w:fldChar w:fldCharType="end"/>
@@ -1977,7 +2059,7 @@
               <w:rStyle w:val="Hyperlink"/>
             </w:rPr>
           </w:pPr>
-          <w:hyperlink w:anchor="_Toc1220309804">
+          <w:hyperlink w:anchor="_Toc377605140">
             <w:r>
               <w:rPr>
                 <w:rStyle w:val="Hyperlink"/>
@@ -1991,7 +2073,7 @@
               <w:fldChar w:fldCharType="begin"/>
             </w:r>
             <w:r>
-              <w:instrText xml:space="preserve">PAGEREF _Toc1220309804 \h</w:instrText>
+              <w:instrText xml:space="preserve">PAGEREF _Toc377605140 \h</w:instrText>
             </w:r>
             <w:r>
               <w:fldChar w:fldCharType="separate"/>
@@ -2000,7 +2082,7 @@
               <w:rPr>
                 <w:rStyle w:val="Hyperlink"/>
               </w:rPr>
-              <w:t>22</w:t>
+              <w:t>23</w:t>
             </w:r>
             <w:r>
               <w:fldChar w:fldCharType="end"/>
@@ -2018,7 +2100,7 @@
               <w:rStyle w:val="Hyperlink"/>
             </w:rPr>
           </w:pPr>
-          <w:hyperlink w:anchor="_Toc2024597818">
+          <w:hyperlink w:anchor="_Toc1654949247">
             <w:r>
               <w:rPr>
                 <w:rStyle w:val="Hyperlink"/>
@@ -2032,7 +2114,7 @@
               <w:fldChar w:fldCharType="begin"/>
             </w:r>
             <w:r>
-              <w:instrText xml:space="preserve">PAGEREF _Toc2024597818 \h</w:instrText>
+              <w:instrText xml:space="preserve">PAGEREF _Toc1654949247 \h</w:instrText>
             </w:r>
             <w:r>
               <w:fldChar w:fldCharType="separate"/>
@@ -2041,7 +2123,7 @@
               <w:rPr>
                 <w:rStyle w:val="Hyperlink"/>
               </w:rPr>
-              <w:t>22</w:t>
+              <w:t>23</w:t>
             </w:r>
             <w:r>
               <w:fldChar w:fldCharType="end"/>
@@ -2059,7 +2141,7 @@
               <w:rStyle w:val="Hyperlink"/>
             </w:rPr>
           </w:pPr>
-          <w:hyperlink w:anchor="_Toc49839467">
+          <w:hyperlink w:anchor="_Toc1812385324">
             <w:r>
               <w:rPr>
                 <w:rStyle w:val="Hyperlink"/>
@@ -2073,7 +2155,7 @@
               <w:fldChar w:fldCharType="begin"/>
             </w:r>
             <w:r>
-              <w:instrText xml:space="preserve">PAGEREF _Toc49839467 \h</w:instrText>
+              <w:instrText xml:space="preserve">PAGEREF _Toc1812385324 \h</w:instrText>
             </w:r>
             <w:r>
               <w:fldChar w:fldCharType="separate"/>
@@ -2082,7 +2164,7 @@
               <w:rPr>
                 <w:rStyle w:val="Hyperlink"/>
               </w:rPr>
-              <w:t>22</w:t>
+              <w:t>23</w:t>
             </w:r>
             <w:r>
               <w:fldChar w:fldCharType="end"/>
@@ -2100,7 +2182,7 @@
               <w:rStyle w:val="Hyperlink"/>
             </w:rPr>
           </w:pPr>
-          <w:hyperlink w:anchor="_Toc1017094867">
+          <w:hyperlink w:anchor="_Toc1180685528">
             <w:r>
               <w:rPr>
                 <w:rStyle w:val="Hyperlink"/>
@@ -2114,7 +2196,7 @@
               <w:fldChar w:fldCharType="begin"/>
             </w:r>
             <w:r>
-              <w:instrText xml:space="preserve">PAGEREF _Toc1017094867 \h</w:instrText>
+              <w:instrText xml:space="preserve">PAGEREF _Toc1180685528 \h</w:instrText>
             </w:r>
             <w:r>
               <w:fldChar w:fldCharType="separate"/>
@@ -2123,7 +2205,7 @@
               <w:rPr>
                 <w:rStyle w:val="Hyperlink"/>
               </w:rPr>
-              <w:t>23</w:t>
+              <w:t>24</w:t>
             </w:r>
             <w:r>
               <w:fldChar w:fldCharType="end"/>
@@ -2141,7 +2223,7 @@
               <w:rStyle w:val="Hyperlink"/>
             </w:rPr>
           </w:pPr>
-          <w:hyperlink w:anchor="_Toc51170102">
+          <w:hyperlink w:anchor="_Toc1507165435">
             <w:r>
               <w:rPr>
                 <w:rStyle w:val="Hyperlink"/>
@@ -2155,7 +2237,7 @@
               <w:fldChar w:fldCharType="begin"/>
             </w:r>
             <w:r>
-              <w:instrText xml:space="preserve">PAGEREF _Toc51170102 \h</w:instrText>
+              <w:instrText xml:space="preserve">PAGEREF _Toc1507165435 \h</w:instrText>
             </w:r>
             <w:r>
               <w:fldChar w:fldCharType="separate"/>
@@ -2164,7 +2246,7 @@
               <w:rPr>
                 <w:rStyle w:val="Hyperlink"/>
               </w:rPr>
-              <w:t>23</w:t>
+              <w:t>24</w:t>
             </w:r>
             <w:r>
               <w:fldChar w:fldCharType="end"/>
@@ -2182,7 +2264,7 @@
               <w:rStyle w:val="Hyperlink"/>
             </w:rPr>
           </w:pPr>
-          <w:hyperlink w:anchor="_Toc852306275">
+          <w:hyperlink w:anchor="_Toc784514812">
             <w:r>
               <w:rPr>
                 <w:rStyle w:val="Hyperlink"/>
@@ -2196,7 +2278,7 @@
               <w:fldChar w:fldCharType="begin"/>
             </w:r>
             <w:r>
-              <w:instrText xml:space="preserve">PAGEREF _Toc852306275 \h</w:instrText>
+              <w:instrText xml:space="preserve">PAGEREF _Toc784514812 \h</w:instrText>
             </w:r>
             <w:r>
               <w:fldChar w:fldCharType="separate"/>
@@ -2205,7 +2287,7 @@
               <w:rPr>
                 <w:rStyle w:val="Hyperlink"/>
               </w:rPr>
-              <w:t>24</w:t>
+              <w:t>25</w:t>
             </w:r>
             <w:r>
               <w:fldChar w:fldCharType="end"/>
@@ -2223,7 +2305,7 @@
               <w:rStyle w:val="Hyperlink"/>
             </w:rPr>
           </w:pPr>
-          <w:hyperlink w:anchor="_Toc59556909">
+          <w:hyperlink w:anchor="_Toc1497028310">
             <w:r>
               <w:rPr>
                 <w:rStyle w:val="Hyperlink"/>
@@ -2237,7 +2319,7 @@
               <w:fldChar w:fldCharType="begin"/>
             </w:r>
             <w:r>
-              <w:instrText xml:space="preserve">PAGEREF _Toc59556909 \h</w:instrText>
+              <w:instrText xml:space="preserve">PAGEREF _Toc1497028310 \h</w:instrText>
             </w:r>
             <w:r>
               <w:fldChar w:fldCharType="separate"/>
@@ -2246,7 +2328,7 @@
               <w:rPr>
                 <w:rStyle w:val="Hyperlink"/>
               </w:rPr>
-              <w:t>25</w:t>
+              <w:t>26</w:t>
             </w:r>
             <w:r>
               <w:fldChar w:fldCharType="end"/>
@@ -2264,7 +2346,7 @@
               <w:rStyle w:val="Hyperlink"/>
             </w:rPr>
           </w:pPr>
-          <w:hyperlink w:anchor="_Toc425302696">
+          <w:hyperlink w:anchor="_Toc1170904804">
             <w:r>
               <w:rPr>
                 <w:rStyle w:val="Hyperlink"/>
@@ -2278,7 +2360,7 @@
               <w:fldChar w:fldCharType="begin"/>
             </w:r>
             <w:r>
-              <w:instrText xml:space="preserve">PAGEREF _Toc425302696 \h</w:instrText>
+              <w:instrText xml:space="preserve">PAGEREF _Toc1170904804 \h</w:instrText>
             </w:r>
             <w:r>
               <w:fldChar w:fldCharType="separate"/>
@@ -2287,7 +2369,7 @@
               <w:rPr>
                 <w:rStyle w:val="Hyperlink"/>
               </w:rPr>
-              <w:t>27</w:t>
+              <w:t>28</w:t>
             </w:r>
             <w:r>
               <w:fldChar w:fldCharType="end"/>
@@ -2305,7 +2387,7 @@
               <w:rStyle w:val="Hyperlink"/>
             </w:rPr>
           </w:pPr>
-          <w:hyperlink w:anchor="_Toc2015261994">
+          <w:hyperlink w:anchor="_Toc133851693">
             <w:r>
               <w:rPr>
                 <w:rStyle w:val="Hyperlink"/>
@@ -2319,7 +2401,7 @@
               <w:fldChar w:fldCharType="begin"/>
             </w:r>
             <w:r>
-              <w:instrText xml:space="preserve">PAGEREF _Toc2015261994 \h</w:instrText>
+              <w:instrText xml:space="preserve">PAGEREF _Toc133851693 \h</w:instrText>
             </w:r>
             <w:r>
               <w:fldChar w:fldCharType="separate"/>
@@ -2328,7 +2410,7 @@
               <w:rPr>
                 <w:rStyle w:val="Hyperlink"/>
               </w:rPr>
-              <w:t>27</w:t>
+              <w:t>28</w:t>
             </w:r>
             <w:r>
               <w:fldChar w:fldCharType="end"/>
@@ -2346,7 +2428,7 @@
               <w:rStyle w:val="Hyperlink"/>
             </w:rPr>
           </w:pPr>
-          <w:hyperlink w:anchor="_Toc1212400605">
+          <w:hyperlink w:anchor="_Toc890170387">
             <w:r>
               <w:rPr>
                 <w:rStyle w:val="Hyperlink"/>
@@ -2360,7 +2442,7 @@
               <w:fldChar w:fldCharType="begin"/>
             </w:r>
             <w:r>
-              <w:instrText xml:space="preserve">PAGEREF _Toc1212400605 \h</w:instrText>
+              <w:instrText xml:space="preserve">PAGEREF _Toc890170387 \h</w:instrText>
             </w:r>
             <w:r>
               <w:fldChar w:fldCharType="separate"/>
@@ -2369,7 +2451,7 @@
               <w:rPr>
                 <w:rStyle w:val="Hyperlink"/>
               </w:rPr>
-              <w:t>28</w:t>
+              <w:t>29</w:t>
             </w:r>
             <w:r>
               <w:fldChar w:fldCharType="end"/>
@@ -2387,7 +2469,7 @@
               <w:rStyle w:val="Hyperlink"/>
             </w:rPr>
           </w:pPr>
-          <w:hyperlink w:anchor="_Toc1416560317">
+          <w:hyperlink w:anchor="_Toc527365804">
             <w:r>
               <w:rPr>
                 <w:rStyle w:val="Hyperlink"/>
@@ -2401,7 +2483,7 @@
               <w:fldChar w:fldCharType="begin"/>
             </w:r>
             <w:r>
-              <w:instrText xml:space="preserve">PAGEREF _Toc1416560317 \h</w:instrText>
+              <w:instrText xml:space="preserve">PAGEREF _Toc527365804 \h</w:instrText>
             </w:r>
             <w:r>
               <w:fldChar w:fldCharType="separate"/>
@@ -2410,7 +2492,7 @@
               <w:rPr>
                 <w:rStyle w:val="Hyperlink"/>
               </w:rPr>
-              <w:t>31</w:t>
+              <w:t>32</w:t>
             </w:r>
             <w:r>
               <w:fldChar w:fldCharType="end"/>
@@ -2428,7 +2510,7 @@
               <w:rStyle w:val="Hyperlink"/>
             </w:rPr>
           </w:pPr>
-          <w:hyperlink w:anchor="_Toc829280462">
+          <w:hyperlink w:anchor="_Toc2000132529">
             <w:r>
               <w:rPr>
                 <w:rStyle w:val="Hyperlink"/>
@@ -2442,7 +2524,7 @@
               <w:fldChar w:fldCharType="begin"/>
             </w:r>
             <w:r>
-              <w:instrText xml:space="preserve">PAGEREF _Toc829280462 \h</w:instrText>
+              <w:instrText xml:space="preserve">PAGEREF _Toc2000132529 \h</w:instrText>
             </w:r>
             <w:r>
               <w:fldChar w:fldCharType="separate"/>
@@ -2451,7 +2533,7 @@
               <w:rPr>
                 <w:rStyle w:val="Hyperlink"/>
               </w:rPr>
-              <w:t>31</w:t>
+              <w:t>32</w:t>
             </w:r>
             <w:r>
               <w:fldChar w:fldCharType="end"/>
@@ -2469,7 +2551,7 @@
               <w:rStyle w:val="Hyperlink"/>
             </w:rPr>
           </w:pPr>
-          <w:hyperlink w:anchor="_Toc1735671349">
+          <w:hyperlink w:anchor="_Toc1279301964">
             <w:r>
               <w:rPr>
                 <w:rStyle w:val="Hyperlink"/>
@@ -2483,7 +2565,7 @@
               <w:fldChar w:fldCharType="begin"/>
             </w:r>
             <w:r>
-              <w:instrText xml:space="preserve">PAGEREF _Toc1735671349 \h</w:instrText>
+              <w:instrText xml:space="preserve">PAGEREF _Toc1279301964 \h</w:instrText>
             </w:r>
             <w:r>
               <w:fldChar w:fldCharType="separate"/>
@@ -2492,7 +2574,7 @@
               <w:rPr>
                 <w:rStyle w:val="Hyperlink"/>
               </w:rPr>
-              <w:t>31</w:t>
+              <w:t>32</w:t>
             </w:r>
             <w:r>
               <w:fldChar w:fldCharType="end"/>
@@ -2510,7 +2592,7 @@
               <w:rStyle w:val="Hyperlink"/>
             </w:rPr>
           </w:pPr>
-          <w:hyperlink w:anchor="_Toc1120741733">
+          <w:hyperlink w:anchor="_Toc1787569722">
             <w:r>
               <w:rPr>
                 <w:rStyle w:val="Hyperlink"/>
@@ -2524,7 +2606,7 @@
               <w:fldChar w:fldCharType="begin"/>
             </w:r>
             <w:r>
-              <w:instrText xml:space="preserve">PAGEREF _Toc1120741733 \h</w:instrText>
+              <w:instrText xml:space="preserve">PAGEREF _Toc1787569722 \h</w:instrText>
             </w:r>
             <w:r>
               <w:fldChar w:fldCharType="separate"/>
@@ -2533,7 +2615,7 @@
               <w:rPr>
                 <w:rStyle w:val="Hyperlink"/>
               </w:rPr>
-              <w:t>31</w:t>
+              <w:t>32</w:t>
             </w:r>
             <w:r>
               <w:fldChar w:fldCharType="end"/>
@@ -2551,7 +2633,7 @@
               <w:rStyle w:val="Hyperlink"/>
             </w:rPr>
           </w:pPr>
-          <w:hyperlink w:anchor="_Toc1259697332">
+          <w:hyperlink w:anchor="_Toc2024553946">
             <w:r>
               <w:rPr>
                 <w:rStyle w:val="Hyperlink"/>
@@ -2565,7 +2647,7 @@
               <w:fldChar w:fldCharType="begin"/>
             </w:r>
             <w:r>
-              <w:instrText xml:space="preserve">PAGEREF _Toc1259697332 \h</w:instrText>
+              <w:instrText xml:space="preserve">PAGEREF _Toc2024553946 \h</w:instrText>
             </w:r>
             <w:r>
               <w:fldChar w:fldCharType="separate"/>
@@ -2574,7 +2656,7 @@
               <w:rPr>
                 <w:rStyle w:val="Hyperlink"/>
               </w:rPr>
-              <w:t>31</w:t>
+              <w:t>32</w:t>
             </w:r>
             <w:r>
               <w:fldChar w:fldCharType="end"/>
@@ -2592,7 +2674,7 @@
               <w:rStyle w:val="Hyperlink"/>
             </w:rPr>
           </w:pPr>
-          <w:hyperlink w:anchor="_Toc953938683">
+          <w:hyperlink w:anchor="_Toc1661941746">
             <w:r>
               <w:rPr>
                 <w:rStyle w:val="Hyperlink"/>
@@ -2606,7 +2688,7 @@
               <w:fldChar w:fldCharType="begin"/>
             </w:r>
             <w:r>
-              <w:instrText xml:space="preserve">PAGEREF _Toc953938683 \h</w:instrText>
+              <w:instrText xml:space="preserve">PAGEREF _Toc1661941746 \h</w:instrText>
             </w:r>
             <w:r>
               <w:fldChar w:fldCharType="separate"/>
@@ -2615,7 +2697,7 @@
               <w:rPr>
                 <w:rStyle w:val="Hyperlink"/>
               </w:rPr>
-              <w:t>31</w:t>
+              <w:t>32</w:t>
             </w:r>
             <w:r>
               <w:fldChar w:fldCharType="end"/>
@@ -2633,7 +2715,7 @@
               <w:rStyle w:val="Hyperlink"/>
             </w:rPr>
           </w:pPr>
-          <w:hyperlink w:anchor="_Toc1681702670">
+          <w:hyperlink w:anchor="_Toc1666552151">
             <w:r>
               <w:rPr>
                 <w:rStyle w:val="Hyperlink"/>
@@ -2647,7 +2729,7 @@
               <w:fldChar w:fldCharType="begin"/>
             </w:r>
             <w:r>
-              <w:instrText xml:space="preserve">PAGEREF _Toc1681702670 \h</w:instrText>
+              <w:instrText xml:space="preserve">PAGEREF _Toc1666552151 \h</w:instrText>
             </w:r>
             <w:r>
               <w:fldChar w:fldCharType="separate"/>
@@ -2656,7 +2738,7 @@
               <w:rPr>
                 <w:rStyle w:val="Hyperlink"/>
               </w:rPr>
-              <w:t>31</w:t>
+              <w:t>32</w:t>
             </w:r>
             <w:r>
               <w:fldChar w:fldCharType="end"/>
@@ -2674,7 +2756,7 @@
               <w:rStyle w:val="Hyperlink"/>
             </w:rPr>
           </w:pPr>
-          <w:hyperlink w:anchor="_Toc1519747737">
+          <w:hyperlink w:anchor="_Toc2021753230">
             <w:r>
               <w:rPr>
                 <w:rStyle w:val="Hyperlink"/>
@@ -2688,7 +2770,7 @@
               <w:fldChar w:fldCharType="begin"/>
             </w:r>
             <w:r>
-              <w:instrText xml:space="preserve">PAGEREF _Toc1519747737 \h</w:instrText>
+              <w:instrText xml:space="preserve">PAGEREF _Toc2021753230 \h</w:instrText>
             </w:r>
             <w:r>
               <w:fldChar w:fldCharType="separate"/>
@@ -2697,7 +2779,7 @@
               <w:rPr>
                 <w:rStyle w:val="Hyperlink"/>
               </w:rPr>
-              <w:t>31</w:t>
+              <w:t>32</w:t>
             </w:r>
             <w:r>
               <w:fldChar w:fldCharType="end"/>
@@ -2715,7 +2797,7 @@
               <w:rStyle w:val="Hyperlink"/>
             </w:rPr>
           </w:pPr>
-          <w:hyperlink w:anchor="_Toc1732293365">
+          <w:hyperlink w:anchor="_Toc201194970">
             <w:r>
               <w:rPr>
                 <w:rStyle w:val="Hyperlink"/>
@@ -2729,7 +2811,7 @@
               <w:fldChar w:fldCharType="begin"/>
             </w:r>
             <w:r>
-              <w:instrText xml:space="preserve">PAGEREF _Toc1732293365 \h</w:instrText>
+              <w:instrText xml:space="preserve">PAGEREF _Toc201194970 \h</w:instrText>
             </w:r>
             <w:r>
               <w:fldChar w:fldCharType="separate"/>
@@ -2738,7 +2820,7 @@
               <w:rPr>
                 <w:rStyle w:val="Hyperlink"/>
               </w:rPr>
-              <w:t>31</w:t>
+              <w:t>32</w:t>
             </w:r>
             <w:r>
               <w:fldChar w:fldCharType="end"/>
@@ -2756,7 +2838,7 @@
               <w:rStyle w:val="Hyperlink"/>
             </w:rPr>
           </w:pPr>
-          <w:hyperlink w:anchor="_Toc60255070">
+          <w:hyperlink w:anchor="_Toc1391228516">
             <w:r>
               <w:rPr>
                 <w:rStyle w:val="Hyperlink"/>
@@ -2770,7 +2852,7 @@
               <w:fldChar w:fldCharType="begin"/>
             </w:r>
             <w:r>
-              <w:instrText xml:space="preserve">PAGEREF _Toc60255070 \h</w:instrText>
+              <w:instrText xml:space="preserve">PAGEREF _Toc1391228516 \h</w:instrText>
             </w:r>
             <w:r>
               <w:fldChar w:fldCharType="separate"/>
@@ -2779,7 +2861,7 @@
               <w:rPr>
                 <w:rStyle w:val="Hyperlink"/>
               </w:rPr>
-              <w:t>31</w:t>
+              <w:t>32</w:t>
             </w:r>
             <w:r>
               <w:fldChar w:fldCharType="end"/>
@@ -2797,7 +2879,7 @@
               <w:rStyle w:val="Hyperlink"/>
             </w:rPr>
           </w:pPr>
-          <w:hyperlink w:anchor="_Toc982546194">
+          <w:hyperlink w:anchor="_Toc267813701">
             <w:r>
               <w:rPr>
                 <w:rStyle w:val="Hyperlink"/>
@@ -2811,7 +2893,7 @@
               <w:fldChar w:fldCharType="begin"/>
             </w:r>
             <w:r>
-              <w:instrText xml:space="preserve">PAGEREF _Toc982546194 \h</w:instrText>
+              <w:instrText xml:space="preserve">PAGEREF _Toc267813701 \h</w:instrText>
             </w:r>
             <w:r>
               <w:fldChar w:fldCharType="separate"/>
@@ -2820,7 +2902,7 @@
               <w:rPr>
                 <w:rStyle w:val="Hyperlink"/>
               </w:rPr>
-              <w:t>31</w:t>
+              <w:t>32</w:t>
             </w:r>
             <w:r>
               <w:fldChar w:fldCharType="end"/>
@@ -2838,7 +2920,7 @@
               <w:rStyle w:val="Hyperlink"/>
             </w:rPr>
           </w:pPr>
-          <w:hyperlink w:anchor="_Toc739758423">
+          <w:hyperlink w:anchor="_Toc291085606">
             <w:r>
               <w:rPr>
                 <w:rStyle w:val="Hyperlink"/>
@@ -2852,7 +2934,7 @@
               <w:fldChar w:fldCharType="begin"/>
             </w:r>
             <w:r>
-              <w:instrText xml:space="preserve">PAGEREF _Toc739758423 \h</w:instrText>
+              <w:instrText xml:space="preserve">PAGEREF _Toc291085606 \h</w:instrText>
             </w:r>
             <w:r>
               <w:fldChar w:fldCharType="separate"/>
@@ -2861,7 +2943,7 @@
               <w:rPr>
                 <w:rStyle w:val="Hyperlink"/>
               </w:rPr>
-              <w:t>31</w:t>
+              <w:t>32</w:t>
             </w:r>
             <w:r>
               <w:fldChar w:fldCharType="end"/>
@@ -2898,12 +2980,12 @@
         <w:jc w:val="center"/>
         <w:rPr/>
       </w:pPr>
-      <w:bookmarkStart w:name="_Toc964201530" w:id="1846595208"/>
+      <w:bookmarkStart w:name="_Toc530086350" w:id="1920152215"/>
       <w:r>
         <w:rPr/>
         <w:t>A projektről</w:t>
       </w:r>
-      <w:bookmarkEnd w:id="1846595208"/>
+      <w:bookmarkEnd w:id="1920152215"/>
     </w:p>
     <w:p>
       <w:pPr>
@@ -2983,7 +3065,7 @@
           <w:bCs w:val="1"/>
         </w:rPr>
       </w:pPr>
-      <w:bookmarkStart w:name="_Toc1350191444" w:id="2106757481"/>
+      <w:bookmarkStart w:name="_Toc87150431" w:id="1172922210"/>
       <w:r>
         <w:rPr/>
         <w:t>Miért pont állásportál</w:t>
@@ -2992,7 +3074,7 @@
         <w:rPr/>
         <w:t>?</w:t>
       </w:r>
-      <w:bookmarkEnd w:id="2106757481"/>
+      <w:bookmarkEnd w:id="1172922210"/>
     </w:p>
     <w:p>
       <w:pPr>
@@ -3039,12 +3121,12 @@
           <w:bCs w:val="1"/>
         </w:rPr>
       </w:pPr>
-      <w:bookmarkStart w:name="_Toc129092815" w:id="1431007793"/>
+      <w:bookmarkStart w:name="_Toc277638745" w:id="2026204439"/>
       <w:r>
         <w:rPr/>
         <w:t>Miért szabadúszóknak?</w:t>
       </w:r>
-      <w:bookmarkEnd w:id="1431007793"/>
+      <w:bookmarkEnd w:id="2026204439"/>
     </w:p>
     <w:p xmlns:wp14="http://schemas.microsoft.com/office/word/2010/wordml" wp14:textId="79D7F5A1">
       <w:pPr>
@@ -3159,12 +3241,12 @@
           <w:bCs w:val="1"/>
         </w:rPr>
       </w:pPr>
-      <w:bookmarkStart w:name="_Toc1946150416" w:id="913944278"/>
+      <w:bookmarkStart w:name="_Toc1028152592" w:id="803821688"/>
       <w:r>
         <w:rPr/>
         <w:t>Milyen előnyöket szolgál?</w:t>
       </w:r>
-      <w:bookmarkEnd w:id="913944278"/>
+      <w:bookmarkEnd w:id="803821688"/>
     </w:p>
     <w:p xmlns:wp14="http://schemas.microsoft.com/office/word/2010/wordml" wp14:textId="7B2B9697">
       <w:pPr>
@@ -3241,12 +3323,12 @@
           <w:bCs w:val="1"/>
         </w:rPr>
       </w:pPr>
-      <w:bookmarkStart w:name="_Toc1253102048" w:id="535478595"/>
+      <w:bookmarkStart w:name="_Toc1798781352" w:id="1759717829"/>
       <w:r>
         <w:rPr/>
         <w:t>Tech stack</w:t>
       </w:r>
-      <w:bookmarkEnd w:id="535478595"/>
+      <w:bookmarkEnd w:id="1759717829"/>
     </w:p>
     <w:p>
       <w:pPr>
@@ -4141,7 +4223,7 @@
           <w:lang w:val="en-US"/>
         </w:rPr>
       </w:pPr>
-      <w:bookmarkStart w:name="_Toc1705965944" w:id="1680757140"/>
+      <w:bookmarkStart w:name="_Toc109796080" w:id="2055668204"/>
       <w:r>
         <w:rPr>
           <w:lang w:val="en-US"/>
@@ -4166,7 +4248,7 @@
         </w:rPr>
         <w:t>?</w:t>
       </w:r>
-      <w:bookmarkEnd w:id="1680757140"/>
+      <w:bookmarkEnd w:id="2055668204"/>
     </w:p>
     <w:p>
       <w:pPr>
@@ -4283,7 +4365,7 @@
           <w:szCs w:val="56"/>
         </w:rPr>
       </w:pPr>
-      <w:bookmarkStart w:name="_Toc986377942" w:id="99030656"/>
+      <w:bookmarkStart w:name="_Toc2099524464" w:id="60809964"/>
       <w:r>
         <w:rPr>
           <w:sz w:val="56"/>
@@ -4305,7 +4387,7 @@
         </w:rPr>
         <w:t>dokumentáció</w:t>
       </w:r>
-      <w:bookmarkEnd w:id="99030656"/>
+      <w:bookmarkEnd w:id="60809964"/>
     </w:p>
     <w:p>
       <w:pPr>
@@ -4314,12 +4396,12 @@
         <w:jc w:val="center"/>
         <w:rPr/>
       </w:pPr>
-      <w:bookmarkStart w:name="_Toc1451014950" w:id="268437804"/>
+      <w:bookmarkStart w:name="_Toc1075620185" w:id="1179035506"/>
       <w:r>
         <w:rPr/>
         <w:t>Adatbázis</w:t>
       </w:r>
-      <w:bookmarkEnd w:id="268437804"/>
+      <w:bookmarkEnd w:id="1179035506"/>
     </w:p>
     <w:p>
       <w:pPr>
@@ -4332,7 +4414,7 @@
           <w:color w:val="auto"/>
         </w:rPr>
       </w:pPr>
-      <w:bookmarkStart w:name="_Toc1221281361" w:id="1396143622"/>
+      <w:bookmarkStart w:name="_Toc1406078125" w:id="1548975652"/>
       <w:r>
         <w:rPr>
           <w:b w:val="1"/>
@@ -4341,7 +4423,7 @@
         </w:rPr>
         <w:t>Áttekintés</w:t>
       </w:r>
-      <w:bookmarkEnd w:id="1396143622"/>
+      <w:bookmarkEnd w:id="1548975652"/>
     </w:p>
     <w:p>
       <w:pPr>
@@ -4405,7 +4487,7 @@
           <w:color w:val="auto"/>
         </w:rPr>
       </w:pPr>
-      <w:bookmarkStart w:name="_Toc2100168869" w:id="776964886"/>
+      <w:bookmarkStart w:name="_Toc1653491058" w:id="820756316"/>
       <w:r>
         <w:rPr>
           <w:b w:val="1"/>
@@ -4428,65 +4510,49 @@
           <w:bCs w:val="1"/>
           <w:color w:val="auto"/>
         </w:rPr>
-        <w:t xml:space="preserve"> (</w:t>
-      </w:r>
-      <w:r>
+        <w:t xml:space="preserve"> - ER Model</w:t>
+      </w:r>
+      <w:bookmarkEnd w:id="820756316"/>
+    </w:p>
+    <w:p>
+      <w:pPr>
+        <w:pStyle w:val="Heading4"/>
+        <w:bidi w:val="0"/>
+        <w:jc w:val="center"/>
         <w:rPr>
           <w:b w:val="1"/>
           <w:bCs w:val="1"/>
+          <w:i w:val="0"/>
+          <w:iCs w:val="0"/>
           <w:color w:val="auto"/>
-        </w:rPr>
-        <w:t>Crow’s</w:t>
-      </w:r>
+          <w:sz w:val="24"/>
+          <w:szCs w:val="24"/>
+        </w:rPr>
+      </w:pPr>
+      <w:bookmarkStart w:name="_Toc354457891" w:id="1450546585"/>
       <w:r>
         <w:rPr>
           <w:b w:val="1"/>
           <w:bCs w:val="1"/>
+          <w:i w:val="0"/>
+          <w:iCs w:val="0"/>
           <w:color w:val="auto"/>
-        </w:rPr>
-        <w:t xml:space="preserve"> </w:t>
-      </w:r>
-      <w:r>
-        <w:rPr>
-          <w:b w:val="1"/>
-          <w:bCs w:val="1"/>
-          <w:color w:val="auto"/>
-        </w:rPr>
-        <w:t>foot</w:t>
-      </w:r>
-      <w:r>
-        <w:rPr>
-          <w:b w:val="1"/>
-          <w:bCs w:val="1"/>
-          <w:color w:val="auto"/>
-        </w:rPr>
-        <w:t xml:space="preserve"> </w:t>
-      </w:r>
-      <w:r>
-        <w:rPr>
-          <w:b w:val="1"/>
-          <w:bCs w:val="1"/>
-          <w:color w:val="auto"/>
-        </w:rPr>
-        <w:t>notation</w:t>
-      </w:r>
-      <w:r>
-        <w:rPr>
-          <w:b w:val="1"/>
-          <w:bCs w:val="1"/>
-          <w:color w:val="auto"/>
-        </w:rPr>
-        <w:t>)</w:t>
-      </w:r>
-      <w:bookmarkEnd w:id="776964886"/>
+          <w:sz w:val="24"/>
+          <w:szCs w:val="24"/>
+        </w:rPr>
+        <w:t>Crow’s foot notation</w:t>
+      </w:r>
+      <w:bookmarkEnd w:id="1450546585"/>
     </w:p>
     <w:p>
       <w:pPr>
         <w:pStyle w:val="BodyText"/>
+        <w:bidi w:val="0"/>
+        <w:jc w:val="center"/>
       </w:pPr>
       <w:r>
         <w:drawing>
-          <wp:inline wp14:editId="72FEE83D" wp14:anchorId="5D85C837">
+          <wp:inline wp14:editId="003172D6" wp14:anchorId="5D85C837">
             <wp:extent cx="6124575" cy="3524250"/>
             <wp:effectExtent l="0" t="0" r="0" b="0"/>
             <wp:docPr id="566924178" name="drawing"/>
@@ -4536,35 +4602,10 @@
     <w:p>
       <w:pPr>
         <w:pStyle w:val="BodyText"/>
-      </w:pPr>
-    </w:p>
-    <w:p>
-      <w:pPr>
-        <w:pStyle w:val="Heading3"/>
         <w:bidi w:val="0"/>
         <w:jc w:val="center"/>
         <w:rPr>
-          <w:b w:val="1"/>
-          <w:bCs w:val="1"/>
-          <w:color w:val="auto"/>
-        </w:rPr>
-      </w:pPr>
-      <w:bookmarkStart w:name="_Toc490162405" w:id="581594084"/>
-      <w:r>
-        <w:rPr>
-          <w:b w:val="1"/>
-          <w:bCs w:val="1"/>
-          <w:color w:val="auto"/>
-        </w:rPr>
-        <w:t>Entitások</w:t>
-      </w:r>
-      <w:bookmarkEnd w:id="581594084"/>
-    </w:p>
-    <w:p xmlns:wp14="http://schemas.microsoft.com/office/word/2010/wordml" wp14:textId="2316B684">
-      <w:pPr>
-        <w:pStyle w:val="Heading4"/>
-        <w:jc w:val="center"/>
-        <w:rPr>
+          <w:rStyle w:val="Heading4Char"/>
           <w:b w:val="1"/>
           <w:bCs w:val="1"/>
           <w:i w:val="0"/>
@@ -4572,38 +4613,125 @@
           <w:color w:val="auto"/>
         </w:rPr>
       </w:pPr>
-      <w:bookmarkStart w:name="_Toc327338505" w:id="1594768178"/>
-      <w:r>
-        <w:rPr>
+      <w:bookmarkStart w:name="_Toc1390894290" w:id="1334739796"/>
+      <w:r>
+        <w:rPr>
+          <w:rStyle w:val="Heading4Char"/>
           <w:b w:val="1"/>
           <w:bCs w:val="1"/>
           <w:i w:val="0"/>
           <w:iCs w:val="0"/>
           <w:color w:val="auto"/>
         </w:rPr>
-        <w:t>u</w:t>
-      </w:r>
-      <w:r>
-        <w:rPr>
+        <w:t xml:space="preserve">Chen </w:t>
+      </w:r>
+      <w:r>
+        <w:rPr>
+          <w:rStyle w:val="Heading4Char"/>
           <w:b w:val="1"/>
           <w:bCs w:val="1"/>
           <w:i w:val="0"/>
           <w:iCs w:val="0"/>
           <w:color w:val="auto"/>
         </w:rPr>
-        <w:t>ser</w:t>
-      </w:r>
-      <w:r>
-        <w:rPr>
+        <w:t>notation</w:t>
+      </w:r>
+      <w:bookmarkEnd w:id="1334739796"/>
+    </w:p>
+    <w:p>
+      <w:pPr>
+        <w:pStyle w:val="BodyText"/>
+        <w:bidi w:val="0"/>
+        <w:jc w:val="center"/>
+        <w:rPr>
+          <w:rStyle w:val="Heading4Char"/>
           <w:b w:val="1"/>
           <w:bCs w:val="1"/>
           <w:i w:val="0"/>
           <w:iCs w:val="0"/>
           <w:color w:val="auto"/>
         </w:rPr>
-        <w:t>s</w:t>
-      </w:r>
-      <w:r>
+      </w:pPr>
+      <w:r>
+        <w:drawing>
+          <wp:inline wp14:editId="45BE15A8" wp14:anchorId="06719475">
+            <wp:extent cx="6124575" cy="4048125"/>
+            <wp:effectExtent l="0" t="0" r="0" b="0"/>
+            <wp:docPr id="1641956920" name="drawing"/>
+            <wp:cNvGraphicFramePr>
+              <a:graphicFrameLocks noChangeAspect="1"/>
+            </wp:cNvGraphicFramePr>
+            <a:graphic>
+              <a:graphicData xmlns:a="http://schemas.openxmlformats.org/drawingml/2006/main" uri="http://schemas.openxmlformats.org/drawingml/2006/picture">
+                <pic:pic xmlns:pic="http://schemas.openxmlformats.org/drawingml/2006/picture">
+                  <pic:nvPicPr>
+                    <pic:cNvPr id="1688420779" name=""/>
+                    <pic:cNvPicPr/>
+                  </pic:nvPicPr>
+                  <pic:blipFill>
+                    <a:blip xmlns:r="http://schemas.openxmlformats.org/officeDocument/2006/relationships" r:embed="rId1174614926">
+                      <a:extLst>
+                        <a:ext xmlns:a="http://schemas.openxmlformats.org/drawingml/2006/main" uri="{28A0092B-C50C-407E-A947-70E740481C1C}">
+                          <a14:useLocalDpi xmlns:a14="http://schemas.microsoft.com/office/drawing/2010/main" val="0"/>
+                        </a:ext>
+                      </a:extLst>
+                    </a:blip>
+                    <a:stretch>
+                      <a:fillRect/>
+                    </a:stretch>
+                  </pic:blipFill>
+                  <pic:spPr>
+                    <a:xfrm>
+                      <a:off x="0" y="0"/>
+                      <a:ext cx="6124575" cy="4048125"/>
+                    </a:xfrm>
+                    <a:prstGeom prst="rect">
+                      <a:avLst/>
+                    </a:prstGeom>
+                  </pic:spPr>
+                </pic:pic>
+              </a:graphicData>
+            </a:graphic>
+          </wp:inline>
+        </w:drawing>
+      </w:r>
+    </w:p>
+    <w:p>
+      <w:r>
+        <w:br w:type="page"/>
+      </w:r>
+    </w:p>
+    <w:p>
+      <w:pPr>
+        <w:pStyle w:val="BodyText"/>
+      </w:pPr>
+    </w:p>
+    <w:p>
+      <w:pPr>
+        <w:pStyle w:val="Heading3"/>
+        <w:bidi w:val="0"/>
+        <w:jc w:val="center"/>
+        <w:rPr>
+          <w:b w:val="1"/>
+          <w:bCs w:val="1"/>
+          <w:color w:val="auto"/>
+        </w:rPr>
+      </w:pPr>
+      <w:bookmarkStart w:name="_Toc838338487" w:id="336754727"/>
+      <w:r>
+        <w:rPr>
+          <w:b w:val="1"/>
+          <w:bCs w:val="1"/>
+          <w:color w:val="auto"/>
+        </w:rPr>
+        <w:t>Entitások</w:t>
+      </w:r>
+      <w:bookmarkEnd w:id="336754727"/>
+    </w:p>
+    <w:p xmlns:wp14="http://schemas.microsoft.com/office/word/2010/wordml" wp14:textId="2316B684">
+      <w:pPr>
+        <w:pStyle w:val="Heading4"/>
+        <w:jc w:val="center"/>
         <w:rPr>
           <w:b w:val="1"/>
           <w:bCs w:val="1"/>
@@ -4611,8 +4739,8 @@
           <w:iCs w:val="0"/>
           <w:color w:val="auto"/>
         </w:rPr>
-        <w:t xml:space="preserve"> - </w:t>
-      </w:r>
+      </w:pPr>
+      <w:bookmarkStart w:name="_Toc2104963647" w:id="1437817610"/>
       <w:r>
         <w:rPr>
           <w:b w:val="1"/>
@@ -4621,9 +4749,49 @@
           <w:iCs w:val="0"/>
           <w:color w:val="auto"/>
         </w:rPr>
+        <w:t>u</w:t>
+      </w:r>
+      <w:r>
+        <w:rPr>
+          <w:b w:val="1"/>
+          <w:bCs w:val="1"/>
+          <w:i w:val="0"/>
+          <w:iCs w:val="0"/>
+          <w:color w:val="auto"/>
+        </w:rPr>
+        <w:t>ser</w:t>
+      </w:r>
+      <w:r>
+        <w:rPr>
+          <w:b w:val="1"/>
+          <w:bCs w:val="1"/>
+          <w:i w:val="0"/>
+          <w:iCs w:val="0"/>
+          <w:color w:val="auto"/>
+        </w:rPr>
+        <w:t>s</w:t>
+      </w:r>
+      <w:r>
+        <w:rPr>
+          <w:b w:val="1"/>
+          <w:bCs w:val="1"/>
+          <w:i w:val="0"/>
+          <w:iCs w:val="0"/>
+          <w:color w:val="auto"/>
+        </w:rPr>
+        <w:t xml:space="preserve"> - </w:t>
+      </w:r>
+      <w:r>
+        <w:rPr>
+          <w:b w:val="1"/>
+          <w:bCs w:val="1"/>
+          <w:i w:val="0"/>
+          <w:iCs w:val="0"/>
+          <w:color w:val="auto"/>
+        </w:rPr>
         <w:t>Felhasználok</w:t>
       </w:r>
-      <w:bookmarkEnd w:id="1594768178"/>
+      <w:bookmarkEnd w:id="1437817610"/>
     </w:p>
     <w:tbl>
       <w:tblPr>
@@ -5753,7 +5921,11 @@
             </w:pPr>
             <w:r>
               <w:rPr/>
-              <w:t>Profil leiras</w:t>
+              <w:t xml:space="preserve">Profil </w:t>
+            </w:r>
+            <w:r>
+              <w:rPr/>
+              <w:t>leírás</w:t>
             </w:r>
           </w:p>
         </w:tc>
@@ -5778,7 +5950,7 @@
           <w:color w:val="auto"/>
         </w:rPr>
       </w:pPr>
-      <w:bookmarkStart w:name="_Toc1212072526" w:id="2143880878"/>
+      <w:bookmarkStart w:name="_Toc2034662573" w:id="467588375"/>
       <w:r>
         <w:rPr>
           <w:b w:val="1"/>
@@ -5789,7 +5961,7 @@
         </w:rPr>
         <w:t>skills - Készségek</w:t>
       </w:r>
-      <w:bookmarkEnd w:id="2143880878"/>
+      <w:bookmarkEnd w:id="467588375"/>
     </w:p>
     <w:tbl>
       <w:tblPr>
@@ -6129,7 +6301,7 @@
           <w:color w:val="auto"/>
         </w:rPr>
       </w:pPr>
-      <w:bookmarkStart w:name="_Toc278227514" w:id="425968116"/>
+      <w:bookmarkStart w:name="_Toc183638693" w:id="1000338393"/>
       <w:r>
         <w:rPr>
           <w:b w:val="1"/>
@@ -6200,7 +6372,7 @@
         </w:rPr>
         <w:t>sok</w:t>
       </w:r>
-      <w:bookmarkEnd w:id="425968116"/>
+      <w:bookmarkEnd w:id="1000338393"/>
     </w:p>
     <w:tbl>
       <w:tblPr>
@@ -7327,7 +7499,7 @@
           <w:color w:val="auto"/>
         </w:rPr>
       </w:pPr>
-      <w:bookmarkStart w:name="_Toc1027427630" w:id="832839473"/>
+      <w:bookmarkStart w:name="_Toc1568822488" w:id="1987428604"/>
       <w:r>
         <w:rPr>
           <w:b w:val="1"/>
@@ -7378,7 +7550,7 @@
         </w:rPr>
         <w:t>Kategóriák</w:t>
       </w:r>
-      <w:bookmarkEnd w:id="832839473"/>
+      <w:bookmarkEnd w:id="1987428604"/>
     </w:p>
     <w:tbl>
       <w:tblPr>
@@ -7719,7 +7891,7 @@
           <w:color w:val="auto"/>
         </w:rPr>
       </w:pPr>
-      <w:bookmarkStart w:name="_Toc2098059708" w:id="1132737675"/>
+      <w:bookmarkStart w:name="_Toc1029308870" w:id="1356184480"/>
       <w:r>
         <w:rPr>
           <w:b w:val="1"/>
@@ -7780,7 +7952,7 @@
         </w:rPr>
         <w:t>Üzenetek</w:t>
       </w:r>
-      <w:bookmarkEnd w:id="1132737675"/>
+      <w:bookmarkEnd w:id="1356184480"/>
     </w:p>
     <w:tbl>
       <w:tblPr>
@@ -8690,7 +8862,7 @@
           <w:color w:val="auto"/>
         </w:rPr>
       </w:pPr>
-      <w:bookmarkStart w:name="_Toc1726389206" w:id="1303490375"/>
+      <w:bookmarkStart w:name="_Toc842797041" w:id="853895926"/>
       <w:r>
         <w:rPr>
           <w:b w:val="1"/>
@@ -8741,7 +8913,7 @@
         </w:rPr>
         <w:t>Intézmények</w:t>
       </w:r>
-      <w:bookmarkEnd w:id="1303490375"/>
+      <w:bookmarkEnd w:id="853895926"/>
     </w:p>
     <w:p>
       <w:pPr>
@@ -9217,7 +9389,7 @@
           <w:color w:val="auto"/>
         </w:rPr>
       </w:pPr>
-      <w:bookmarkStart w:name="_Toc1668187787" w:id="813006264"/>
+      <w:bookmarkStart w:name="_Toc1751784228" w:id="727423205"/>
       <w:r>
         <w:rPr>
           <w:b w:val="1"/>
@@ -9258,7 +9430,7 @@
         </w:rPr>
         <w:t>Értékelések</w:t>
       </w:r>
-      <w:bookmarkEnd w:id="813006264"/>
+      <w:bookmarkEnd w:id="727423205"/>
     </w:p>
     <w:tbl>
       <w:tblPr>
@@ -9569,7 +9741,35 @@
             </w:pPr>
             <w:r>
               <w:rPr/>
-              <w:t>Az ertekelest kuldo felhasznalo azonositoja</w:t>
+              <w:t xml:space="preserve">Az </w:t>
+            </w:r>
+            <w:r>
+              <w:rPr/>
+              <w:t>értékelést</w:t>
+            </w:r>
+            <w:r>
+              <w:rPr/>
+              <w:t xml:space="preserve"> </w:t>
+            </w:r>
+            <w:r>
+              <w:rPr/>
+              <w:t>küldő</w:t>
+            </w:r>
+            <w:r>
+              <w:rPr/>
+              <w:t xml:space="preserve"> </w:t>
+            </w:r>
+            <w:r>
+              <w:rPr/>
+              <w:t>felhasználó</w:t>
+            </w:r>
+            <w:r>
+              <w:rPr/>
+              <w:t xml:space="preserve"> </w:t>
+            </w:r>
+            <w:r>
+              <w:rPr/>
+              <w:t>azonosítója</w:t>
             </w:r>
           </w:p>
         </w:tc>
@@ -9668,7 +9868,27 @@
             </w:pPr>
             <w:r>
               <w:rPr/>
-              <w:t>Az ertekelt allas azonositoja</w:t>
+              <w:t xml:space="preserve">Az </w:t>
+            </w:r>
+            <w:r>
+              <w:rPr/>
+              <w:t>értékelt</w:t>
+            </w:r>
+            <w:r>
+              <w:rPr/>
+              <w:t xml:space="preserve"> </w:t>
+            </w:r>
+            <w:r>
+              <w:rPr/>
+              <w:t>állás</w:t>
+            </w:r>
+            <w:r>
+              <w:rPr/>
+              <w:t xml:space="preserve"> </w:t>
+            </w:r>
+            <w:r>
+              <w:rPr/>
+              <w:t>azonosítója</w:t>
             </w:r>
           </w:p>
         </w:tc>
@@ -9767,7 +9987,7 @@
             </w:r>
             <w:r>
               <w:rPr/>
-              <w:t>ertekeles</w:t>
+              <w:t>értékelés</w:t>
             </w:r>
             <w:r>
               <w:rPr/>
@@ -9866,7 +10086,19 @@
             </w:pPr>
             <w:r>
               <w:rPr/>
-              <w:t>Az ertekeles cime</w:t>
+              <w:t xml:space="preserve">Az </w:t>
+            </w:r>
+            <w:r>
+              <w:rPr/>
+              <w:t>értékelés</w:t>
+            </w:r>
+            <w:r>
+              <w:rPr/>
+              <w:t xml:space="preserve"> </w:t>
+            </w:r>
+            <w:r>
+              <w:rPr/>
+              <w:t>címe</w:t>
             </w:r>
           </w:p>
         </w:tc>
@@ -9965,11 +10197,15 @@
             </w:r>
             <w:r>
               <w:rPr/>
-              <w:t>ertekeles</w:t>
-            </w:r>
-            <w:r>
-              <w:rPr/>
-              <w:t xml:space="preserve"> uzenete</w:t>
+              <w:t>értékelés</w:t>
+            </w:r>
+            <w:r>
+              <w:rPr/>
+              <w:t xml:space="preserve"> </w:t>
+            </w:r>
+            <w:r>
+              <w:rPr/>
+              <w:t>üzenete</w:t>
             </w:r>
           </w:p>
         </w:tc>
@@ -9993,7 +10229,7 @@
           <w:color w:val="auto"/>
         </w:rPr>
       </w:pPr>
-      <w:bookmarkStart w:name="_Toc143005928" w:id="2111150599"/>
+      <w:bookmarkStart w:name="_Toc1368974046" w:id="1484537889"/>
       <w:r>
         <w:rPr>
           <w:b w:val="1"/>
@@ -10104,7 +10340,7 @@
         </w:rPr>
         <w:t>sek</w:t>
       </w:r>
-      <w:bookmarkEnd w:id="2111150599"/>
+      <w:bookmarkEnd w:id="1484537889"/>
     </w:p>
     <w:tbl>
       <w:tblPr>
@@ -10783,7 +11019,7 @@
           <w:color w:val="auto"/>
         </w:rPr>
       </w:pPr>
-      <w:bookmarkStart w:name="_Toc1762682308" w:id="2019771028"/>
+      <w:bookmarkStart w:name="_Toc682032110" w:id="3907399"/>
       <w:r>
         <w:rPr>
           <w:b w:val="1"/>
@@ -10792,7 +11028,7 @@
         </w:rPr>
         <w:t>Kapcsolótáblák</w:t>
       </w:r>
-      <w:bookmarkEnd w:id="2019771028"/>
+      <w:bookmarkEnd w:id="3907399"/>
     </w:p>
     <w:p>
       <w:pPr>
@@ -10806,7 +11042,7 @@
           <w:color w:val="auto"/>
         </w:rPr>
       </w:pPr>
-      <w:bookmarkStart w:name="_Toc773958964" w:id="1876222340"/>
+      <w:bookmarkStart w:name="_Toc1644294656" w:id="2066827559"/>
       <w:r>
         <w:rPr>
           <w:b w:val="1"/>
@@ -10867,7 +11103,7 @@
         </w:rPr>
         <w:t>kategóriai</w:t>
       </w:r>
-      <w:bookmarkEnd w:id="1876222340"/>
+      <w:bookmarkEnd w:id="2066827559"/>
     </w:p>
     <w:tbl>
       <w:tblPr>
@@ -11079,7 +11315,7 @@
             </w:pPr>
             <w:r>
               <w:rPr/>
-              <w:t>Azonosito</w:t>
+              <w:t>Azonosító</w:t>
             </w:r>
           </w:p>
         </w:tc>
@@ -11178,7 +11414,15 @@
             </w:pPr>
             <w:r>
               <w:rPr/>
-              <w:t>Allas azonositoja</w:t>
+              <w:t>Állás</w:t>
+            </w:r>
+            <w:r>
+              <w:rPr/>
+              <w:t xml:space="preserve"> </w:t>
+            </w:r>
+            <w:r>
+              <w:rPr/>
+              <w:t>azonosítója</w:t>
             </w:r>
           </w:p>
         </w:tc>
@@ -11277,11 +11521,15 @@
             </w:pPr>
             <w:r>
               <w:rPr/>
-              <w:t>Kategoria</w:t>
-            </w:r>
-            <w:r>
-              <w:rPr/>
-              <w:t xml:space="preserve"> azonositoja</w:t>
+              <w:t>Kategória</w:t>
+            </w:r>
+            <w:r>
+              <w:rPr/>
+              <w:t xml:space="preserve"> </w:t>
+            </w:r>
+            <w:r>
+              <w:rPr/>
+              <w:t>azonosítója</w:t>
             </w:r>
           </w:p>
         </w:tc>
@@ -11305,7 +11553,7 @@
           <w:color w:val="auto"/>
         </w:rPr>
       </w:pPr>
-      <w:bookmarkStart w:name="_Toc1221079029" w:id="397272566"/>
+      <w:bookmarkStart w:name="_Toc415403538" w:id="1109565985"/>
       <w:r>
         <w:rPr>
           <w:b w:val="1"/>
@@ -11326,7 +11574,7 @@
         </w:rPr>
         <w:t xml:space="preserve"> – Állasok szükséges készségei</w:t>
       </w:r>
-      <w:bookmarkEnd w:id="397272566"/>
+      <w:bookmarkEnd w:id="1109565985"/>
     </w:p>
     <w:tbl>
       <w:tblPr>
@@ -11538,7 +11786,7 @@
             </w:pPr>
             <w:r>
               <w:rPr/>
-              <w:t>Azonosito</w:t>
+              <w:t>Azonosító</w:t>
             </w:r>
           </w:p>
         </w:tc>
@@ -11637,7 +11885,15 @@
             </w:pPr>
             <w:r>
               <w:rPr/>
-              <w:t>Allas azonositoja</w:t>
+              <w:t>Állás</w:t>
+            </w:r>
+            <w:r>
+              <w:rPr/>
+              <w:t xml:space="preserve"> </w:t>
+            </w:r>
+            <w:r>
+              <w:rPr/>
+              <w:t>azonosítója</w:t>
             </w:r>
           </w:p>
         </w:tc>
@@ -11736,7 +11992,15 @@
             </w:pPr>
             <w:r>
               <w:rPr/>
-              <w:t>Keszseg azonositoja</w:t>
+              <w:t>Készség</w:t>
+            </w:r>
+            <w:r>
+              <w:rPr/>
+              <w:t xml:space="preserve"> </w:t>
+            </w:r>
+            <w:r>
+              <w:rPr/>
+              <w:t>azonosítója</w:t>
             </w:r>
           </w:p>
         </w:tc>
@@ -11760,7 +12024,7 @@
           <w:color w:val="auto"/>
         </w:rPr>
       </w:pPr>
-      <w:bookmarkStart w:name="_Toc1208067648" w:id="646442430"/>
+      <w:bookmarkStart w:name="_Toc325782049" w:id="566131325"/>
       <w:r>
         <w:rPr>
           <w:b w:val="1"/>
@@ -11821,7 +12085,7 @@
         </w:rPr>
         <w:t>dolgozói</w:t>
       </w:r>
-      <w:bookmarkEnd w:id="646442430"/>
+      <w:bookmarkEnd w:id="566131325"/>
     </w:p>
     <w:tbl>
       <w:tblPr>
@@ -12276,7 +12540,7 @@
           <w:color w:val="auto"/>
         </w:rPr>
       </w:pPr>
-      <w:bookmarkStart w:name="_Toc1050190700" w:id="934982368"/>
+      <w:bookmarkStart w:name="_Toc1060718697" w:id="1600765567"/>
       <w:r>
         <w:rPr>
           <w:b w:val="1"/>
@@ -12337,7 +12601,7 @@
         </w:rPr>
         <w:t>dolgozói</w:t>
       </w:r>
-      <w:bookmarkEnd w:id="934982368"/>
+      <w:bookmarkEnd w:id="1600765567"/>
     </w:p>
     <w:p>
       <w:pPr>
@@ -12828,7 +13092,7 @@
           <w:color w:val="auto"/>
         </w:rPr>
       </w:pPr>
-      <w:bookmarkStart w:name="_Toc847688160" w:id="1782405243"/>
+      <w:bookmarkStart w:name="_Toc688748314" w:id="150513233"/>
       <w:r>
         <w:rPr>
           <w:b w:val="1"/>
@@ -12889,7 +13153,7 @@
         </w:rPr>
         <w:t>készségei</w:t>
       </w:r>
-      <w:bookmarkEnd w:id="1782405243"/>
+      <w:bookmarkEnd w:id="150513233"/>
     </w:p>
     <w:tbl>
       <w:tblPr>
@@ -13333,7 +13597,7 @@
           <w:color w:val="auto"/>
         </w:rPr>
       </w:pPr>
-      <w:bookmarkStart w:name="_Toc675049544" w:id="3597492"/>
+      <w:bookmarkStart w:name="_Toc1784945983" w:id="966672434"/>
       <w:r>
         <w:rPr>
           <w:b w:val="1"/>
@@ -13414,7 +13678,7 @@
         </w:rPr>
         <w:t>állások</w:t>
       </w:r>
-      <w:bookmarkEnd w:id="3597492"/>
+      <w:bookmarkEnd w:id="966672434"/>
     </w:p>
     <w:tbl>
       <w:tblPr>
@@ -13875,7 +14139,7 @@
           <w:szCs w:val="32"/>
         </w:rPr>
       </w:pPr>
-      <w:bookmarkStart w:name="_Toc865477720" w:id="2082379974"/>
+      <w:bookmarkStart w:name="_Toc793158788" w:id="249318521"/>
       <w:r>
         <w:rPr>
           <w:b w:val="1"/>
@@ -13883,7 +14147,7 @@
         </w:rPr>
         <w:t>Backend</w:t>
       </w:r>
-      <w:bookmarkEnd w:id="2082379974"/>
+      <w:bookmarkEnd w:id="249318521"/>
     </w:p>
     <w:p>
       <w:pPr>
@@ -13896,7 +14160,7 @@
           <w:color w:val="auto"/>
         </w:rPr>
       </w:pPr>
-      <w:bookmarkStart w:name="_Toc901824374" w:id="487278348"/>
+      <w:bookmarkStart w:name="_Toc572605997" w:id="1482338433"/>
       <w:r>
         <w:rPr>
           <w:b w:val="1"/>
@@ -13905,7 +14169,7 @@
         </w:rPr>
         <w:t>Áttekintés</w:t>
       </w:r>
-      <w:bookmarkEnd w:id="487278348"/>
+      <w:bookmarkEnd w:id="1482338433"/>
     </w:p>
     <w:p>
       <w:pPr>
@@ -14911,7 +15175,7 @@
           <w:lang w:val="en-US"/>
         </w:rPr>
       </w:pPr>
-      <w:bookmarkStart w:name="_Toc501131208" w:id="1076481595"/>
+      <w:bookmarkStart w:name="_Toc1353375317" w:id="939206788"/>
       <w:r>
         <w:rPr>
           <w:b w:val="1"/>
@@ -14939,7 +15203,7 @@
         </w:rPr>
         <w:t>kapcsolataik</w:t>
       </w:r>
-      <w:bookmarkEnd w:id="1076481595"/>
+      <w:bookmarkEnd w:id="939206788"/>
     </w:p>
     <w:p>
       <w:pPr>
@@ -15250,7 +15514,7 @@
           <w:color w:val="auto"/>
         </w:rPr>
       </w:pPr>
-      <w:bookmarkStart w:name="_Toc1061968516" w:id="465813681"/>
+      <w:bookmarkStart w:name="_Toc1310303153" w:id="1491154663"/>
       <w:r>
         <w:rPr>
           <w:b w:val="1"/>
@@ -15281,7 +15545,7 @@
         </w:rPr>
         <w:t>Felhasználó</w:t>
       </w:r>
-      <w:bookmarkEnd w:id="465813681"/>
+      <w:bookmarkEnd w:id="1491154663"/>
     </w:p>
     <w:p>
       <w:pPr>
@@ -15571,7 +15835,7 @@
           <w:color w:val="auto"/>
         </w:rPr>
       </w:pPr>
-      <w:bookmarkStart w:name="_Toc524395503" w:id="1861808385"/>
+      <w:bookmarkStart w:name="_Toc560037919" w:id="1409707370"/>
       <w:r>
         <w:rPr>
           <w:b w:val="1"/>
@@ -15602,7 +15866,7 @@
         </w:rPr>
         <w:t>Állás</w:t>
       </w:r>
-      <w:bookmarkEnd w:id="1861808385"/>
+      <w:bookmarkEnd w:id="1409707370"/>
     </w:p>
     <w:p>
       <w:pPr>
@@ -15873,7 +16137,7 @@
           <w:color w:val="auto"/>
         </w:rPr>
       </w:pPr>
-      <w:bookmarkStart w:name="_Toc1478078539" w:id="1774410449"/>
+      <w:bookmarkStart w:name="_Toc1674641871" w:id="1107157728"/>
       <w:r>
         <w:rPr>
           <w:b w:val="1"/>
@@ -15904,7 +16168,7 @@
         </w:rPr>
         <w:t>Intézmények</w:t>
       </w:r>
-      <w:bookmarkEnd w:id="1774410449"/>
+      <w:bookmarkEnd w:id="1107157728"/>
     </w:p>
     <w:p>
       <w:pPr>
@@ -16021,7 +16285,7 @@
           <w:color w:val="auto"/>
         </w:rPr>
       </w:pPr>
-      <w:bookmarkStart w:name="_Toc948135853" w:id="880258466"/>
+      <w:bookmarkStart w:name="_Toc96118150" w:id="1964580558"/>
       <w:r>
         <w:rPr>
           <w:b w:val="1"/>
@@ -16062,7 +16326,7 @@
         </w:rPr>
         <w:t>s</w:t>
       </w:r>
-      <w:bookmarkEnd w:id="880258466"/>
+      <w:bookmarkEnd w:id="1964580558"/>
     </w:p>
     <w:p>
       <w:pPr>
@@ -16160,7 +16424,7 @@
           <w:color w:val="auto"/>
         </w:rPr>
       </w:pPr>
-      <w:bookmarkStart w:name="_Toc1299056665" w:id="1766402251"/>
+      <w:bookmarkStart w:name="_Toc734184190" w:id="1062837584"/>
       <w:r>
         <w:rPr>
           <w:b w:val="1"/>
@@ -16191,7 +16455,7 @@
         </w:rPr>
         <w:t xml:space="preserve"> - Levél</w:t>
       </w:r>
-      <w:bookmarkEnd w:id="1766402251"/>
+      <w:bookmarkEnd w:id="1062837584"/>
     </w:p>
     <w:p>
       <w:pPr>
@@ -16289,7 +16553,7 @@
           <w:color w:val="auto"/>
         </w:rPr>
       </w:pPr>
-      <w:bookmarkStart w:name="_Toc662005509" w:id="665430278"/>
+      <w:bookmarkStart w:name="_Toc325311483" w:id="2052476320"/>
       <w:r>
         <w:rPr>
           <w:b w:val="1"/>
@@ -16330,7 +16594,7 @@
         </w:rPr>
         <w:t>Értékelés</w:t>
       </w:r>
-      <w:bookmarkEnd w:id="665430278"/>
+      <w:bookmarkEnd w:id="2052476320"/>
     </w:p>
     <w:p>
       <w:pPr>
@@ -16442,7 +16706,7 @@
         </w:rPr>
       </w:pPr>
       <w:bookmarkStart w:name="_Requestek" w:id="1129532337"/>
-      <w:bookmarkStart w:name="_Toc2101351320" w:id="1460263281"/>
+      <w:bookmarkStart w:name="_Toc1764764091" w:id="411556739"/>
       <w:r>
         <w:rPr>
           <w:b w:val="1"/>
@@ -16460,7 +16724,7 @@
         <w:t>ek</w:t>
       </w:r>
       <w:bookmarkEnd w:id="1129532337"/>
-      <w:bookmarkEnd w:id="1460263281"/>
+      <w:bookmarkEnd w:id="411556739"/>
     </w:p>
     <w:p>
       <w:pPr>
@@ -17036,7 +17300,7 @@
         <w:rPr/>
         <w:t xml:space="preserve"> kell lennie (</w:t>
       </w:r>
-      <w:hyperlink r:id="R305e64f9679646ef">
+      <w:hyperlink r:id="Ra7ca6fa152994da7">
         <w:r>
           <w:rPr>
             <w:rStyle w:val="Hyperlink"/>
@@ -17634,7 +17898,7 @@
           <w:color w:val="auto"/>
         </w:rPr>
       </w:pPr>
-      <w:bookmarkStart w:name="_Toc759320370" w:id="1829403837"/>
+      <w:bookmarkStart w:name="_Toc281838317" w:id="944030469"/>
       <w:r>
         <w:rPr>
           <w:b w:val="1"/>
@@ -17643,7 +17907,7 @@
         </w:rPr>
         <w:t>Controllerek</w:t>
       </w:r>
-      <w:bookmarkEnd w:id="1829403837"/>
+      <w:bookmarkEnd w:id="944030469"/>
     </w:p>
     <w:p>
       <w:pPr>
@@ -18266,7 +18530,7 @@
           <w:color w:val="auto"/>
         </w:rPr>
       </w:pPr>
-      <w:bookmarkStart w:name="_Toc924923395" w:id="1789270042"/>
+      <w:bookmarkStart w:name="_Toc828266703" w:id="2079682482"/>
       <w:r>
         <w:rPr>
           <w:b w:val="1"/>
@@ -18283,7 +18547,7 @@
         </w:rPr>
         <w:t>Végpontok</w:t>
       </w:r>
-      <w:bookmarkEnd w:id="1789270042"/>
+      <w:bookmarkEnd w:id="2079682482"/>
     </w:p>
     <w:tbl>
       <w:tblPr>
@@ -26600,7 +26864,7 @@
                 <w:sz w:val="24"/>
                 <w:szCs w:val="24"/>
               </w:rPr>
-              <w:t>Kategoriak</w:t>
+              <w:t>Kategóriák</w:t>
             </w:r>
           </w:p>
         </w:tc>
@@ -27590,7 +27854,7 @@
                 <w:sz w:val="24"/>
                 <w:szCs w:val="24"/>
               </w:rPr>
-              <w:t>Ertesitesek</w:t>
+              <w:t>Értesítések</w:t>
             </w:r>
             <w:r>
               <w:rPr>
@@ -27608,7 +27872,16 @@
                 <w:sz w:val="24"/>
                 <w:szCs w:val="24"/>
               </w:rPr>
-              <w:t>Uzenetek)</w:t>
+              <w:t>Üzenetek</w:t>
+            </w:r>
+            <w:r>
+              <w:rPr>
+                <w:b w:val="0"/>
+                <w:bCs w:val="0"/>
+                <w:sz w:val="24"/>
+                <w:szCs w:val="24"/>
+              </w:rPr>
+              <w:t>)</w:t>
             </w:r>
           </w:p>
         </w:tc>
@@ -28674,7 +28947,7 @@
                 <w:sz w:val="24"/>
                 <w:szCs w:val="24"/>
               </w:rPr>
-              <w:t>Ertekelesek</w:t>
+              <w:t>Értékelések</w:t>
             </w:r>
           </w:p>
         </w:tc>
@@ -30883,7 +31156,7 @@
           <w:szCs w:val="32"/>
         </w:rPr>
       </w:pPr>
-      <w:bookmarkStart w:name="_Toc971204917" w:id="1021754107"/>
+      <w:bookmarkStart w:name="_Toc1552034508" w:id="140050504"/>
       <w:r>
         <w:rPr>
           <w:color w:val="auto"/>
@@ -30896,7 +31169,7 @@
         </w:rPr>
         <w:t>d</w:t>
       </w:r>
-      <w:bookmarkEnd w:id="1021754107"/>
+      <w:bookmarkEnd w:id="140050504"/>
     </w:p>
     <w:p>
       <w:pPr>
@@ -30909,7 +31182,7 @@
           <w:color w:val="auto"/>
         </w:rPr>
       </w:pPr>
-      <w:bookmarkStart w:name="_Toc1604777747" w:id="653481008"/>
+      <w:bookmarkStart w:name="_Toc383548161" w:id="586839574"/>
       <w:r>
         <w:rPr>
           <w:b w:val="1"/>
@@ -30918,7 +31191,7 @@
         </w:rPr>
         <w:t>Áttekintés</w:t>
       </w:r>
-      <w:bookmarkEnd w:id="653481008"/>
+      <w:bookmarkEnd w:id="586839574"/>
     </w:p>
     <w:p>
       <w:pPr>
@@ -32125,7 +32398,7 @@
           <w:color w:val="auto"/>
         </w:rPr>
       </w:pPr>
-      <w:bookmarkStart w:name="_Toc810857850" w:id="1895946069"/>
+      <w:bookmarkStart w:name="_Toc210529520" w:id="1205132044"/>
       <w:r>
         <w:rPr>
           <w:b w:val="1"/>
@@ -32134,7 +32407,7 @@
         </w:rPr>
         <w:t>Routing</w:t>
       </w:r>
-      <w:bookmarkEnd w:id="1895946069"/>
+      <w:bookmarkEnd w:id="1205132044"/>
     </w:p>
     <w:p>
       <w:pPr>
@@ -34206,7 +34479,7 @@
           <w:color w:val="auto"/>
         </w:rPr>
       </w:pPr>
-      <w:bookmarkStart w:name="_Toc28628578" w:id="1557166723"/>
+      <w:bookmarkStart w:name="_Toc864223534" w:id="2113983429"/>
       <w:r>
         <w:rPr>
           <w:b w:val="1"/>
@@ -34247,7 +34520,7 @@
         </w:rPr>
         <w:t>nézetek</w:t>
       </w:r>
-      <w:bookmarkEnd w:id="1557166723"/>
+      <w:bookmarkEnd w:id="2113983429"/>
     </w:p>
     <w:p>
       <w:pPr>
@@ -35061,7 +35334,7 @@
           <w:szCs w:val="56"/>
         </w:rPr>
       </w:pPr>
-      <w:bookmarkStart w:name="_Toc641517559" w:id="862799997"/>
+      <w:bookmarkStart w:name="_Toc948115652" w:id="412655441"/>
       <w:r>
         <w:rPr>
           <w:sz w:val="56"/>
@@ -35069,7 +35342,7 @@
         </w:rPr>
         <w:t>Felhasználói dokumentáció</w:t>
       </w:r>
-      <w:bookmarkEnd w:id="862799997"/>
+      <w:bookmarkEnd w:id="412655441"/>
     </w:p>
     <w:p>
       <w:pPr>
@@ -35078,12 +35351,12 @@
         <w:jc w:val="center"/>
         <w:rPr/>
       </w:pPr>
-      <w:bookmarkStart w:name="_Toc129411484" w:id="349619514"/>
+      <w:bookmarkStart w:name="_Toc2111348024" w:id="1036896602"/>
       <w:r>
         <w:rPr/>
         <w:t>Telepítés</w:t>
       </w:r>
-      <w:bookmarkEnd w:id="349619514"/>
+      <w:bookmarkEnd w:id="1036896602"/>
     </w:p>
     <w:p>
       <w:pPr>
@@ -35137,7 +35410,7 @@
         <w:rPr/>
         <w:t xml:space="preserve"> a </w:t>
       </w:r>
-      <w:hyperlink r:id="Ra4adae35af844025">
+      <w:hyperlink r:id="R379cf584621c45cd">
         <w:r>
           <w:rPr>
             <w:rStyle w:val="Hyperlink"/>
@@ -35193,7 +35466,7 @@
         </w:rPr>
         <w:t xml:space="preserve"> </w:t>
       </w:r>
-      <w:hyperlink r:id="R030f6d1b1b5f4a6c">
+      <w:hyperlink r:id="R0d781d9a1b844a5a">
         <w:r>
           <w:rPr>
             <w:rStyle w:val="Hyperlink"/>
@@ -35346,7 +35619,7 @@
           <w:color w:val="auto"/>
         </w:rPr>
       </w:pPr>
-      <w:bookmarkStart w:name="_Toc2082363652" w:id="1113661592"/>
+      <w:bookmarkStart w:name="_Toc597567856" w:id="1915517105"/>
       <w:r>
         <w:rPr>
           <w:b w:val="1"/>
@@ -35363,7 +35636,7 @@
         </w:rPr>
         <w:t xml:space="preserve"> szoftverek</w:t>
       </w:r>
-      <w:bookmarkEnd w:id="1113661592"/>
+      <w:bookmarkEnd w:id="1915517105"/>
     </w:p>
     <w:p>
       <w:pPr>
@@ -35375,7 +35648,7 @@
         <w:bidi w:val="0"/>
         <w:rPr/>
       </w:pPr>
-      <w:hyperlink r:id="R0475eb45360c403a">
+      <w:hyperlink r:id="R55d16db56fcd4451">
         <w:r>
           <w:rPr>
             <w:rStyle w:val="Hyperlink"/>
@@ -35394,7 +35667,7 @@
         <w:bidi w:val="0"/>
         <w:rPr/>
       </w:pPr>
-      <w:hyperlink r:id="R63572ca71a144011">
+      <w:hyperlink r:id="R5356156403fe4067">
         <w:r>
           <w:rPr>
             <w:rStyle w:val="Hyperlink"/>
@@ -35413,7 +35686,7 @@
         <w:bidi w:val="0"/>
         <w:rPr/>
       </w:pPr>
-      <w:hyperlink r:id="R7c41df2ff17841ba">
+      <w:hyperlink r:id="R7a67e1454a6e44c4">
         <w:r>
           <w:rPr>
             <w:rStyle w:val="Hyperlink"/>
@@ -35432,7 +35705,7 @@
         <w:bidi w:val="0"/>
         <w:rPr/>
       </w:pPr>
-      <w:hyperlink r:id="R7a345b00b47b4217">
+      <w:hyperlink r:id="R4b47069e1238410a">
         <w:r>
           <w:rPr>
             <w:rStyle w:val="Hyperlink"/>
@@ -35471,7 +35744,7 @@
           <w:color w:val="auto"/>
         </w:rPr>
       </w:pPr>
-      <w:bookmarkStart w:name="_Toc1220309804" w:id="1258364618"/>
+      <w:bookmarkStart w:name="_Toc377605140" w:id="231533462"/>
       <w:r>
         <w:rPr>
           <w:b w:val="1"/>
@@ -35496,7 +35769,7 @@
         </w:rPr>
         <w:t>zis</w:t>
       </w:r>
-      <w:bookmarkEnd w:id="1258364618"/>
+      <w:bookmarkEnd w:id="231533462"/>
     </w:p>
     <w:p>
       <w:pPr>
@@ -35570,7 +35843,7 @@
           <w:color w:val="auto"/>
         </w:rPr>
       </w:pPr>
-      <w:bookmarkStart w:name="_Toc2024597818" w:id="1491878500"/>
+      <w:bookmarkStart w:name="_Toc1654949247" w:id="240535883"/>
       <w:r>
         <w:rPr>
           <w:b w:val="1"/>
@@ -35579,7 +35852,7 @@
         </w:rPr>
         <w:t>Backend</w:t>
       </w:r>
-      <w:bookmarkEnd w:id="1491878500"/>
+      <w:bookmarkEnd w:id="240535883"/>
     </w:p>
     <w:p>
       <w:pPr>
@@ -36392,7 +36665,7 @@
           <w:color w:val="auto"/>
         </w:rPr>
       </w:pPr>
-      <w:bookmarkStart w:name="_Toc49839467" w:id="1952697776"/>
+      <w:bookmarkStart w:name="_Toc1812385324" w:id="940288523"/>
       <w:r>
         <w:rPr>
           <w:b w:val="1"/>
@@ -36401,7 +36674,7 @@
         </w:rPr>
         <w:t>Frontend</w:t>
       </w:r>
-      <w:bookmarkEnd w:id="1952697776"/>
+      <w:bookmarkEnd w:id="940288523"/>
     </w:p>
     <w:p>
       <w:pPr>
@@ -36539,12 +36812,12 @@
           <w:color w:val="auto"/>
         </w:rPr>
       </w:pPr>
-      <w:bookmarkStart w:name="_Toc1017094867" w:id="638108436"/>
+      <w:bookmarkStart w:name="_Toc1180685528" w:id="63872421"/>
       <w:r>
         <w:rPr/>
         <w:t>Regisztráció és bejelentkezés</w:t>
       </w:r>
-      <w:bookmarkEnd w:id="638108436"/>
+      <w:bookmarkEnd w:id="63872421"/>
     </w:p>
     <w:p>
       <w:pPr>
@@ -36618,7 +36891,7 @@
       </w:pPr>
       <w:r>
         <w:drawing>
-          <wp:inline wp14:editId="52F7E0B4" wp14:anchorId="751C59EE">
+          <wp:inline wp14:editId="7B8A4D7D" wp14:anchorId="751C59EE">
             <wp:extent cx="6124575" cy="3448050"/>
             <wp:effectExtent l="0" t="0" r="0" b="0"/>
             <wp:docPr id="1591578298" name="drawing"/>
@@ -36786,7 +37059,7 @@
       </w:pPr>
       <w:r>
         <w:drawing>
-          <wp:inline wp14:editId="60333CA1" wp14:anchorId="63A3F7B4">
+          <wp:inline wp14:editId="45E0174F" wp14:anchorId="63A3F7B4">
             <wp:extent cx="6124575" cy="3448050"/>
             <wp:effectExtent l="0" t="0" r="0" b="0"/>
             <wp:docPr id="110587260" name="drawing"/>
@@ -36834,12 +37107,12 @@
         <w:bidi w:val="0"/>
         <w:rPr/>
       </w:pPr>
-      <w:bookmarkStart w:name="_Toc51170102" w:id="1534405856"/>
+      <w:bookmarkStart w:name="_Toc1507165435" w:id="131124801"/>
       <w:r>
         <w:rPr/>
         <w:t>Új állásajánlat feltöltése és szerkesztése</w:t>
       </w:r>
-      <w:bookmarkEnd w:id="1534405856"/>
+      <w:bookmarkEnd w:id="131124801"/>
     </w:p>
     <w:p>
       <w:pPr>
@@ -36933,7 +37206,7 @@
       </w:pPr>
       <w:r>
         <w:drawing>
-          <wp:inline wp14:editId="138C5E13" wp14:anchorId="2B059988">
+          <wp:inline wp14:editId="2A45E6B0" wp14:anchorId="2B059988">
             <wp:extent cx="6124575" cy="3448050"/>
             <wp:effectExtent l="0" t="0" r="0" b="0"/>
             <wp:docPr id="779278686" name="drawing"/>
@@ -37181,7 +37454,7 @@
       </w:pPr>
       <w:r>
         <w:drawing>
-          <wp:inline wp14:editId="4FEBF821" wp14:anchorId="5C18C527">
+          <wp:inline wp14:editId="7F27E2A2" wp14:anchorId="5C18C527">
             <wp:extent cx="5257800" cy="2960068"/>
             <wp:effectExtent l="0" t="0" r="0" b="0"/>
             <wp:docPr id="1977319881" name="drawing"/>
@@ -37382,7 +37655,7 @@
         <w:bidi w:val="0"/>
         <w:rPr/>
       </w:pPr>
-      <w:bookmarkStart w:name="_Toc852306275" w:id="1198417938"/>
+      <w:bookmarkStart w:name="_Toc784514812" w:id="125645107"/>
       <w:r>
         <w:rPr/>
         <w:t xml:space="preserve">Állás </w:t>
@@ -37391,7 +37664,7 @@
         <w:rPr/>
         <w:t>felület</w:t>
       </w:r>
-      <w:bookmarkEnd w:id="1198417938"/>
+      <w:bookmarkEnd w:id="125645107"/>
     </w:p>
     <w:p>
       <w:pPr>
@@ -37477,7 +37750,7 @@
       </w:pPr>
       <w:r>
         <w:drawing>
-          <wp:inline wp14:editId="72925CC2" wp14:anchorId="58564D26">
+          <wp:inline wp14:editId="379F3A7A" wp14:anchorId="58564D26">
             <wp:extent cx="6124575" cy="3448050"/>
             <wp:effectExtent l="0" t="0" r="0" b="0"/>
             <wp:docPr id="505379283" name="drawing"/>
@@ -37533,7 +37806,7 @@
       </w:pPr>
       <w:r>
         <w:drawing>
-          <wp:inline wp14:editId="0F5CA0FC" wp14:anchorId="647DC8E1">
+          <wp:inline wp14:editId="5041040B" wp14:anchorId="647DC8E1">
             <wp:extent cx="6124575" cy="3448050"/>
             <wp:effectExtent l="0" t="0" r="0" b="0"/>
             <wp:docPr id="261860662" name="drawing"/>
@@ -37773,7 +38046,7 @@
         <w:bidi w:val="0"/>
         <w:rPr/>
       </w:pPr>
-      <w:bookmarkStart w:name="_Toc59556909" w:id="1122443790"/>
+      <w:bookmarkStart w:name="_Toc1497028310" w:id="843705806"/>
       <w:r>
         <w:rPr/>
         <w:t xml:space="preserve">Levelek </w:t>
@@ -37782,7 +38055,7 @@
         <w:rPr/>
         <w:t>felület</w:t>
       </w:r>
-      <w:bookmarkEnd w:id="1122443790"/>
+      <w:bookmarkEnd w:id="843705806"/>
     </w:p>
     <w:p>
       <w:pPr>
@@ -37848,7 +38121,7 @@
       </w:pPr>
       <w:r>
         <w:drawing>
-          <wp:inline wp14:editId="445E3AD8" wp14:anchorId="21E63B9F">
+          <wp:inline wp14:editId="34BCB0B3" wp14:anchorId="21E63B9F">
             <wp:extent cx="6124575" cy="3448050"/>
             <wp:effectExtent l="0" t="0" r="0" b="0"/>
             <wp:docPr id="13254848" name="drawing"/>
@@ -38193,7 +38466,7 @@
         <w:bidi w:val="0"/>
         <w:rPr/>
       </w:pPr>
-      <w:bookmarkStart w:name="_Toc425302696" w:id="2120427166"/>
+      <w:bookmarkStart w:name="_Toc1170904804" w:id="975419906"/>
       <w:r>
         <w:rPr/>
         <w:t xml:space="preserve">Profil </w:t>
@@ -38202,7 +38475,7 @@
         <w:rPr/>
         <w:t>felület</w:t>
       </w:r>
-      <w:bookmarkEnd w:id="2120427166"/>
+      <w:bookmarkEnd w:id="975419906"/>
     </w:p>
     <w:p>
       <w:pPr>
@@ -38276,7 +38549,7 @@
       </w:pPr>
       <w:r>
         <w:drawing>
-          <wp:inline wp14:editId="2F7DB960" wp14:anchorId="10C24F41">
+          <wp:inline wp14:editId="346D98A5" wp14:anchorId="10C24F41">
             <wp:extent cx="6124575" cy="3448050"/>
             <wp:effectExtent l="0" t="0" r="0" b="0"/>
             <wp:docPr id="310248813" name="drawing"/>
@@ -38388,7 +38661,7 @@
       </w:pPr>
       <w:r>
         <w:drawing>
-          <wp:inline wp14:editId="0AE5FA83" wp14:anchorId="18128EA2">
+          <wp:inline wp14:editId="04BCA311" wp14:anchorId="18128EA2">
             <wp:extent cx="6124575" cy="3448050"/>
             <wp:effectExtent l="0" t="0" r="0" b="0"/>
             <wp:docPr id="107390649" name="drawing"/>
@@ -38436,7 +38709,7 @@
         <w:bidi w:val="0"/>
         <w:rPr/>
       </w:pPr>
-      <w:bookmarkStart w:name="_Toc2015261994" w:id="723630031"/>
+      <w:bookmarkStart w:name="_Toc133851693" w:id="1271905382"/>
       <w:r>
         <w:rPr/>
         <w:t>Admin</w:t>
@@ -38445,7 +38718,7 @@
         <w:rPr/>
         <w:t xml:space="preserve"> felület</w:t>
       </w:r>
-      <w:bookmarkEnd w:id="723630031"/>
+      <w:bookmarkEnd w:id="1271905382"/>
     </w:p>
     <w:p>
       <w:pPr>
@@ -38641,7 +38914,7 @@
         <w:bidi w:val="0"/>
         <w:rPr/>
       </w:pPr>
-      <w:hyperlink r:id="Rc2a4ae6c60844529">
+      <w:hyperlink r:id="R450cb882db55470a">
         <w:r>
           <w:rPr>
             <w:rStyle w:val="Hyperlink"/>
@@ -38664,7 +38937,7 @@
         <w:bidi w:val="0"/>
         <w:rPr/>
       </w:pPr>
-      <w:hyperlink r:id="R25f600bd2a2a44b6">
+      <w:hyperlink r:id="R7fc661ed9aaf4e9b">
         <w:r>
           <w:rPr>
             <w:rStyle w:val="Hyperlink"/>
@@ -38769,7 +39042,7 @@
       </w:pPr>
       <w:r>
         <w:drawing>
-          <wp:inline wp14:editId="6B589018" wp14:anchorId="01D097F8">
+          <wp:inline wp14:editId="2AF37527" wp14:anchorId="01D097F8">
             <wp:extent cx="6124575" cy="3448050"/>
             <wp:effectExtent l="0" t="0" r="0" b="0"/>
             <wp:docPr id="10194055" name="drawing"/>
@@ -38951,7 +39224,7 @@
         <w:bidi w:val="0"/>
         <w:rPr/>
       </w:pPr>
-      <w:bookmarkStart w:name="_Toc1212400605" w:id="924483109"/>
+      <w:bookmarkStart w:name="_Toc890170387" w:id="1549576115"/>
       <w:r>
         <w:rPr/>
         <w:t xml:space="preserve">Hiba </w:t>
@@ -38960,7 +39233,7 @@
         <w:rPr/>
         <w:t>felület</w:t>
       </w:r>
-      <w:bookmarkEnd w:id="924483109"/>
+      <w:bookmarkEnd w:id="1549576115"/>
     </w:p>
     <w:p>
       <w:pPr>
@@ -39048,7 +39321,7 @@
       </w:pPr>
       <w:r>
         <w:drawing>
-          <wp:inline wp14:editId="08ADF2D5" wp14:anchorId="700F6258">
+          <wp:inline wp14:editId="412DFADC" wp14:anchorId="700F6258">
             <wp:extent cx="6124575" cy="3448050"/>
             <wp:effectExtent l="0" t="0" r="0" b="0"/>
             <wp:docPr id="223293626" name="drawing"/>
@@ -39120,7 +39393,7 @@
       </w:pPr>
       <w:r>
         <w:drawing>
-          <wp:inline wp14:editId="1E54D5C0" wp14:anchorId="2B63E2F4">
+          <wp:inline wp14:editId="3CD8F0C7" wp14:anchorId="2B63E2F4">
             <wp:extent cx="6124575" cy="3448050"/>
             <wp:effectExtent l="0" t="0" r="0" b="0"/>
             <wp:docPr id="585909033" name="drawing"/>
@@ -39227,7 +39500,7 @@
           <w:szCs w:val="56"/>
         </w:rPr>
       </w:pPr>
-      <w:bookmarkStart w:name="_Toc1416560317" w:id="718820405"/>
+      <w:bookmarkStart w:name="_Toc527365804" w:id="705124636"/>
       <w:r>
         <w:rPr>
           <w:sz w:val="56"/>
@@ -39249,7 +39522,7 @@
         </w:rPr>
         <w:t>?</w:t>
       </w:r>
-      <w:bookmarkEnd w:id="718820405"/>
+      <w:bookmarkEnd w:id="705124636"/>
     </w:p>
     <w:p>
       <w:pPr>
@@ -39258,7 +39531,7 @@
         <w:jc w:val="center"/>
         <w:rPr/>
       </w:pPr>
-      <w:bookmarkStart w:name="_Toc829280462" w:id="10273209"/>
+      <w:bookmarkStart w:name="_Toc2000132529" w:id="1598830135"/>
       <w:r>
         <w:rPr/>
         <w:t xml:space="preserve">Amit nem </w:t>
@@ -39271,7 +39544,7 @@
         <w:rPr/>
         <w:t xml:space="preserve"> elkészítenünk</w:t>
       </w:r>
-      <w:bookmarkEnd w:id="10273209"/>
+      <w:bookmarkEnd w:id="1598830135"/>
     </w:p>
     <w:p>
       <w:pPr>
@@ -39281,7 +39554,7 @@
           <w:color w:val="auto"/>
         </w:rPr>
       </w:pPr>
-      <w:bookmarkStart w:name="_Toc1735671349" w:id="1003573083"/>
+      <w:bookmarkStart w:name="_Toc1279301964" w:id="143750080"/>
       <w:r>
         <w:rPr>
           <w:color w:val="auto"/>
@@ -39294,7 +39567,7 @@
         </w:rPr>
         <w:t>implementálása</w:t>
       </w:r>
-      <w:bookmarkEnd w:id="1003573083"/>
+      <w:bookmarkEnd w:id="143750080"/>
     </w:p>
     <w:p>
       <w:pPr>
@@ -39362,14 +39635,14 @@
           <w:color w:val="auto"/>
         </w:rPr>
       </w:pPr>
-      <w:bookmarkStart w:name="_Toc1120741733" w:id="1519572375"/>
+      <w:bookmarkStart w:name="_Toc1787569722" w:id="25014528"/>
       <w:r>
         <w:rPr>
           <w:color w:val="auto"/>
         </w:rPr>
         <w:t>Felhasználóbarát URL</w:t>
       </w:r>
-      <w:bookmarkEnd w:id="1519572375"/>
+      <w:bookmarkEnd w:id="25014528"/>
     </w:p>
     <w:p>
       <w:pPr>
@@ -39445,7 +39718,7 @@
           <w:color w:val="auto"/>
         </w:rPr>
       </w:pPr>
-      <w:bookmarkStart w:name="_Toc1259697332" w:id="631821561"/>
+      <w:bookmarkStart w:name="_Toc2024553946" w:id="2027908962"/>
       <w:r>
         <w:rPr>
           <w:color w:val="auto"/>
@@ -39470,7 +39743,7 @@
         </w:rPr>
         <w:t>lehetőségek</w:t>
       </w:r>
-      <w:bookmarkEnd w:id="631821561"/>
+      <w:bookmarkEnd w:id="2027908962"/>
     </w:p>
     <w:p>
       <w:pPr>
@@ -39572,7 +39845,7 @@
           <w:color w:val="auto"/>
         </w:rPr>
       </w:pPr>
-      <w:bookmarkStart w:name="_Toc953938683" w:id="414907810"/>
+      <w:bookmarkStart w:name="_Toc1661941746" w:id="1026809519"/>
       <w:r>
         <w:rPr>
           <w:b w:val="0"/>
@@ -39581,7 +39854,7 @@
         </w:rPr>
         <w:t>Törlés, szerkesztés frontend oldalon</w:t>
       </w:r>
-      <w:bookmarkEnd w:id="414907810"/>
+      <w:bookmarkEnd w:id="1026809519"/>
     </w:p>
     <w:p>
       <w:pPr>
@@ -39804,7 +40077,7 @@
         <w:jc w:val="center"/>
         <w:rPr/>
       </w:pPr>
-      <w:bookmarkStart w:name="_Toc1681702670" w:id="1000199073"/>
+      <w:bookmarkStart w:name="_Toc1666552151" w:id="218123647"/>
       <w:r>
         <w:rPr/>
         <w:t xml:space="preserve">Amivel </w:t>
@@ -39817,7 +40090,7 @@
         <w:rPr/>
         <w:t xml:space="preserve"> lehetne</w:t>
       </w:r>
-      <w:bookmarkEnd w:id="1000199073"/>
+      <w:bookmarkEnd w:id="218123647"/>
     </w:p>
     <w:p>
       <w:pPr>
@@ -39827,7 +40100,7 @@
           <w:color w:val="auto"/>
         </w:rPr>
       </w:pPr>
-      <w:bookmarkStart w:name="_Toc1519747737" w:id="1838176003"/>
+      <w:bookmarkStart w:name="_Toc2021753230" w:id="775863815"/>
       <w:r>
         <w:rPr>
           <w:color w:val="auto"/>
@@ -39858,7 +40131,7 @@
         </w:rPr>
         <w:t>opció</w:t>
       </w:r>
-      <w:bookmarkEnd w:id="1838176003"/>
+      <w:bookmarkEnd w:id="775863815"/>
     </w:p>
     <w:p>
       <w:pPr>
@@ -40014,7 +40287,7 @@
           <w:color w:val="auto"/>
         </w:rPr>
       </w:pPr>
-      <w:bookmarkStart w:name="_Toc1732293365" w:id="2034050768"/>
+      <w:bookmarkStart w:name="_Toc201194970" w:id="1938825902"/>
       <w:r>
         <w:rPr>
           <w:color w:val="auto"/>
@@ -40033,7 +40306,7 @@
         </w:rPr>
         <w:t>értékelése</w:t>
       </w:r>
-      <w:bookmarkEnd w:id="2034050768"/>
+      <w:bookmarkEnd w:id="1938825902"/>
     </w:p>
     <w:p>
       <w:pPr>
@@ -40165,7 +40438,7 @@
           <w:color w:val="auto"/>
         </w:rPr>
       </w:pPr>
-      <w:bookmarkStart w:name="_Toc60255070" w:id="1906201780"/>
+      <w:bookmarkStart w:name="_Toc1391228516" w:id="828652083"/>
       <w:r>
         <w:rPr>
           <w:color w:val="auto"/>
@@ -40178,7 +40451,7 @@
         </w:rPr>
         <w:t xml:space="preserve"> beállítása</w:t>
       </w:r>
-      <w:bookmarkEnd w:id="1906201780"/>
+      <w:bookmarkEnd w:id="828652083"/>
     </w:p>
     <w:p>
       <w:pPr>
@@ -40282,7 +40555,7 @@
           <w:color w:val="auto"/>
         </w:rPr>
       </w:pPr>
-      <w:bookmarkStart w:name="_Toc982546194" w:id="1884284193"/>
+      <w:bookmarkStart w:name="_Toc267813701" w:id="1121677024"/>
       <w:r>
         <w:rPr>
           <w:color w:val="auto"/>
@@ -40295,7 +40568,7 @@
         </w:rPr>
         <w:t>lehetőség</w:t>
       </w:r>
-      <w:bookmarkEnd w:id="1884284193"/>
+      <w:bookmarkEnd w:id="1121677024"/>
     </w:p>
     <w:p>
       <w:pPr>
@@ -40387,14 +40660,14 @@
           <w:color w:val="auto"/>
         </w:rPr>
       </w:pPr>
-      <w:bookmarkStart w:name="_Toc739758423" w:id="178202592"/>
+      <w:bookmarkStart w:name="_Toc291085606" w:id="1036752827"/>
       <w:r>
         <w:rPr>
           <w:color w:val="auto"/>
         </w:rPr>
         <w:t>Követés / “Ismerősnek jelölés” rendszer</w:t>
       </w:r>
-      <w:bookmarkEnd w:id="178202592"/>
+      <w:bookmarkEnd w:id="1036752827"/>
     </w:p>
     <w:p>
       <w:pPr>
@@ -45849,7 +46122,7 @@
     <w:unhideWhenUsed/>
     <w:link w:val="Heading4Char"/>
     <w:qFormat/>
-    <w:rsid w:val="68B9F223"/>
+    <w:rsid w:val="0238F6FF"/>
     <w:rPr>
       <w:rFonts w:eastAsia="DejaVu Sans" w:cs="DejaVu Sans" w:eastAsiaTheme="majorEastAsia" w:cstheme="majorBidi"/>
       <w:i w:val="1"/>
@@ -45868,7 +46141,7 @@
     <w:name w:val="Heading 4 Char"/>
     <w:basedOn w:val="DefaultParagraphFont"/>
     <w:link w:val="Heading4"/>
-    <w:rsid w:val="68B9F223"/>
+    <w:rsid w:val="0238F6FF"/>
     <w:rPr>
       <w:rFonts w:eastAsia="DejaVu Sans" w:cs="DejaVu Sans" w:eastAsiaTheme="majorEastAsia" w:cstheme="majorBidi"/>
       <w:i w:val="1"/>
@@ -45882,7 +46155,7 @@
     <w:basedOn w:val="Normal"/>
     <w:next w:val="Normal"/>
     <w:unhideWhenUsed/>
-    <w:rsid w:val="68B9F223"/>
+    <w:rsid w:val="0238F6FF"/>
     <w:pPr>
       <w:spacing w:after="100"/>
       <w:ind w:left="660"/>

</xml_diff>

<commit_message>
slight changes with typography
</commit_message>
<xml_diff>
--- a/docs/Dokumentacio.docx
+++ b/docs/Dokumentacio.docx
@@ -79,25 +79,25 @@
       </w:pPr>
       <w:bookmarkStart w:name="__RefHeading___Toc4924_3940868065" w:id="0"/>
       <w:bookmarkEnd w:id="0"/>
-      <w:bookmarkStart w:name="_Toc314092305" w:id="621355667"/>
+      <w:bookmarkStart w:name="_Toc2132919633" w:id="1011373180"/>
       <w:r>
         <w:rPr/>
         <w:t>Tartalomjegyzék</w:t>
       </w:r>
       <w:bookmarkStart w:name="__RefHeading___Toc4926_3940868065" w:id="1"/>
       <w:bookmarkEnd w:id="1"/>
-      <w:bookmarkEnd w:id="621355667"/>
+      <w:bookmarkEnd w:id="1011373180"/>
     </w:p>
     <w:sdt>
       <w:sdtPr>
-        <w:id w:val="1314505766"/>
+        <w:id w:val="1336896262"/>
         <w:docPartObj>
           <w:docPartGallery w:val="Table of Contents"/>
           <w:docPartUnique/>
         </w:docPartObj>
       </w:sdtPr>
       <w:sdtContent>
-        <w:p xmlns:wp14="http://schemas.microsoft.com/office/word/2010/wordml" wp14:textId="37E4B1B4">
+        <w:p xmlns:wp14="http://schemas.microsoft.com/office/word/2010/wordml" wp14:textId="5F303341">
           <w:pPr>
             <w:pStyle w:val="TOC1"/>
             <w:tabs>
@@ -116,7 +116,7 @@
           <w:r>
             <w:fldChar w:fldCharType="separate"/>
           </w:r>
-          <w:hyperlink w:anchor="_Toc314092305">
+          <w:hyperlink w:anchor="_Toc2132919633">
             <w:r>
               <w:rPr>
                 <w:rStyle w:val="Hyperlink"/>
@@ -130,7 +130,7 @@
               <w:fldChar w:fldCharType="begin"/>
             </w:r>
             <w:r>
-              <w:instrText xml:space="preserve">PAGEREF _Toc314092305 \h</w:instrText>
+              <w:instrText xml:space="preserve">PAGEREF _Toc2132919633 \h</w:instrText>
             </w:r>
             <w:r>
               <w:fldChar w:fldCharType="separate"/>
@@ -146,7 +146,7 @@
             </w:r>
           </w:hyperlink>
         </w:p>
-        <w:p xmlns:wp14="http://schemas.microsoft.com/office/word/2010/wordml" wp14:textId="34905143">
+        <w:p xmlns:wp14="http://schemas.microsoft.com/office/word/2010/wordml" wp14:textId="0316D0A8">
           <w:pPr>
             <w:pStyle w:val="TOC1"/>
             <w:tabs>
@@ -156,7 +156,7 @@
               <w:rStyle w:val="Hyperlink"/>
             </w:rPr>
           </w:pPr>
-          <w:hyperlink w:anchor="_Toc1000833762">
+          <w:hyperlink w:anchor="_Toc628946831">
             <w:r>
               <w:rPr>
                 <w:rStyle w:val="Hyperlink"/>
@@ -170,7 +170,7 @@
               <w:fldChar w:fldCharType="begin"/>
             </w:r>
             <w:r>
-              <w:instrText xml:space="preserve">PAGEREF _Toc1000833762 \h</w:instrText>
+              <w:instrText xml:space="preserve">PAGEREF _Toc628946831 \h</w:instrText>
             </w:r>
             <w:r>
               <w:fldChar w:fldCharType="separate"/>
@@ -186,7 +186,7 @@
             </w:r>
           </w:hyperlink>
         </w:p>
-        <w:p xmlns:wp14="http://schemas.microsoft.com/office/word/2010/wordml" wp14:textId="642C54C2">
+        <w:p xmlns:wp14="http://schemas.microsoft.com/office/word/2010/wordml" wp14:textId="7FF6A3FC">
           <w:pPr>
             <w:pStyle w:val="TOC2"/>
             <w:tabs>
@@ -196,7 +196,7 @@
               <w:rStyle w:val="Hyperlink"/>
             </w:rPr>
           </w:pPr>
-          <w:hyperlink w:anchor="_Toc58912140">
+          <w:hyperlink w:anchor="_Toc1227283417">
             <w:r>
               <w:rPr>
                 <w:rStyle w:val="Hyperlink"/>
@@ -210,7 +210,7 @@
               <w:fldChar w:fldCharType="begin"/>
             </w:r>
             <w:r>
-              <w:instrText xml:space="preserve">PAGEREF _Toc58912140 \h</w:instrText>
+              <w:instrText xml:space="preserve">PAGEREF _Toc1227283417 \h</w:instrText>
             </w:r>
             <w:r>
               <w:fldChar w:fldCharType="separate"/>
@@ -226,7 +226,7 @@
             </w:r>
           </w:hyperlink>
         </w:p>
-        <w:p xmlns:wp14="http://schemas.microsoft.com/office/word/2010/wordml" wp14:textId="3348FF33">
+        <w:p xmlns:wp14="http://schemas.microsoft.com/office/word/2010/wordml" wp14:textId="533E08B6">
           <w:pPr>
             <w:pStyle w:val="TOC2"/>
             <w:tabs>
@@ -236,7 +236,7 @@
               <w:rStyle w:val="Hyperlink"/>
             </w:rPr>
           </w:pPr>
-          <w:hyperlink w:anchor="_Toc1516818344">
+          <w:hyperlink w:anchor="_Toc628609566">
             <w:r>
               <w:rPr>
                 <w:rStyle w:val="Hyperlink"/>
@@ -250,7 +250,7 @@
               <w:fldChar w:fldCharType="begin"/>
             </w:r>
             <w:r>
-              <w:instrText xml:space="preserve">PAGEREF _Toc1516818344 \h</w:instrText>
+              <w:instrText xml:space="preserve">PAGEREF _Toc628609566 \h</w:instrText>
             </w:r>
             <w:r>
               <w:fldChar w:fldCharType="separate"/>
@@ -266,7 +266,7 @@
             </w:r>
           </w:hyperlink>
         </w:p>
-        <w:p xmlns:wp14="http://schemas.microsoft.com/office/word/2010/wordml" wp14:textId="39BBA0B1">
+        <w:p xmlns:wp14="http://schemas.microsoft.com/office/word/2010/wordml" wp14:textId="71987465">
           <w:pPr>
             <w:pStyle w:val="TOC2"/>
             <w:tabs>
@@ -276,7 +276,7 @@
               <w:rStyle w:val="Hyperlink"/>
             </w:rPr>
           </w:pPr>
-          <w:hyperlink w:anchor="_Toc725016994">
+          <w:hyperlink w:anchor="_Toc587440629">
             <w:r>
               <w:rPr>
                 <w:rStyle w:val="Hyperlink"/>
@@ -290,7 +290,7 @@
               <w:fldChar w:fldCharType="begin"/>
             </w:r>
             <w:r>
-              <w:instrText xml:space="preserve">PAGEREF _Toc725016994 \h</w:instrText>
+              <w:instrText xml:space="preserve">PAGEREF _Toc587440629 \h</w:instrText>
             </w:r>
             <w:r>
               <w:fldChar w:fldCharType="separate"/>
@@ -306,7 +306,7 @@
             </w:r>
           </w:hyperlink>
         </w:p>
-        <w:p xmlns:wp14="http://schemas.microsoft.com/office/word/2010/wordml" wp14:textId="6D1988BA">
+        <w:p xmlns:wp14="http://schemas.microsoft.com/office/word/2010/wordml" wp14:textId="08693A2B">
           <w:pPr>
             <w:pStyle w:val="TOC2"/>
             <w:tabs>
@@ -316,7 +316,7 @@
               <w:rStyle w:val="Hyperlink"/>
             </w:rPr>
           </w:pPr>
-          <w:hyperlink w:anchor="_Toc2075779638">
+          <w:hyperlink w:anchor="_Toc1365467738">
             <w:r>
               <w:rPr>
                 <w:rStyle w:val="Hyperlink"/>
@@ -330,7 +330,7 @@
               <w:fldChar w:fldCharType="begin"/>
             </w:r>
             <w:r>
-              <w:instrText xml:space="preserve">PAGEREF _Toc2075779638 \h</w:instrText>
+              <w:instrText xml:space="preserve">PAGEREF _Toc1365467738 \h</w:instrText>
             </w:r>
             <w:r>
               <w:fldChar w:fldCharType="separate"/>
@@ -346,7 +346,7 @@
             </w:r>
           </w:hyperlink>
         </w:p>
-        <w:p xmlns:wp14="http://schemas.microsoft.com/office/word/2010/wordml" wp14:textId="1125A6E6">
+        <w:p xmlns:wp14="http://schemas.microsoft.com/office/word/2010/wordml" wp14:textId="12F02772">
           <w:pPr>
             <w:pStyle w:val="TOC2"/>
             <w:tabs>
@@ -356,7 +356,7 @@
               <w:rStyle w:val="Hyperlink"/>
             </w:rPr>
           </w:pPr>
-          <w:hyperlink w:anchor="_Toc1091196515">
+          <w:hyperlink w:anchor="_Toc1053299781">
             <w:r>
               <w:rPr>
                 <w:rStyle w:val="Hyperlink"/>
@@ -370,7 +370,7 @@
               <w:fldChar w:fldCharType="begin"/>
             </w:r>
             <w:r>
-              <w:instrText xml:space="preserve">PAGEREF _Toc1091196515 \h</w:instrText>
+              <w:instrText xml:space="preserve">PAGEREF _Toc1053299781 \h</w:instrText>
             </w:r>
             <w:r>
               <w:fldChar w:fldCharType="separate"/>
@@ -386,7 +386,7 @@
             </w:r>
           </w:hyperlink>
         </w:p>
-        <w:p xmlns:wp14="http://schemas.microsoft.com/office/word/2010/wordml" wp14:textId="0375BF90">
+        <w:p xmlns:wp14="http://schemas.microsoft.com/office/word/2010/wordml" wp14:textId="675CA8BC">
           <w:pPr>
             <w:pStyle w:val="TOC2"/>
             <w:tabs>
@@ -396,7 +396,7 @@
               <w:rStyle w:val="Hyperlink"/>
             </w:rPr>
           </w:pPr>
-          <w:hyperlink w:anchor="_Toc1538048944">
+          <w:hyperlink w:anchor="_Toc406805142">
             <w:r>
               <w:rPr>
                 <w:rStyle w:val="Hyperlink"/>
@@ -410,7 +410,7 @@
               <w:fldChar w:fldCharType="begin"/>
             </w:r>
             <w:r>
-              <w:instrText xml:space="preserve">PAGEREF _Toc1538048944 \h</w:instrText>
+              <w:instrText xml:space="preserve">PAGEREF _Toc406805142 \h</w:instrText>
             </w:r>
             <w:r>
               <w:fldChar w:fldCharType="separate"/>
@@ -426,7 +426,7 @@
             </w:r>
           </w:hyperlink>
         </w:p>
-        <w:p xmlns:wp14="http://schemas.microsoft.com/office/word/2010/wordml" wp14:textId="0F373910">
+        <w:p xmlns:wp14="http://schemas.microsoft.com/office/word/2010/wordml" wp14:textId="638EB5A0">
           <w:pPr>
             <w:pStyle w:val="TOC1"/>
             <w:tabs>
@@ -436,7 +436,7 @@
               <w:rStyle w:val="Hyperlink"/>
             </w:rPr>
           </w:pPr>
-          <w:hyperlink w:anchor="_Toc1685089395">
+          <w:hyperlink w:anchor="_Toc913682370">
             <w:r>
               <w:rPr>
                 <w:rStyle w:val="Hyperlink"/>
@@ -450,7 +450,7 @@
               <w:fldChar w:fldCharType="begin"/>
             </w:r>
             <w:r>
-              <w:instrText xml:space="preserve">PAGEREF _Toc1685089395 \h</w:instrText>
+              <w:instrText xml:space="preserve">PAGEREF _Toc913682370 \h</w:instrText>
             </w:r>
             <w:r>
               <w:fldChar w:fldCharType="separate"/>
@@ -466,7 +466,7 @@
             </w:r>
           </w:hyperlink>
         </w:p>
-        <w:p xmlns:wp14="http://schemas.microsoft.com/office/word/2010/wordml" wp14:textId="7756400C">
+        <w:p xmlns:wp14="http://schemas.microsoft.com/office/word/2010/wordml" wp14:textId="79CD0757">
           <w:pPr>
             <w:pStyle w:val="TOC2"/>
             <w:tabs>
@@ -476,7 +476,7 @@
               <w:rStyle w:val="Hyperlink"/>
             </w:rPr>
           </w:pPr>
-          <w:hyperlink w:anchor="_Toc877625610">
+          <w:hyperlink w:anchor="_Toc1460781486">
             <w:r>
               <w:rPr>
                 <w:rStyle w:val="Hyperlink"/>
@@ -490,7 +490,7 @@
               <w:fldChar w:fldCharType="begin"/>
             </w:r>
             <w:r>
-              <w:instrText xml:space="preserve">PAGEREF _Toc877625610 \h</w:instrText>
+              <w:instrText xml:space="preserve">PAGEREF _Toc1460781486 \h</w:instrText>
             </w:r>
             <w:r>
               <w:fldChar w:fldCharType="separate"/>
@@ -506,7 +506,7 @@
             </w:r>
           </w:hyperlink>
         </w:p>
-        <w:p xmlns:wp14="http://schemas.microsoft.com/office/word/2010/wordml" wp14:textId="0E5E9020">
+        <w:p xmlns:wp14="http://schemas.microsoft.com/office/word/2010/wordml" wp14:textId="42798A08">
           <w:pPr>
             <w:pStyle w:val="TOC3"/>
             <w:tabs>
@@ -516,7 +516,7 @@
               <w:rStyle w:val="Hyperlink"/>
             </w:rPr>
           </w:pPr>
-          <w:hyperlink w:anchor="_Toc249736723">
+          <w:hyperlink w:anchor="_Toc491455230">
             <w:r>
               <w:rPr>
                 <w:rStyle w:val="Hyperlink"/>
@@ -530,7 +530,7 @@
               <w:fldChar w:fldCharType="begin"/>
             </w:r>
             <w:r>
-              <w:instrText xml:space="preserve">PAGEREF _Toc249736723 \h</w:instrText>
+              <w:instrText xml:space="preserve">PAGEREF _Toc491455230 \h</w:instrText>
             </w:r>
             <w:r>
               <w:fldChar w:fldCharType="separate"/>
@@ -546,7 +546,7 @@
             </w:r>
           </w:hyperlink>
         </w:p>
-        <w:p xmlns:wp14="http://schemas.microsoft.com/office/word/2010/wordml" wp14:textId="7CD89E2F">
+        <w:p xmlns:wp14="http://schemas.microsoft.com/office/word/2010/wordml" wp14:textId="451C33F1">
           <w:pPr>
             <w:pStyle w:val="TOC3"/>
             <w:tabs>
@@ -556,7 +556,7 @@
               <w:rStyle w:val="Hyperlink"/>
             </w:rPr>
           </w:pPr>
-          <w:hyperlink w:anchor="_Toc63605409">
+          <w:hyperlink w:anchor="_Toc1226067122">
             <w:r>
               <w:rPr>
                 <w:rStyle w:val="Hyperlink"/>
@@ -570,7 +570,7 @@
               <w:fldChar w:fldCharType="begin"/>
             </w:r>
             <w:r>
-              <w:instrText xml:space="preserve">PAGEREF _Toc63605409 \h</w:instrText>
+              <w:instrText xml:space="preserve">PAGEREF _Toc1226067122 \h</w:instrText>
             </w:r>
             <w:r>
               <w:fldChar w:fldCharType="separate"/>
@@ -586,7 +586,7 @@
             </w:r>
           </w:hyperlink>
         </w:p>
-        <w:p xmlns:wp14="http://schemas.microsoft.com/office/word/2010/wordml" wp14:textId="6E367352">
+        <w:p xmlns:wp14="http://schemas.microsoft.com/office/word/2010/wordml" wp14:textId="6635553A">
           <w:pPr>
             <w:pStyle w:val="TOC4"/>
             <w:tabs>
@@ -596,7 +596,7 @@
               <w:rStyle w:val="Hyperlink"/>
             </w:rPr>
           </w:pPr>
-          <w:hyperlink w:anchor="_Toc1327208255">
+          <w:hyperlink w:anchor="_Toc792145039">
             <w:r>
               <w:rPr>
                 <w:rStyle w:val="Hyperlink"/>
@@ -610,7 +610,7 @@
               <w:fldChar w:fldCharType="begin"/>
             </w:r>
             <w:r>
-              <w:instrText xml:space="preserve">PAGEREF _Toc1327208255 \h</w:instrText>
+              <w:instrText xml:space="preserve">PAGEREF _Toc792145039 \h</w:instrText>
             </w:r>
             <w:r>
               <w:fldChar w:fldCharType="separate"/>
@@ -626,7 +626,7 @@
             </w:r>
           </w:hyperlink>
         </w:p>
-        <w:p xmlns:wp14="http://schemas.microsoft.com/office/word/2010/wordml" wp14:textId="6D347DD9">
+        <w:p xmlns:wp14="http://schemas.microsoft.com/office/word/2010/wordml" wp14:textId="22BD59EA">
           <w:pPr>
             <w:pStyle w:val="TOC4"/>
             <w:tabs>
@@ -636,7 +636,7 @@
               <w:rStyle w:val="Hyperlink"/>
             </w:rPr>
           </w:pPr>
-          <w:hyperlink w:anchor="_Toc160610191">
+          <w:hyperlink w:anchor="_Toc657535539">
             <w:r>
               <w:rPr>
                 <w:rStyle w:val="Hyperlink"/>
@@ -650,7 +650,7 @@
               <w:fldChar w:fldCharType="begin"/>
             </w:r>
             <w:r>
-              <w:instrText xml:space="preserve">PAGEREF _Toc160610191 \h</w:instrText>
+              <w:instrText xml:space="preserve">PAGEREF _Toc657535539 \h</w:instrText>
             </w:r>
             <w:r>
               <w:fldChar w:fldCharType="separate"/>
@@ -666,7 +666,7 @@
             </w:r>
           </w:hyperlink>
         </w:p>
-        <w:p xmlns:wp14="http://schemas.microsoft.com/office/word/2010/wordml" wp14:textId="0562F96D">
+        <w:p xmlns:wp14="http://schemas.microsoft.com/office/word/2010/wordml" wp14:textId="76EF783A">
           <w:pPr>
             <w:pStyle w:val="TOC3"/>
             <w:tabs>
@@ -676,7 +676,7 @@
               <w:rStyle w:val="Hyperlink"/>
             </w:rPr>
           </w:pPr>
-          <w:hyperlink w:anchor="_Toc67179063">
+          <w:hyperlink w:anchor="_Toc1293422893">
             <w:r>
               <w:rPr>
                 <w:rStyle w:val="Hyperlink"/>
@@ -690,7 +690,7 @@
               <w:fldChar w:fldCharType="begin"/>
             </w:r>
             <w:r>
-              <w:instrText xml:space="preserve">PAGEREF _Toc67179063 \h</w:instrText>
+              <w:instrText xml:space="preserve">PAGEREF _Toc1293422893 \h</w:instrText>
             </w:r>
             <w:r>
               <w:fldChar w:fldCharType="separate"/>
@@ -706,7 +706,7 @@
             </w:r>
           </w:hyperlink>
         </w:p>
-        <w:p xmlns:wp14="http://schemas.microsoft.com/office/word/2010/wordml" wp14:textId="760B760F">
+        <w:p xmlns:wp14="http://schemas.microsoft.com/office/word/2010/wordml" wp14:textId="6B50FB30">
           <w:pPr>
             <w:pStyle w:val="TOC4"/>
             <w:tabs>
@@ -716,7 +716,7 @@
               <w:rStyle w:val="Hyperlink"/>
             </w:rPr>
           </w:pPr>
-          <w:hyperlink w:anchor="_Toc1392545487">
+          <w:hyperlink w:anchor="_Toc279648881">
             <w:r>
               <w:rPr>
                 <w:rStyle w:val="Hyperlink"/>
@@ -730,7 +730,7 @@
               <w:fldChar w:fldCharType="begin"/>
             </w:r>
             <w:r>
-              <w:instrText xml:space="preserve">PAGEREF _Toc1392545487 \h</w:instrText>
+              <w:instrText xml:space="preserve">PAGEREF _Toc279648881 \h</w:instrText>
             </w:r>
             <w:r>
               <w:fldChar w:fldCharType="separate"/>
@@ -746,7 +746,7 @@
             </w:r>
           </w:hyperlink>
         </w:p>
-        <w:p xmlns:wp14="http://schemas.microsoft.com/office/word/2010/wordml" wp14:textId="689C5A5E">
+        <w:p xmlns:wp14="http://schemas.microsoft.com/office/word/2010/wordml" wp14:textId="7BA7A828">
           <w:pPr>
             <w:pStyle w:val="TOC4"/>
             <w:tabs>
@@ -756,7 +756,7 @@
               <w:rStyle w:val="Hyperlink"/>
             </w:rPr>
           </w:pPr>
-          <w:hyperlink w:anchor="_Toc1665053081">
+          <w:hyperlink w:anchor="_Toc2062160849">
             <w:r>
               <w:rPr>
                 <w:rStyle w:val="Hyperlink"/>
@@ -770,7 +770,7 @@
               <w:fldChar w:fldCharType="begin"/>
             </w:r>
             <w:r>
-              <w:instrText xml:space="preserve">PAGEREF _Toc1665053081 \h</w:instrText>
+              <w:instrText xml:space="preserve">PAGEREF _Toc2062160849 \h</w:instrText>
             </w:r>
             <w:r>
               <w:fldChar w:fldCharType="separate"/>
@@ -786,7 +786,7 @@
             </w:r>
           </w:hyperlink>
         </w:p>
-        <w:p xmlns:wp14="http://schemas.microsoft.com/office/word/2010/wordml" wp14:textId="40A9545D">
+        <w:p xmlns:wp14="http://schemas.microsoft.com/office/word/2010/wordml" wp14:textId="4EF033C3">
           <w:pPr>
             <w:pStyle w:val="TOC4"/>
             <w:tabs>
@@ -796,7 +796,7 @@
               <w:rStyle w:val="Hyperlink"/>
             </w:rPr>
           </w:pPr>
-          <w:hyperlink w:anchor="_Toc613651116">
+          <w:hyperlink w:anchor="_Toc879493003">
             <w:r>
               <w:rPr>
                 <w:rStyle w:val="Hyperlink"/>
@@ -810,7 +810,7 @@
               <w:fldChar w:fldCharType="begin"/>
             </w:r>
             <w:r>
-              <w:instrText xml:space="preserve">PAGEREF _Toc613651116 \h</w:instrText>
+              <w:instrText xml:space="preserve">PAGEREF _Toc879493003 \h</w:instrText>
             </w:r>
             <w:r>
               <w:fldChar w:fldCharType="separate"/>
@@ -826,7 +826,7 @@
             </w:r>
           </w:hyperlink>
         </w:p>
-        <w:p xmlns:wp14="http://schemas.microsoft.com/office/word/2010/wordml" wp14:textId="1557435F">
+        <w:p xmlns:wp14="http://schemas.microsoft.com/office/word/2010/wordml" wp14:textId="5FF89FCD">
           <w:pPr>
             <w:pStyle w:val="TOC4"/>
             <w:tabs>
@@ -836,7 +836,7 @@
               <w:rStyle w:val="Hyperlink"/>
             </w:rPr>
           </w:pPr>
-          <w:hyperlink w:anchor="_Toc1764508356">
+          <w:hyperlink w:anchor="_Toc740077530">
             <w:r>
               <w:rPr>
                 <w:rStyle w:val="Hyperlink"/>
@@ -850,7 +850,7 @@
               <w:fldChar w:fldCharType="begin"/>
             </w:r>
             <w:r>
-              <w:instrText xml:space="preserve">PAGEREF _Toc1764508356 \h</w:instrText>
+              <w:instrText xml:space="preserve">PAGEREF _Toc740077530 \h</w:instrText>
             </w:r>
             <w:r>
               <w:fldChar w:fldCharType="separate"/>
@@ -866,7 +866,7 @@
             </w:r>
           </w:hyperlink>
         </w:p>
-        <w:p xmlns:wp14="http://schemas.microsoft.com/office/word/2010/wordml" wp14:textId="6E642BF4">
+        <w:p xmlns:wp14="http://schemas.microsoft.com/office/word/2010/wordml" wp14:textId="2AA91764">
           <w:pPr>
             <w:pStyle w:val="TOC4"/>
             <w:tabs>
@@ -876,7 +876,7 @@
               <w:rStyle w:val="Hyperlink"/>
             </w:rPr>
           </w:pPr>
-          <w:hyperlink w:anchor="_Toc1624280552">
+          <w:hyperlink w:anchor="_Toc1340037201">
             <w:r>
               <w:rPr>
                 <w:rStyle w:val="Hyperlink"/>
@@ -890,7 +890,7 @@
               <w:fldChar w:fldCharType="begin"/>
             </w:r>
             <w:r>
-              <w:instrText xml:space="preserve">PAGEREF _Toc1624280552 \h</w:instrText>
+              <w:instrText xml:space="preserve">PAGEREF _Toc1340037201 \h</w:instrText>
             </w:r>
             <w:r>
               <w:fldChar w:fldCharType="separate"/>
@@ -906,7 +906,7 @@
             </w:r>
           </w:hyperlink>
         </w:p>
-        <w:p xmlns:wp14="http://schemas.microsoft.com/office/word/2010/wordml" wp14:textId="4A1A3DD2">
+        <w:p xmlns:wp14="http://schemas.microsoft.com/office/word/2010/wordml" wp14:textId="24946141">
           <w:pPr>
             <w:pStyle w:val="TOC4"/>
             <w:tabs>
@@ -916,7 +916,7 @@
               <w:rStyle w:val="Hyperlink"/>
             </w:rPr>
           </w:pPr>
-          <w:hyperlink w:anchor="_Toc1339983314">
+          <w:hyperlink w:anchor="_Toc661485810">
             <w:r>
               <w:rPr>
                 <w:rStyle w:val="Hyperlink"/>
@@ -930,7 +930,7 @@
               <w:fldChar w:fldCharType="begin"/>
             </w:r>
             <w:r>
-              <w:instrText xml:space="preserve">PAGEREF _Toc1339983314 \h</w:instrText>
+              <w:instrText xml:space="preserve">PAGEREF _Toc661485810 \h</w:instrText>
             </w:r>
             <w:r>
               <w:fldChar w:fldCharType="separate"/>
@@ -946,7 +946,7 @@
             </w:r>
           </w:hyperlink>
         </w:p>
-        <w:p xmlns:wp14="http://schemas.microsoft.com/office/word/2010/wordml" wp14:textId="37D81544">
+        <w:p xmlns:wp14="http://schemas.microsoft.com/office/word/2010/wordml" wp14:textId="612B58D6">
           <w:pPr>
             <w:pStyle w:val="TOC4"/>
             <w:tabs>
@@ -956,7 +956,7 @@
               <w:rStyle w:val="Hyperlink"/>
             </w:rPr>
           </w:pPr>
-          <w:hyperlink w:anchor="_Toc608718796">
+          <w:hyperlink w:anchor="_Toc1968907794">
             <w:r>
               <w:rPr>
                 <w:rStyle w:val="Hyperlink"/>
@@ -970,7 +970,7 @@
               <w:fldChar w:fldCharType="begin"/>
             </w:r>
             <w:r>
-              <w:instrText xml:space="preserve">PAGEREF _Toc608718796 \h</w:instrText>
+              <w:instrText xml:space="preserve">PAGEREF _Toc1968907794 \h</w:instrText>
             </w:r>
             <w:r>
               <w:fldChar w:fldCharType="separate"/>
@@ -986,7 +986,7 @@
             </w:r>
           </w:hyperlink>
         </w:p>
-        <w:p xmlns:wp14="http://schemas.microsoft.com/office/word/2010/wordml" wp14:textId="091EECE5">
+        <w:p xmlns:wp14="http://schemas.microsoft.com/office/word/2010/wordml" wp14:textId="44E27A2B">
           <w:pPr>
             <w:pStyle w:val="TOC4"/>
             <w:tabs>
@@ -996,7 +996,7 @@
               <w:rStyle w:val="Hyperlink"/>
             </w:rPr>
           </w:pPr>
-          <w:hyperlink w:anchor="_Toc2139121594">
+          <w:hyperlink w:anchor="_Toc2091366519">
             <w:r>
               <w:rPr>
                 <w:rStyle w:val="Hyperlink"/>
@@ -1010,7 +1010,7 @@
               <w:fldChar w:fldCharType="begin"/>
             </w:r>
             <w:r>
-              <w:instrText xml:space="preserve">PAGEREF _Toc2139121594 \h</w:instrText>
+              <w:instrText xml:space="preserve">PAGEREF _Toc2091366519 \h</w:instrText>
             </w:r>
             <w:r>
               <w:fldChar w:fldCharType="separate"/>
@@ -1026,7 +1026,7 @@
             </w:r>
           </w:hyperlink>
         </w:p>
-        <w:p xmlns:wp14="http://schemas.microsoft.com/office/word/2010/wordml" wp14:textId="29F4F57D">
+        <w:p xmlns:wp14="http://schemas.microsoft.com/office/word/2010/wordml" wp14:textId="7973A6F4">
           <w:pPr>
             <w:pStyle w:val="TOC3"/>
             <w:tabs>
@@ -1036,7 +1036,7 @@
               <w:rStyle w:val="Hyperlink"/>
             </w:rPr>
           </w:pPr>
-          <w:hyperlink w:anchor="_Toc1444618756">
+          <w:hyperlink w:anchor="_Toc1368332951">
             <w:r>
               <w:rPr>
                 <w:rStyle w:val="Hyperlink"/>
@@ -1050,7 +1050,7 @@
               <w:fldChar w:fldCharType="begin"/>
             </w:r>
             <w:r>
-              <w:instrText xml:space="preserve">PAGEREF _Toc1444618756 \h</w:instrText>
+              <w:instrText xml:space="preserve">PAGEREF _Toc1368332951 \h</w:instrText>
             </w:r>
             <w:r>
               <w:fldChar w:fldCharType="separate"/>
@@ -1066,7 +1066,7 @@
             </w:r>
           </w:hyperlink>
         </w:p>
-        <w:p xmlns:wp14="http://schemas.microsoft.com/office/word/2010/wordml" wp14:textId="1D997ECE">
+        <w:p xmlns:wp14="http://schemas.microsoft.com/office/word/2010/wordml" wp14:textId="5E9128BC">
           <w:pPr>
             <w:pStyle w:val="TOC4"/>
             <w:tabs>
@@ -1076,7 +1076,7 @@
               <w:rStyle w:val="Hyperlink"/>
             </w:rPr>
           </w:pPr>
-          <w:hyperlink w:anchor="_Toc1335897233">
+          <w:hyperlink w:anchor="_Toc1713507509">
             <w:r>
               <w:rPr>
                 <w:rStyle w:val="Hyperlink"/>
@@ -1090,7 +1090,7 @@
               <w:fldChar w:fldCharType="begin"/>
             </w:r>
             <w:r>
-              <w:instrText xml:space="preserve">PAGEREF _Toc1335897233 \h</w:instrText>
+              <w:instrText xml:space="preserve">PAGEREF _Toc1713507509 \h</w:instrText>
             </w:r>
             <w:r>
               <w:fldChar w:fldCharType="separate"/>
@@ -1106,7 +1106,7 @@
             </w:r>
           </w:hyperlink>
         </w:p>
-        <w:p xmlns:wp14="http://schemas.microsoft.com/office/word/2010/wordml" wp14:textId="23E6402B">
+        <w:p xmlns:wp14="http://schemas.microsoft.com/office/word/2010/wordml" wp14:textId="0F542068">
           <w:pPr>
             <w:pStyle w:val="TOC4"/>
             <w:tabs>
@@ -1116,7 +1116,7 @@
               <w:rStyle w:val="Hyperlink"/>
             </w:rPr>
           </w:pPr>
-          <w:hyperlink w:anchor="_Toc580745829">
+          <w:hyperlink w:anchor="_Toc1972606849">
             <w:r>
               <w:rPr>
                 <w:rStyle w:val="Hyperlink"/>
@@ -1130,7 +1130,7 @@
               <w:fldChar w:fldCharType="begin"/>
             </w:r>
             <w:r>
-              <w:instrText xml:space="preserve">PAGEREF _Toc580745829 \h</w:instrText>
+              <w:instrText xml:space="preserve">PAGEREF _Toc1972606849 \h</w:instrText>
             </w:r>
             <w:r>
               <w:fldChar w:fldCharType="separate"/>
@@ -1157,7 +1157,7 @@
               <w:rStyle w:val="Hyperlink"/>
             </w:rPr>
           </w:pPr>
-          <w:hyperlink w:anchor="_Toc264956407">
+          <w:hyperlink w:anchor="_Toc1432259726">
             <w:r>
               <w:rPr>
                 <w:rStyle w:val="Hyperlink"/>
@@ -1171,7 +1171,7 @@
               <w:fldChar w:fldCharType="begin"/>
             </w:r>
             <w:r>
-              <w:instrText xml:space="preserve">PAGEREF _Toc264956407 \h</w:instrText>
+              <w:instrText xml:space="preserve">PAGEREF _Toc1432259726 \h</w:instrText>
             </w:r>
             <w:r>
               <w:fldChar w:fldCharType="separate"/>
@@ -1198,7 +1198,7 @@
               <w:rStyle w:val="Hyperlink"/>
             </w:rPr>
           </w:pPr>
-          <w:hyperlink w:anchor="_Toc1031022661">
+          <w:hyperlink w:anchor="_Toc1014206000">
             <w:r>
               <w:rPr>
                 <w:rStyle w:val="Hyperlink"/>
@@ -1212,7 +1212,7 @@
               <w:fldChar w:fldCharType="begin"/>
             </w:r>
             <w:r>
-              <w:instrText xml:space="preserve">PAGEREF _Toc1031022661 \h</w:instrText>
+              <w:instrText xml:space="preserve">PAGEREF _Toc1014206000 \h</w:instrText>
             </w:r>
             <w:r>
               <w:fldChar w:fldCharType="separate"/>
@@ -1239,7 +1239,7 @@
               <w:rStyle w:val="Hyperlink"/>
             </w:rPr>
           </w:pPr>
-          <w:hyperlink w:anchor="_Toc2127634976">
+          <w:hyperlink w:anchor="_Toc670250900">
             <w:r>
               <w:rPr>
                 <w:rStyle w:val="Hyperlink"/>
@@ -1253,7 +1253,7 @@
               <w:fldChar w:fldCharType="begin"/>
             </w:r>
             <w:r>
-              <w:instrText xml:space="preserve">PAGEREF _Toc2127634976 \h</w:instrText>
+              <w:instrText xml:space="preserve">PAGEREF _Toc670250900 \h</w:instrText>
             </w:r>
             <w:r>
               <w:fldChar w:fldCharType="separate"/>
@@ -1280,7 +1280,7 @@
               <w:rStyle w:val="Hyperlink"/>
             </w:rPr>
           </w:pPr>
-          <w:hyperlink w:anchor="_Toc1074329155">
+          <w:hyperlink w:anchor="_Toc1490359239">
             <w:r>
               <w:rPr>
                 <w:rStyle w:val="Hyperlink"/>
@@ -1294,7 +1294,7 @@
               <w:fldChar w:fldCharType="begin"/>
             </w:r>
             <w:r>
-              <w:instrText xml:space="preserve">PAGEREF _Toc1074329155 \h</w:instrText>
+              <w:instrText xml:space="preserve">PAGEREF _Toc1490359239 \h</w:instrText>
             </w:r>
             <w:r>
               <w:fldChar w:fldCharType="separate"/>
@@ -1321,7 +1321,7 @@
               <w:rStyle w:val="Hyperlink"/>
             </w:rPr>
           </w:pPr>
-          <w:hyperlink w:anchor="_Toc1605206827">
+          <w:hyperlink w:anchor="_Toc1264953542">
             <w:r>
               <w:rPr>
                 <w:rStyle w:val="Hyperlink"/>
@@ -1335,7 +1335,7 @@
               <w:fldChar w:fldCharType="begin"/>
             </w:r>
             <w:r>
-              <w:instrText xml:space="preserve">PAGEREF _Toc1605206827 \h</w:instrText>
+              <w:instrText xml:space="preserve">PAGEREF _Toc1264953542 \h</w:instrText>
             </w:r>
             <w:r>
               <w:fldChar w:fldCharType="separate"/>
@@ -1362,7 +1362,7 @@
               <w:rStyle w:val="Hyperlink"/>
             </w:rPr>
           </w:pPr>
-          <w:hyperlink w:anchor="_Toc1289550728">
+          <w:hyperlink w:anchor="_Toc1267610746">
             <w:r>
               <w:rPr>
                 <w:rStyle w:val="Hyperlink"/>
@@ -1376,7 +1376,7 @@
               <w:fldChar w:fldCharType="begin"/>
             </w:r>
             <w:r>
-              <w:instrText xml:space="preserve">PAGEREF _Toc1289550728 \h</w:instrText>
+              <w:instrText xml:space="preserve">PAGEREF _Toc1267610746 \h</w:instrText>
             </w:r>
             <w:r>
               <w:fldChar w:fldCharType="separate"/>
@@ -1403,7 +1403,7 @@
               <w:rStyle w:val="Hyperlink"/>
             </w:rPr>
           </w:pPr>
-          <w:hyperlink w:anchor="_Toc1307255194">
+          <w:hyperlink w:anchor="_Toc339740516">
             <w:r>
               <w:rPr>
                 <w:rStyle w:val="Hyperlink"/>
@@ -1417,7 +1417,7 @@
               <w:fldChar w:fldCharType="begin"/>
             </w:r>
             <w:r>
-              <w:instrText xml:space="preserve">PAGEREF _Toc1307255194 \h</w:instrText>
+              <w:instrText xml:space="preserve">PAGEREF _Toc339740516 \h</w:instrText>
             </w:r>
             <w:r>
               <w:fldChar w:fldCharType="separate"/>
@@ -1444,7 +1444,7 @@
               <w:rStyle w:val="Hyperlink"/>
             </w:rPr>
           </w:pPr>
-          <w:hyperlink w:anchor="_Toc228637832">
+          <w:hyperlink w:anchor="_Toc831365137">
             <w:r>
               <w:rPr>
                 <w:rStyle w:val="Hyperlink"/>
@@ -1458,7 +1458,7 @@
               <w:fldChar w:fldCharType="begin"/>
             </w:r>
             <w:r>
-              <w:instrText xml:space="preserve">PAGEREF _Toc228637832 \h</w:instrText>
+              <w:instrText xml:space="preserve">PAGEREF _Toc831365137 \h</w:instrText>
             </w:r>
             <w:r>
               <w:fldChar w:fldCharType="separate"/>
@@ -1485,7 +1485,7 @@
               <w:rStyle w:val="Hyperlink"/>
             </w:rPr>
           </w:pPr>
-          <w:hyperlink w:anchor="_Toc444072593">
+          <w:hyperlink w:anchor="_Toc2046587704">
             <w:r>
               <w:rPr>
                 <w:rStyle w:val="Hyperlink"/>
@@ -1499,7 +1499,7 @@
               <w:fldChar w:fldCharType="begin"/>
             </w:r>
             <w:r>
-              <w:instrText xml:space="preserve">PAGEREF _Toc444072593 \h</w:instrText>
+              <w:instrText xml:space="preserve">PAGEREF _Toc2046587704 \h</w:instrText>
             </w:r>
             <w:r>
               <w:fldChar w:fldCharType="separate"/>
@@ -1526,7 +1526,7 @@
               <w:rStyle w:val="Hyperlink"/>
             </w:rPr>
           </w:pPr>
-          <w:hyperlink w:anchor="_Toc814317313">
+          <w:hyperlink w:anchor="_Toc247885320">
             <w:r>
               <w:rPr>
                 <w:rStyle w:val="Hyperlink"/>
@@ -1540,7 +1540,7 @@
               <w:fldChar w:fldCharType="begin"/>
             </w:r>
             <w:r>
-              <w:instrText xml:space="preserve">PAGEREF _Toc814317313 \h</w:instrText>
+              <w:instrText xml:space="preserve">PAGEREF _Toc247885320 \h</w:instrText>
             </w:r>
             <w:r>
               <w:fldChar w:fldCharType="separate"/>
@@ -1567,7 +1567,7 @@
               <w:rStyle w:val="Hyperlink"/>
             </w:rPr>
           </w:pPr>
-          <w:hyperlink w:anchor="_Toc602365865">
+          <w:hyperlink w:anchor="_Toc1680070776">
             <w:r>
               <w:rPr>
                 <w:rStyle w:val="Hyperlink"/>
@@ -1581,7 +1581,7 @@
               <w:fldChar w:fldCharType="begin"/>
             </w:r>
             <w:r>
-              <w:instrText xml:space="preserve">PAGEREF _Toc602365865 \h</w:instrText>
+              <w:instrText xml:space="preserve">PAGEREF _Toc1680070776 \h</w:instrText>
             </w:r>
             <w:r>
               <w:fldChar w:fldCharType="separate"/>
@@ -1608,7 +1608,7 @@
               <w:rStyle w:val="Hyperlink"/>
             </w:rPr>
           </w:pPr>
-          <w:hyperlink w:anchor="_Toc1030515302">
+          <w:hyperlink w:anchor="_Toc68774467">
             <w:r>
               <w:rPr>
                 <w:rStyle w:val="Hyperlink"/>
@@ -1622,7 +1622,7 @@
               <w:fldChar w:fldCharType="begin"/>
             </w:r>
             <w:r>
-              <w:instrText xml:space="preserve">PAGEREF _Toc1030515302 \h</w:instrText>
+              <w:instrText xml:space="preserve">PAGEREF _Toc68774467 \h</w:instrText>
             </w:r>
             <w:r>
               <w:fldChar w:fldCharType="separate"/>
@@ -1649,7 +1649,7 @@
               <w:rStyle w:val="Hyperlink"/>
             </w:rPr>
           </w:pPr>
-          <w:hyperlink w:anchor="_Toc216093644">
+          <w:hyperlink w:anchor="_Toc1667559181">
             <w:r>
               <w:rPr>
                 <w:rStyle w:val="Hyperlink"/>
@@ -1663,7 +1663,7 @@
               <w:fldChar w:fldCharType="begin"/>
             </w:r>
             <w:r>
-              <w:instrText xml:space="preserve">PAGEREF _Toc216093644 \h</w:instrText>
+              <w:instrText xml:space="preserve">PAGEREF _Toc1667559181 \h</w:instrText>
             </w:r>
             <w:r>
               <w:fldChar w:fldCharType="separate"/>
@@ -1690,7 +1690,7 @@
               <w:rStyle w:val="Hyperlink"/>
             </w:rPr>
           </w:pPr>
-          <w:hyperlink w:anchor="_Toc1402099775">
+          <w:hyperlink w:anchor="_Toc763405064">
             <w:r>
               <w:rPr>
                 <w:rStyle w:val="Hyperlink"/>
@@ -1704,7 +1704,7 @@
               <w:fldChar w:fldCharType="begin"/>
             </w:r>
             <w:r>
-              <w:instrText xml:space="preserve">PAGEREF _Toc1402099775 \h</w:instrText>
+              <w:instrText xml:space="preserve">PAGEREF _Toc763405064 \h</w:instrText>
             </w:r>
             <w:r>
               <w:fldChar w:fldCharType="separate"/>
@@ -1731,7 +1731,7 @@
               <w:rStyle w:val="Hyperlink"/>
             </w:rPr>
           </w:pPr>
-          <w:hyperlink w:anchor="_Toc1155059004">
+          <w:hyperlink w:anchor="_Toc719906331">
             <w:r>
               <w:rPr>
                 <w:rStyle w:val="Hyperlink"/>
@@ -1745,7 +1745,7 @@
               <w:fldChar w:fldCharType="begin"/>
             </w:r>
             <w:r>
-              <w:instrText xml:space="preserve">PAGEREF _Toc1155059004 \h</w:instrText>
+              <w:instrText xml:space="preserve">PAGEREF _Toc719906331 \h</w:instrText>
             </w:r>
             <w:r>
               <w:fldChar w:fldCharType="separate"/>
@@ -1772,7 +1772,7 @@
               <w:rStyle w:val="Hyperlink"/>
             </w:rPr>
           </w:pPr>
-          <w:hyperlink w:anchor="_Toc1061346591">
+          <w:hyperlink w:anchor="_Toc1196920276">
             <w:r>
               <w:rPr>
                 <w:rStyle w:val="Hyperlink"/>
@@ -1786,7 +1786,7 @@
               <w:fldChar w:fldCharType="begin"/>
             </w:r>
             <w:r>
-              <w:instrText xml:space="preserve">PAGEREF _Toc1061346591 \h</w:instrText>
+              <w:instrText xml:space="preserve">PAGEREF _Toc1196920276 \h</w:instrText>
             </w:r>
             <w:r>
               <w:fldChar w:fldCharType="separate"/>
@@ -1813,7 +1813,7 @@
               <w:rStyle w:val="Hyperlink"/>
             </w:rPr>
           </w:pPr>
-          <w:hyperlink w:anchor="_Toc1078647349">
+          <w:hyperlink w:anchor="_Toc1787642145">
             <w:r>
               <w:rPr>
                 <w:rStyle w:val="Hyperlink"/>
@@ -1827,7 +1827,7 @@
               <w:fldChar w:fldCharType="begin"/>
             </w:r>
             <w:r>
-              <w:instrText xml:space="preserve">PAGEREF _Toc1078647349 \h</w:instrText>
+              <w:instrText xml:space="preserve">PAGEREF _Toc1787642145 \h</w:instrText>
             </w:r>
             <w:r>
               <w:fldChar w:fldCharType="separate"/>
@@ -1854,7 +1854,7 @@
               <w:rStyle w:val="Hyperlink"/>
             </w:rPr>
           </w:pPr>
-          <w:hyperlink w:anchor="_Toc369084647">
+          <w:hyperlink w:anchor="_Toc1200159949">
             <w:r>
               <w:rPr>
                 <w:rStyle w:val="Hyperlink"/>
@@ -1868,7 +1868,7 @@
               <w:fldChar w:fldCharType="begin"/>
             </w:r>
             <w:r>
-              <w:instrText xml:space="preserve">PAGEREF _Toc369084647 \h</w:instrText>
+              <w:instrText xml:space="preserve">PAGEREF _Toc1200159949 \h</w:instrText>
             </w:r>
             <w:r>
               <w:fldChar w:fldCharType="separate"/>
@@ -1895,7 +1895,7 @@
               <w:rStyle w:val="Hyperlink"/>
             </w:rPr>
           </w:pPr>
-          <w:hyperlink w:anchor="_Toc677236350">
+          <w:hyperlink w:anchor="_Toc1479977945">
             <w:r>
               <w:rPr>
                 <w:rStyle w:val="Hyperlink"/>
@@ -1909,7 +1909,7 @@
               <w:fldChar w:fldCharType="begin"/>
             </w:r>
             <w:r>
-              <w:instrText xml:space="preserve">PAGEREF _Toc677236350 \h</w:instrText>
+              <w:instrText xml:space="preserve">PAGEREF _Toc1479977945 \h</w:instrText>
             </w:r>
             <w:r>
               <w:fldChar w:fldCharType="separate"/>
@@ -1936,7 +1936,7 @@
               <w:rStyle w:val="Hyperlink"/>
             </w:rPr>
           </w:pPr>
-          <w:hyperlink w:anchor="_Toc726857261">
+          <w:hyperlink w:anchor="_Toc317763173">
             <w:r>
               <w:rPr>
                 <w:rStyle w:val="Hyperlink"/>
@@ -1950,7 +1950,7 @@
               <w:fldChar w:fldCharType="begin"/>
             </w:r>
             <w:r>
-              <w:instrText xml:space="preserve">PAGEREF _Toc726857261 \h</w:instrText>
+              <w:instrText xml:space="preserve">PAGEREF _Toc317763173 \h</w:instrText>
             </w:r>
             <w:r>
               <w:fldChar w:fldCharType="separate"/>
@@ -1977,7 +1977,7 @@
               <w:rStyle w:val="Hyperlink"/>
             </w:rPr>
           </w:pPr>
-          <w:hyperlink w:anchor="_Toc1145220048">
+          <w:hyperlink w:anchor="_Toc2092056091">
             <w:r>
               <w:rPr>
                 <w:rStyle w:val="Hyperlink"/>
@@ -1991,7 +1991,7 @@
               <w:fldChar w:fldCharType="begin"/>
             </w:r>
             <w:r>
-              <w:instrText xml:space="preserve">PAGEREF _Toc1145220048 \h</w:instrText>
+              <w:instrText xml:space="preserve">PAGEREF _Toc2092056091 \h</w:instrText>
             </w:r>
             <w:r>
               <w:fldChar w:fldCharType="separate"/>
@@ -2018,7 +2018,7 @@
               <w:rStyle w:val="Hyperlink"/>
             </w:rPr>
           </w:pPr>
-          <w:hyperlink w:anchor="_Toc743844793">
+          <w:hyperlink w:anchor="_Toc80250615">
             <w:r>
               <w:rPr>
                 <w:rStyle w:val="Hyperlink"/>
@@ -2032,7 +2032,7 @@
               <w:fldChar w:fldCharType="begin"/>
             </w:r>
             <w:r>
-              <w:instrText xml:space="preserve">PAGEREF _Toc743844793 \h</w:instrText>
+              <w:instrText xml:space="preserve">PAGEREF _Toc80250615 \h</w:instrText>
             </w:r>
             <w:r>
               <w:fldChar w:fldCharType="separate"/>
@@ -2059,7 +2059,7 @@
               <w:rStyle w:val="Hyperlink"/>
             </w:rPr>
           </w:pPr>
-          <w:hyperlink w:anchor="_Toc46708096">
+          <w:hyperlink w:anchor="_Toc826346716">
             <w:r>
               <w:rPr>
                 <w:rStyle w:val="Hyperlink"/>
@@ -2073,7 +2073,7 @@
               <w:fldChar w:fldCharType="begin"/>
             </w:r>
             <w:r>
-              <w:instrText xml:space="preserve">PAGEREF _Toc46708096 \h</w:instrText>
+              <w:instrText xml:space="preserve">PAGEREF _Toc826346716 \h</w:instrText>
             </w:r>
             <w:r>
               <w:fldChar w:fldCharType="separate"/>
@@ -2100,7 +2100,7 @@
               <w:rStyle w:val="Hyperlink"/>
             </w:rPr>
           </w:pPr>
-          <w:hyperlink w:anchor="_Toc493597551">
+          <w:hyperlink w:anchor="_Toc860562680">
             <w:r>
               <w:rPr>
                 <w:rStyle w:val="Hyperlink"/>
@@ -2114,7 +2114,7 @@
               <w:fldChar w:fldCharType="begin"/>
             </w:r>
             <w:r>
-              <w:instrText xml:space="preserve">PAGEREF _Toc493597551 \h</w:instrText>
+              <w:instrText xml:space="preserve">PAGEREF _Toc860562680 \h</w:instrText>
             </w:r>
             <w:r>
               <w:fldChar w:fldCharType="separate"/>
@@ -2141,7 +2141,7 @@
               <w:rStyle w:val="Hyperlink"/>
             </w:rPr>
           </w:pPr>
-          <w:hyperlink w:anchor="_Toc288512761">
+          <w:hyperlink w:anchor="_Toc160120663">
             <w:r>
               <w:rPr>
                 <w:rStyle w:val="Hyperlink"/>
@@ -2155,7 +2155,7 @@
               <w:fldChar w:fldCharType="begin"/>
             </w:r>
             <w:r>
-              <w:instrText xml:space="preserve">PAGEREF _Toc288512761 \h</w:instrText>
+              <w:instrText xml:space="preserve">PAGEREF _Toc160120663 \h</w:instrText>
             </w:r>
             <w:r>
               <w:fldChar w:fldCharType="separate"/>
@@ -2182,7 +2182,7 @@
               <w:rStyle w:val="Hyperlink"/>
             </w:rPr>
           </w:pPr>
-          <w:hyperlink w:anchor="_Toc530404006">
+          <w:hyperlink w:anchor="_Toc881790290">
             <w:r>
               <w:rPr>
                 <w:rStyle w:val="Hyperlink"/>
@@ -2196,7 +2196,7 @@
               <w:fldChar w:fldCharType="begin"/>
             </w:r>
             <w:r>
-              <w:instrText xml:space="preserve">PAGEREF _Toc530404006 \h</w:instrText>
+              <w:instrText xml:space="preserve">PAGEREF _Toc881790290 \h</w:instrText>
             </w:r>
             <w:r>
               <w:fldChar w:fldCharType="separate"/>
@@ -2223,7 +2223,7 @@
               <w:rStyle w:val="Hyperlink"/>
             </w:rPr>
           </w:pPr>
-          <w:hyperlink w:anchor="_Toc608246457">
+          <w:hyperlink w:anchor="_Toc1833887804">
             <w:r>
               <w:rPr>
                 <w:rStyle w:val="Hyperlink"/>
@@ -2237,7 +2237,7 @@
               <w:fldChar w:fldCharType="begin"/>
             </w:r>
             <w:r>
-              <w:instrText xml:space="preserve">PAGEREF _Toc608246457 \h</w:instrText>
+              <w:instrText xml:space="preserve">PAGEREF _Toc1833887804 \h</w:instrText>
             </w:r>
             <w:r>
               <w:fldChar w:fldCharType="separate"/>
@@ -2264,7 +2264,7 @@
               <w:rStyle w:val="Hyperlink"/>
             </w:rPr>
           </w:pPr>
-          <w:hyperlink w:anchor="_Toc649437938">
+          <w:hyperlink w:anchor="_Toc1723847590">
             <w:r>
               <w:rPr>
                 <w:rStyle w:val="Hyperlink"/>
@@ -2278,7 +2278,7 @@
               <w:fldChar w:fldCharType="begin"/>
             </w:r>
             <w:r>
-              <w:instrText xml:space="preserve">PAGEREF _Toc649437938 \h</w:instrText>
+              <w:instrText xml:space="preserve">PAGEREF _Toc1723847590 \h</w:instrText>
             </w:r>
             <w:r>
               <w:fldChar w:fldCharType="separate"/>
@@ -2305,7 +2305,7 @@
               <w:rStyle w:val="Hyperlink"/>
             </w:rPr>
           </w:pPr>
-          <w:hyperlink w:anchor="_Toc1733677637">
+          <w:hyperlink w:anchor="_Toc1690277688">
             <w:r>
               <w:rPr>
                 <w:rStyle w:val="Hyperlink"/>
@@ -2319,7 +2319,7 @@
               <w:fldChar w:fldCharType="begin"/>
             </w:r>
             <w:r>
-              <w:instrText xml:space="preserve">PAGEREF _Toc1733677637 \h</w:instrText>
+              <w:instrText xml:space="preserve">PAGEREF _Toc1690277688 \h</w:instrText>
             </w:r>
             <w:r>
               <w:fldChar w:fldCharType="separate"/>
@@ -2346,7 +2346,7 @@
               <w:rStyle w:val="Hyperlink"/>
             </w:rPr>
           </w:pPr>
-          <w:hyperlink w:anchor="_Toc337427291">
+          <w:hyperlink w:anchor="_Toc2110785439">
             <w:r>
               <w:rPr>
                 <w:rStyle w:val="Hyperlink"/>
@@ -2360,7 +2360,7 @@
               <w:fldChar w:fldCharType="begin"/>
             </w:r>
             <w:r>
-              <w:instrText xml:space="preserve">PAGEREF _Toc337427291 \h</w:instrText>
+              <w:instrText xml:space="preserve">PAGEREF _Toc2110785439 \h</w:instrText>
             </w:r>
             <w:r>
               <w:fldChar w:fldCharType="separate"/>
@@ -2387,7 +2387,7 @@
               <w:rStyle w:val="Hyperlink"/>
             </w:rPr>
           </w:pPr>
-          <w:hyperlink w:anchor="_Toc2053328625">
+          <w:hyperlink w:anchor="_Toc1201948504">
             <w:r>
               <w:rPr>
                 <w:rStyle w:val="Hyperlink"/>
@@ -2401,7 +2401,7 @@
               <w:fldChar w:fldCharType="begin"/>
             </w:r>
             <w:r>
-              <w:instrText xml:space="preserve">PAGEREF _Toc2053328625 \h</w:instrText>
+              <w:instrText xml:space="preserve">PAGEREF _Toc1201948504 \h</w:instrText>
             </w:r>
             <w:r>
               <w:fldChar w:fldCharType="separate"/>
@@ -2428,7 +2428,7 @@
               <w:rStyle w:val="Hyperlink"/>
             </w:rPr>
           </w:pPr>
-          <w:hyperlink w:anchor="_Toc1266664635">
+          <w:hyperlink w:anchor="_Toc880056022">
             <w:r>
               <w:rPr>
                 <w:rStyle w:val="Hyperlink"/>
@@ -2442,7 +2442,7 @@
               <w:fldChar w:fldCharType="begin"/>
             </w:r>
             <w:r>
-              <w:instrText xml:space="preserve">PAGEREF _Toc1266664635 \h</w:instrText>
+              <w:instrText xml:space="preserve">PAGEREF _Toc880056022 \h</w:instrText>
             </w:r>
             <w:r>
               <w:fldChar w:fldCharType="separate"/>
@@ -2469,7 +2469,7 @@
               <w:rStyle w:val="Hyperlink"/>
             </w:rPr>
           </w:pPr>
-          <w:hyperlink w:anchor="_Toc1338234526">
+          <w:hyperlink w:anchor="_Toc1856832043">
             <w:r>
               <w:rPr>
                 <w:rStyle w:val="Hyperlink"/>
@@ -2483,7 +2483,7 @@
               <w:fldChar w:fldCharType="begin"/>
             </w:r>
             <w:r>
-              <w:instrText xml:space="preserve">PAGEREF _Toc1338234526 \h</w:instrText>
+              <w:instrText xml:space="preserve">PAGEREF _Toc1856832043 \h</w:instrText>
             </w:r>
             <w:r>
               <w:fldChar w:fldCharType="separate"/>
@@ -2510,7 +2510,7 @@
               <w:rStyle w:val="Hyperlink"/>
             </w:rPr>
           </w:pPr>
-          <w:hyperlink w:anchor="_Toc2136768629">
+          <w:hyperlink w:anchor="_Toc1962092277">
             <w:r>
               <w:rPr>
                 <w:rStyle w:val="Hyperlink"/>
@@ -2524,7 +2524,7 @@
               <w:fldChar w:fldCharType="begin"/>
             </w:r>
             <w:r>
-              <w:instrText xml:space="preserve">PAGEREF _Toc2136768629 \h</w:instrText>
+              <w:instrText xml:space="preserve">PAGEREF _Toc1962092277 \h</w:instrText>
             </w:r>
             <w:r>
               <w:fldChar w:fldCharType="separate"/>
@@ -2551,7 +2551,7 @@
               <w:rStyle w:val="Hyperlink"/>
             </w:rPr>
           </w:pPr>
-          <w:hyperlink w:anchor="_Toc431797046">
+          <w:hyperlink w:anchor="_Toc1471003770">
             <w:r>
               <w:rPr>
                 <w:rStyle w:val="Hyperlink"/>
@@ -2565,7 +2565,7 @@
               <w:fldChar w:fldCharType="begin"/>
             </w:r>
             <w:r>
-              <w:instrText xml:space="preserve">PAGEREF _Toc431797046 \h</w:instrText>
+              <w:instrText xml:space="preserve">PAGEREF _Toc1471003770 \h</w:instrText>
             </w:r>
             <w:r>
               <w:fldChar w:fldCharType="separate"/>
@@ -2592,7 +2592,7 @@
               <w:rStyle w:val="Hyperlink"/>
             </w:rPr>
           </w:pPr>
-          <w:hyperlink w:anchor="_Toc1693535390">
+          <w:hyperlink w:anchor="_Toc1793067883">
             <w:r>
               <w:rPr>
                 <w:rStyle w:val="Hyperlink"/>
@@ -2606,7 +2606,7 @@
               <w:fldChar w:fldCharType="begin"/>
             </w:r>
             <w:r>
-              <w:instrText xml:space="preserve">PAGEREF _Toc1693535390 \h</w:instrText>
+              <w:instrText xml:space="preserve">PAGEREF _Toc1793067883 \h</w:instrText>
             </w:r>
             <w:r>
               <w:fldChar w:fldCharType="separate"/>
@@ -2633,7 +2633,7 @@
               <w:rStyle w:val="Hyperlink"/>
             </w:rPr>
           </w:pPr>
-          <w:hyperlink w:anchor="_Toc1798565071">
+          <w:hyperlink w:anchor="_Toc1606070839">
             <w:r>
               <w:rPr>
                 <w:rStyle w:val="Hyperlink"/>
@@ -2647,7 +2647,7 @@
               <w:fldChar w:fldCharType="begin"/>
             </w:r>
             <w:r>
-              <w:instrText xml:space="preserve">PAGEREF _Toc1798565071 \h</w:instrText>
+              <w:instrText xml:space="preserve">PAGEREF _Toc1606070839 \h</w:instrText>
             </w:r>
             <w:r>
               <w:fldChar w:fldCharType="separate"/>
@@ -2674,7 +2674,7 @@
               <w:rStyle w:val="Hyperlink"/>
             </w:rPr>
           </w:pPr>
-          <w:hyperlink w:anchor="_Toc1847424445">
+          <w:hyperlink w:anchor="_Toc1942567202">
             <w:r>
               <w:rPr>
                 <w:rStyle w:val="Hyperlink"/>
@@ -2688,7 +2688,7 @@
               <w:fldChar w:fldCharType="begin"/>
             </w:r>
             <w:r>
-              <w:instrText xml:space="preserve">PAGEREF _Toc1847424445 \h</w:instrText>
+              <w:instrText xml:space="preserve">PAGEREF _Toc1942567202 \h</w:instrText>
             </w:r>
             <w:r>
               <w:fldChar w:fldCharType="separate"/>
@@ -2715,7 +2715,7 @@
               <w:rStyle w:val="Hyperlink"/>
             </w:rPr>
           </w:pPr>
-          <w:hyperlink w:anchor="_Toc1647930453">
+          <w:hyperlink w:anchor="_Toc1959647598">
             <w:r>
               <w:rPr>
                 <w:rStyle w:val="Hyperlink"/>
@@ -2729,7 +2729,7 @@
               <w:fldChar w:fldCharType="begin"/>
             </w:r>
             <w:r>
-              <w:instrText xml:space="preserve">PAGEREF _Toc1647930453 \h</w:instrText>
+              <w:instrText xml:space="preserve">PAGEREF _Toc1959647598 \h</w:instrText>
             </w:r>
             <w:r>
               <w:fldChar w:fldCharType="separate"/>
@@ -2756,7 +2756,7 @@
               <w:rStyle w:val="Hyperlink"/>
             </w:rPr>
           </w:pPr>
-          <w:hyperlink w:anchor="_Toc732255676">
+          <w:hyperlink w:anchor="_Toc248936108">
             <w:r>
               <w:rPr>
                 <w:rStyle w:val="Hyperlink"/>
@@ -2770,7 +2770,7 @@
               <w:fldChar w:fldCharType="begin"/>
             </w:r>
             <w:r>
-              <w:instrText xml:space="preserve">PAGEREF _Toc732255676 \h</w:instrText>
+              <w:instrText xml:space="preserve">PAGEREF _Toc248936108 \h</w:instrText>
             </w:r>
             <w:r>
               <w:fldChar w:fldCharType="separate"/>
@@ -2797,7 +2797,7 @@
               <w:rStyle w:val="Hyperlink"/>
             </w:rPr>
           </w:pPr>
-          <w:hyperlink w:anchor="_Toc1554210241">
+          <w:hyperlink w:anchor="_Toc899592505">
             <w:r>
               <w:rPr>
                 <w:rStyle w:val="Hyperlink"/>
@@ -2811,7 +2811,7 @@
               <w:fldChar w:fldCharType="begin"/>
             </w:r>
             <w:r>
-              <w:instrText xml:space="preserve">PAGEREF _Toc1554210241 \h</w:instrText>
+              <w:instrText xml:space="preserve">PAGEREF _Toc899592505 \h</w:instrText>
             </w:r>
             <w:r>
               <w:fldChar w:fldCharType="separate"/>
@@ -2838,7 +2838,7 @@
               <w:rStyle w:val="Hyperlink"/>
             </w:rPr>
           </w:pPr>
-          <w:hyperlink w:anchor="_Toc580448976">
+          <w:hyperlink w:anchor="_Toc264973866">
             <w:r>
               <w:rPr>
                 <w:rStyle w:val="Hyperlink"/>
@@ -2852,7 +2852,7 @@
               <w:fldChar w:fldCharType="begin"/>
             </w:r>
             <w:r>
-              <w:instrText xml:space="preserve">PAGEREF _Toc580448976 \h</w:instrText>
+              <w:instrText xml:space="preserve">PAGEREF _Toc264973866 \h</w:instrText>
             </w:r>
             <w:r>
               <w:fldChar w:fldCharType="separate"/>
@@ -2879,7 +2879,7 @@
               <w:rStyle w:val="Hyperlink"/>
             </w:rPr>
           </w:pPr>
-          <w:hyperlink w:anchor="_Toc47333483">
+          <w:hyperlink w:anchor="_Toc1490603036">
             <w:r>
               <w:rPr>
                 <w:rStyle w:val="Hyperlink"/>
@@ -2893,7 +2893,7 @@
               <w:fldChar w:fldCharType="begin"/>
             </w:r>
             <w:r>
-              <w:instrText xml:space="preserve">PAGEREF _Toc47333483 \h</w:instrText>
+              <w:instrText xml:space="preserve">PAGEREF _Toc1490603036 \h</w:instrText>
             </w:r>
             <w:r>
               <w:fldChar w:fldCharType="separate"/>
@@ -2920,7 +2920,7 @@
               <w:rStyle w:val="Hyperlink"/>
             </w:rPr>
           </w:pPr>
-          <w:hyperlink w:anchor="_Toc1721852670">
+          <w:hyperlink w:anchor="_Toc171624489">
             <w:r>
               <w:rPr>
                 <w:rStyle w:val="Hyperlink"/>
@@ -2934,7 +2934,7 @@
               <w:fldChar w:fldCharType="begin"/>
             </w:r>
             <w:r>
-              <w:instrText xml:space="preserve">PAGEREF _Toc1721852670 \h</w:instrText>
+              <w:instrText xml:space="preserve">PAGEREF _Toc171624489 \h</w:instrText>
             </w:r>
             <w:r>
               <w:fldChar w:fldCharType="separate"/>
@@ -2961,7 +2961,7 @@
               <w:rStyle w:val="Hyperlink"/>
             </w:rPr>
           </w:pPr>
-          <w:hyperlink w:anchor="_Toc1529631081">
+          <w:hyperlink w:anchor="_Toc1932030674">
             <w:r>
               <w:rPr>
                 <w:rStyle w:val="Hyperlink"/>
@@ -2975,7 +2975,7 @@
               <w:fldChar w:fldCharType="begin"/>
             </w:r>
             <w:r>
-              <w:instrText xml:space="preserve">PAGEREF _Toc1529631081 \h</w:instrText>
+              <w:instrText xml:space="preserve">PAGEREF _Toc1932030674 \h</w:instrText>
             </w:r>
             <w:r>
               <w:fldChar w:fldCharType="separate"/>
@@ -3021,12 +3021,12 @@
         <w:jc w:val="center"/>
         <w:rPr/>
       </w:pPr>
-      <w:bookmarkStart w:name="_Toc1000833762" w:id="1342622110"/>
+      <w:bookmarkStart w:name="_Toc628946831" w:id="655408511"/>
       <w:r>
         <w:rPr/>
         <w:t>A projektről</w:t>
       </w:r>
-      <w:bookmarkEnd w:id="1342622110"/>
+      <w:bookmarkEnd w:id="655408511"/>
     </w:p>
     <w:p>
       <w:pPr>
@@ -3062,7 +3062,15 @@
       </w:r>
       <w:r>
         <w:rPr/>
-        <w:t xml:space="preserve"> állásportál, ami új otthont adna a szabadúszóknak é</w:t>
+        <w:t xml:space="preserve"> CSR</w:t>
+      </w:r>
+      <w:r>
+        <w:rPr/>
+        <w:t xml:space="preserve"> </w:t>
+      </w:r>
+      <w:r>
+        <w:rPr/>
+        <w:t>állásportál, ami új otthont adna a szabadúszóknak é</w:t>
       </w:r>
       <w:r>
         <w:rPr/>
@@ -3106,7 +3114,7 @@
           <w:bCs w:val="1"/>
         </w:rPr>
       </w:pPr>
-      <w:bookmarkStart w:name="_Toc58912140" w:id="1676188695"/>
+      <w:bookmarkStart w:name="_Toc1227283417" w:id="1646431655"/>
       <w:r>
         <w:rPr/>
         <w:t>Miért pont állásportál</w:t>
@@ -3115,7 +3123,7 @@
         <w:rPr/>
         <w:t>?</w:t>
       </w:r>
-      <w:bookmarkEnd w:id="1676188695"/>
+      <w:bookmarkEnd w:id="1646431655"/>
     </w:p>
     <w:p>
       <w:pPr>
@@ -3162,12 +3170,12 @@
           <w:bCs w:val="1"/>
         </w:rPr>
       </w:pPr>
-      <w:bookmarkStart w:name="_Toc1516818344" w:id="1239140905"/>
+      <w:bookmarkStart w:name="_Toc628609566" w:id="931069612"/>
       <w:r>
         <w:rPr/>
         <w:t>Miért szabadúszóknak?</w:t>
       </w:r>
-      <w:bookmarkEnd w:id="1239140905"/>
+      <w:bookmarkEnd w:id="931069612"/>
     </w:p>
     <w:p xmlns:wp14="http://schemas.microsoft.com/office/word/2010/wordml" wp14:textId="79D7F5A1">
       <w:pPr>
@@ -3282,12 +3290,12 @@
           <w:bCs w:val="1"/>
         </w:rPr>
       </w:pPr>
-      <w:bookmarkStart w:name="_Toc725016994" w:id="378979208"/>
+      <w:bookmarkStart w:name="_Toc587440629" w:id="1506581295"/>
       <w:r>
         <w:rPr/>
         <w:t>Milyen előnyöket szolgál?</w:t>
       </w:r>
-      <w:bookmarkEnd w:id="378979208"/>
+      <w:bookmarkEnd w:id="1506581295"/>
     </w:p>
     <w:p xmlns:wp14="http://schemas.microsoft.com/office/word/2010/wordml" wp14:textId="7B2B9697">
       <w:pPr>
@@ -3364,12 +3372,12 @@
           <w:bCs w:val="1"/>
         </w:rPr>
       </w:pPr>
-      <w:bookmarkStart w:name="_Toc2075779638" w:id="692389967"/>
+      <w:bookmarkStart w:name="_Toc1365467738" w:id="1057615859"/>
       <w:r>
         <w:rPr/>
         <w:t>Tech stack</w:t>
       </w:r>
-      <w:bookmarkEnd w:id="692389967"/>
+      <w:bookmarkEnd w:id="1057615859"/>
     </w:p>
     <w:p>
       <w:pPr>
@@ -4264,7 +4272,7 @@
           <w:lang w:val="en-US"/>
         </w:rPr>
       </w:pPr>
-      <w:bookmarkStart w:name="_Toc1091196515" w:id="1859816308"/>
+      <w:bookmarkStart w:name="_Toc1053299781" w:id="110015520"/>
       <w:r>
         <w:rPr>
           <w:lang w:val="en-US"/>
@@ -4289,7 +4297,7 @@
         </w:rPr>
         <w:t>?</w:t>
       </w:r>
-      <w:bookmarkEnd w:id="1859816308"/>
+      <w:bookmarkEnd w:id="110015520"/>
     </w:p>
     <w:p>
       <w:pPr>
@@ -4405,7 +4413,7 @@
           <w:lang w:val="en-US"/>
         </w:rPr>
       </w:pPr>
-      <w:bookmarkStart w:name="_Toc1538048944" w:id="697681768"/>
+      <w:bookmarkStart w:name="_Toc406805142" w:id="1098789615"/>
       <w:r>
         <w:rPr>
           <w:lang w:val="en-US"/>
@@ -4436,7 +4444,7 @@
         </w:rPr>
         <w:t>feladataik</w:t>
       </w:r>
-      <w:bookmarkEnd w:id="697681768"/>
+      <w:bookmarkEnd w:id="1098789615"/>
     </w:p>
     <w:p>
       <w:pPr>
@@ -4461,7 +4469,7 @@
         </w:rPr>
         <w:t xml:space="preserve"> - </w:t>
       </w:r>
-      <w:hyperlink r:id="Rd4478a9847e541b7">
+      <w:hyperlink r:id="R247d762b5f4d4603">
         <w:r>
           <w:rPr>
             <w:rStyle w:val="Hyperlink"/>
@@ -4916,33 +4924,20 @@
           <w:ilvl w:val="2"/>
           <w:numId w:val="46"/>
         </w:numPr>
-        <w:rPr>
-          <w:lang w:val="en-US"/>
-        </w:rPr>
-      </w:pPr>
-      <w:r>
-        <w:rPr>
-          <w:lang w:val="en-US"/>
-        </w:rPr>
-        <w:t>Regisztr</w:t>
-      </w:r>
-      <w:r>
-        <w:rPr>
-          <w:lang w:val="en-US"/>
-        </w:rPr>
-        <w:t>á</w:t>
-      </w:r>
-      <w:r>
-        <w:rPr>
-          <w:lang w:val="en-US"/>
-        </w:rPr>
-        <w:t>ci</w:t>
-      </w:r>
-      <w:r>
-        <w:rPr>
-          <w:lang w:val="en-US"/>
-        </w:rPr>
-        <w:t>ó</w:t>
+        <w:suppressLineNumbers w:val="0"/>
+        <w:bidi w:val="0"/>
+        <w:spacing w:before="0" w:beforeAutospacing="off" w:after="140" w:afterAutospacing="off" w:line="276" w:lineRule="auto"/>
+        <w:ind w:left="2160" w:right="0" w:hanging="360"/>
+        <w:jc w:val="left"/>
+        <w:rPr>
+          <w:lang w:val="en-US"/>
+        </w:rPr>
+      </w:pPr>
+      <w:r>
+        <w:rPr>
+          <w:lang w:val="en-US"/>
+        </w:rPr>
+        <w:t>Authentikáció</w:t>
       </w:r>
     </w:p>
     <w:p>
@@ -4960,7 +4955,7 @@
         <w:rPr>
           <w:lang w:val="en-US"/>
         </w:rPr>
-        <w:t>Bejelentkez</w:t>
+        <w:t>Admin n</w:t>
       </w:r>
       <w:r>
         <w:rPr>
@@ -4972,7 +4967,7 @@
         <w:rPr>
           <w:lang w:val="en-US"/>
         </w:rPr>
-        <w:t>s</w:t>
+        <w:t>zetek</w:t>
       </w:r>
     </w:p>
     <w:p>
@@ -4990,36 +4985,6 @@
         <w:rPr>
           <w:lang w:val="en-US"/>
         </w:rPr>
-        <w:t>Admin n</w:t>
-      </w:r>
-      <w:r>
-        <w:rPr>
-          <w:lang w:val="en-US"/>
-        </w:rPr>
-        <w:t>é</w:t>
-      </w:r>
-      <w:r>
-        <w:rPr>
-          <w:lang w:val="en-US"/>
-        </w:rPr>
-        <w:t>zetek</w:t>
-      </w:r>
-    </w:p>
-    <w:p>
-      <w:pPr>
-        <w:pStyle w:val="BodyText"/>
-        <w:numPr>
-          <w:ilvl w:val="2"/>
-          <w:numId w:val="46"/>
-        </w:numPr>
-        <w:rPr>
-          <w:lang w:val="en-US"/>
-        </w:rPr>
-      </w:pPr>
-      <w:r>
-        <w:rPr>
-          <w:lang w:val="en-US"/>
-        </w:rPr>
         <w:t>Interakci</w:t>
       </w:r>
       <w:r>
@@ -5100,7 +5065,7 @@
         </w:rPr>
         <w:t xml:space="preserve"> - </w:t>
       </w:r>
-      <w:hyperlink r:id="R81b28b0231094980">
+      <w:hyperlink r:id="Rcebb236a9350499b">
         <w:r>
           <w:rPr>
             <w:rStyle w:val="Hyperlink"/>
@@ -5532,7 +5497,7 @@
           <w:szCs w:val="56"/>
         </w:rPr>
       </w:pPr>
-      <w:bookmarkStart w:name="_Toc1685089395" w:id="1903581453"/>
+      <w:bookmarkStart w:name="_Toc913682370" w:id="1823690078"/>
       <w:r>
         <w:rPr>
           <w:sz w:val="56"/>
@@ -5554,7 +5519,7 @@
         </w:rPr>
         <w:t>dokumentáció</w:t>
       </w:r>
-      <w:bookmarkEnd w:id="1903581453"/>
+      <w:bookmarkEnd w:id="1823690078"/>
     </w:p>
     <w:p>
       <w:pPr>
@@ -5563,12 +5528,12 @@
         <w:jc w:val="center"/>
         <w:rPr/>
       </w:pPr>
-      <w:bookmarkStart w:name="_Toc877625610" w:id="905213591"/>
+      <w:bookmarkStart w:name="_Toc1460781486" w:id="420846013"/>
       <w:r>
         <w:rPr/>
         <w:t>Adatbázis</w:t>
       </w:r>
-      <w:bookmarkEnd w:id="905213591"/>
+      <w:bookmarkEnd w:id="420846013"/>
     </w:p>
     <w:p>
       <w:pPr>
@@ -5581,7 +5546,7 @@
           <w:color w:val="auto"/>
         </w:rPr>
       </w:pPr>
-      <w:bookmarkStart w:name="_Toc249736723" w:id="1794090750"/>
+      <w:bookmarkStart w:name="_Toc491455230" w:id="1713768363"/>
       <w:r>
         <w:rPr>
           <w:b w:val="1"/>
@@ -5590,7 +5555,7 @@
         </w:rPr>
         <w:t>Áttekintés</w:t>
       </w:r>
-      <w:bookmarkEnd w:id="1794090750"/>
+      <w:bookmarkEnd w:id="1713768363"/>
     </w:p>
     <w:p>
       <w:pPr>
@@ -5654,7 +5619,7 @@
           <w:color w:val="auto"/>
         </w:rPr>
       </w:pPr>
-      <w:bookmarkStart w:name="_Toc63605409" w:id="589478058"/>
+      <w:bookmarkStart w:name="_Toc1226067122" w:id="823639999"/>
       <w:r>
         <w:rPr>
           <w:b w:val="1"/>
@@ -5679,7 +5644,7 @@
         </w:rPr>
         <w:t xml:space="preserve"> - ER Model</w:t>
       </w:r>
-      <w:bookmarkEnd w:id="589478058"/>
+      <w:bookmarkEnd w:id="823639999"/>
     </w:p>
     <w:p>
       <w:pPr>
@@ -5696,7 +5661,7 @@
           <w:szCs w:val="24"/>
         </w:rPr>
       </w:pPr>
-      <w:bookmarkStart w:name="_Toc1327208255" w:id="2000778601"/>
+      <w:bookmarkStart w:name="_Toc792145039" w:id="1608191833"/>
       <w:r>
         <w:rPr>
           <w:b w:val="1"/>
@@ -5709,7 +5674,7 @@
         </w:rPr>
         <w:t>Crow’s foot notation</w:t>
       </w:r>
-      <w:bookmarkEnd w:id="2000778601"/>
+      <w:bookmarkEnd w:id="1608191833"/>
     </w:p>
     <w:p>
       <w:pPr>
@@ -5719,7 +5684,7 @@
       </w:pPr>
       <w:r>
         <w:drawing>
-          <wp:inline wp14:editId="15029CF6" wp14:anchorId="5D85C837">
+          <wp:inline wp14:editId="60CC1517" wp14:anchorId="5D85C837">
             <wp:extent cx="6124575" cy="3524250"/>
             <wp:effectExtent l="0" t="0" r="0" b="0"/>
             <wp:docPr id="566924178" name="drawing"/>
@@ -5780,7 +5745,7 @@
           <w:color w:val="auto"/>
         </w:rPr>
       </w:pPr>
-      <w:bookmarkStart w:name="_Toc160610191" w:id="1173275520"/>
+      <w:bookmarkStart w:name="_Toc657535539" w:id="431538057"/>
       <w:r>
         <w:rPr>
           <w:rStyle w:val="Heading4Char"/>
@@ -5803,7 +5768,7 @@
         </w:rPr>
         <w:t>notation</w:t>
       </w:r>
-      <w:bookmarkEnd w:id="1173275520"/>
+      <w:bookmarkEnd w:id="431538057"/>
     </w:p>
     <w:p>
       <w:pPr>
@@ -5821,7 +5786,7 @@
       </w:pPr>
       <w:r>
         <w:drawing>
-          <wp:inline wp14:editId="73669600" wp14:anchorId="06719475">
+          <wp:inline wp14:editId="01E896EC" wp14:anchorId="06719475">
             <wp:extent cx="6124575" cy="4048125"/>
             <wp:effectExtent l="0" t="0" r="0" b="0"/>
             <wp:docPr id="1641956920" name="drawing"/>
@@ -5884,7 +5849,7 @@
           <w:color w:val="auto"/>
         </w:rPr>
       </w:pPr>
-      <w:bookmarkStart w:name="_Toc67179063" w:id="2109920525"/>
+      <w:bookmarkStart w:name="_Toc1293422893" w:id="1989483342"/>
       <w:r>
         <w:rPr>
           <w:b w:val="1"/>
@@ -5893,7 +5858,7 @@
         </w:rPr>
         <w:t>Entitások</w:t>
       </w:r>
-      <w:bookmarkEnd w:id="2109920525"/>
+      <w:bookmarkEnd w:id="1989483342"/>
     </w:p>
     <w:p xmlns:wp14="http://schemas.microsoft.com/office/word/2010/wordml" wp14:textId="2316B684">
       <w:pPr>
@@ -5907,7 +5872,7 @@
           <w:color w:val="auto"/>
         </w:rPr>
       </w:pPr>
-      <w:bookmarkStart w:name="_Toc1392545487" w:id="1579179663"/>
+      <w:bookmarkStart w:name="_Toc279648881" w:id="1416693058"/>
       <w:r>
         <w:rPr>
           <w:b w:val="1"/>
@@ -5958,7 +5923,7 @@
         </w:rPr>
         <w:t>Felhasználok</w:t>
       </w:r>
-      <w:bookmarkEnd w:id="1579179663"/>
+      <w:bookmarkEnd w:id="1416693058"/>
     </w:p>
     <w:tbl>
       <w:tblPr>
@@ -7117,7 +7082,7 @@
           <w:color w:val="auto"/>
         </w:rPr>
       </w:pPr>
-      <w:bookmarkStart w:name="_Toc1665053081" w:id="1024211610"/>
+      <w:bookmarkStart w:name="_Toc2062160849" w:id="91477974"/>
       <w:r>
         <w:rPr>
           <w:b w:val="1"/>
@@ -7128,7 +7093,7 @@
         </w:rPr>
         <w:t>skills - Készségek</w:t>
       </w:r>
-      <w:bookmarkEnd w:id="1024211610"/>
+      <w:bookmarkEnd w:id="91477974"/>
     </w:p>
     <w:tbl>
       <w:tblPr>
@@ -7468,7 +7433,7 @@
           <w:color w:val="auto"/>
         </w:rPr>
       </w:pPr>
-      <w:bookmarkStart w:name="_Toc613651116" w:id="597144124"/>
+      <w:bookmarkStart w:name="_Toc879493003" w:id="446982408"/>
       <w:r>
         <w:rPr>
           <w:b w:val="1"/>
@@ -7539,7 +7504,7 @@
         </w:rPr>
         <w:t>sok</w:t>
       </w:r>
-      <w:bookmarkEnd w:id="597144124"/>
+      <w:bookmarkEnd w:id="446982408"/>
     </w:p>
     <w:tbl>
       <w:tblPr>
@@ -8666,7 +8631,7 @@
           <w:color w:val="auto"/>
         </w:rPr>
       </w:pPr>
-      <w:bookmarkStart w:name="_Toc1764508356" w:id="1673322162"/>
+      <w:bookmarkStart w:name="_Toc740077530" w:id="370076274"/>
       <w:r>
         <w:rPr>
           <w:b w:val="1"/>
@@ -8717,7 +8682,7 @@
         </w:rPr>
         <w:t>Kategóriák</w:t>
       </w:r>
-      <w:bookmarkEnd w:id="1673322162"/>
+      <w:bookmarkEnd w:id="370076274"/>
     </w:p>
     <w:tbl>
       <w:tblPr>
@@ -9058,7 +9023,7 @@
           <w:color w:val="auto"/>
         </w:rPr>
       </w:pPr>
-      <w:bookmarkStart w:name="_Toc1624280552" w:id="1667536720"/>
+      <w:bookmarkStart w:name="_Toc1340037201" w:id="1616404937"/>
       <w:r>
         <w:rPr>
           <w:b w:val="1"/>
@@ -9119,7 +9084,7 @@
         </w:rPr>
         <w:t>Üzenetek</w:t>
       </w:r>
-      <w:bookmarkEnd w:id="1667536720"/>
+      <w:bookmarkEnd w:id="1616404937"/>
     </w:p>
     <w:tbl>
       <w:tblPr>
@@ -10029,7 +9994,7 @@
           <w:color w:val="auto"/>
         </w:rPr>
       </w:pPr>
-      <w:bookmarkStart w:name="_Toc1339983314" w:id="91074897"/>
+      <w:bookmarkStart w:name="_Toc661485810" w:id="629119155"/>
       <w:r>
         <w:rPr>
           <w:b w:val="1"/>
@@ -10080,7 +10045,7 @@
         </w:rPr>
         <w:t>Intézmények</w:t>
       </w:r>
-      <w:bookmarkEnd w:id="91074897"/>
+      <w:bookmarkEnd w:id="629119155"/>
     </w:p>
     <w:p>
       <w:pPr>
@@ -10556,7 +10521,7 @@
           <w:color w:val="auto"/>
         </w:rPr>
       </w:pPr>
-      <w:bookmarkStart w:name="_Toc608718796" w:id="1214884989"/>
+      <w:bookmarkStart w:name="_Toc1968907794" w:id="1734994920"/>
       <w:r>
         <w:rPr>
           <w:b w:val="1"/>
@@ -10597,7 +10562,7 @@
         </w:rPr>
         <w:t>Értékelések</w:t>
       </w:r>
-      <w:bookmarkEnd w:id="1214884989"/>
+      <w:bookmarkEnd w:id="1734994920"/>
     </w:p>
     <w:tbl>
       <w:tblPr>
@@ -11396,7 +11361,7 @@
           <w:color w:val="auto"/>
         </w:rPr>
       </w:pPr>
-      <w:bookmarkStart w:name="_Toc2139121594" w:id="2005683345"/>
+      <w:bookmarkStart w:name="_Toc2091366519" w:id="147829884"/>
       <w:r>
         <w:rPr>
           <w:b w:val="1"/>
@@ -11507,7 +11472,7 @@
         </w:rPr>
         <w:t>sek</w:t>
       </w:r>
-      <w:bookmarkEnd w:id="2005683345"/>
+      <w:bookmarkEnd w:id="147829884"/>
     </w:p>
     <w:tbl>
       <w:tblPr>
@@ -12186,7 +12151,7 @@
           <w:color w:val="auto"/>
         </w:rPr>
       </w:pPr>
-      <w:bookmarkStart w:name="_Toc1444618756" w:id="669565958"/>
+      <w:bookmarkStart w:name="_Toc1368332951" w:id="228165604"/>
       <w:r>
         <w:rPr>
           <w:b w:val="1"/>
@@ -12195,7 +12160,7 @@
         </w:rPr>
         <w:t>Kapcsolótáblák</w:t>
       </w:r>
-      <w:bookmarkEnd w:id="669565958"/>
+      <w:bookmarkEnd w:id="228165604"/>
     </w:p>
     <w:p>
       <w:pPr>
@@ -12209,7 +12174,7 @@
           <w:color w:val="auto"/>
         </w:rPr>
       </w:pPr>
-      <w:bookmarkStart w:name="_Toc1335897233" w:id="584488960"/>
+      <w:bookmarkStart w:name="_Toc1713507509" w:id="2005790492"/>
       <w:r>
         <w:rPr>
           <w:b w:val="1"/>
@@ -12270,7 +12235,7 @@
         </w:rPr>
         <w:t>kategóriai</w:t>
       </w:r>
-      <w:bookmarkEnd w:id="584488960"/>
+      <w:bookmarkEnd w:id="2005790492"/>
     </w:p>
     <w:tbl>
       <w:tblPr>
@@ -12720,7 +12685,7 @@
           <w:color w:val="auto"/>
         </w:rPr>
       </w:pPr>
-      <w:bookmarkStart w:name="_Toc580745829" w:id="2143208879"/>
+      <w:bookmarkStart w:name="_Toc1972606849" w:id="170273504"/>
       <w:r>
         <w:rPr>
           <w:b w:val="1"/>
@@ -12741,7 +12706,7 @@
         </w:rPr>
         <w:t xml:space="preserve"> – Állasok szükséges készségei</w:t>
       </w:r>
-      <w:bookmarkEnd w:id="2143208879"/>
+      <w:bookmarkEnd w:id="170273504"/>
     </w:p>
     <w:tbl>
       <w:tblPr>
@@ -13191,7 +13156,7 @@
           <w:color w:val="auto"/>
         </w:rPr>
       </w:pPr>
-      <w:bookmarkStart w:name="_Toc264956407" w:id="1231079858"/>
+      <w:bookmarkStart w:name="_Toc1432259726" w:id="1523432376"/>
       <w:r>
         <w:rPr>
           <w:b w:val="1"/>
@@ -13252,7 +13217,7 @@
         </w:rPr>
         <w:t>dolgozói</w:t>
       </w:r>
-      <w:bookmarkEnd w:id="1231079858"/>
+      <w:bookmarkEnd w:id="1523432376"/>
     </w:p>
     <w:tbl>
       <w:tblPr>
@@ -13707,7 +13672,7 @@
           <w:color w:val="auto"/>
         </w:rPr>
       </w:pPr>
-      <w:bookmarkStart w:name="_Toc1031022661" w:id="519613537"/>
+      <w:bookmarkStart w:name="_Toc1014206000" w:id="2109974888"/>
       <w:r>
         <w:rPr>
           <w:b w:val="1"/>
@@ -13768,7 +13733,7 @@
         </w:rPr>
         <w:t>dolgozói</w:t>
       </w:r>
-      <w:bookmarkEnd w:id="519613537"/>
+      <w:bookmarkEnd w:id="2109974888"/>
     </w:p>
     <w:p>
       <w:pPr>
@@ -14259,7 +14224,7 @@
           <w:color w:val="auto"/>
         </w:rPr>
       </w:pPr>
-      <w:bookmarkStart w:name="_Toc2127634976" w:id="802684583"/>
+      <w:bookmarkStart w:name="_Toc670250900" w:id="923224276"/>
       <w:r>
         <w:rPr>
           <w:b w:val="1"/>
@@ -14320,7 +14285,7 @@
         </w:rPr>
         <w:t>készségei</w:t>
       </w:r>
-      <w:bookmarkEnd w:id="802684583"/>
+      <w:bookmarkEnd w:id="923224276"/>
     </w:p>
     <w:tbl>
       <w:tblPr>
@@ -14764,7 +14729,7 @@
           <w:color w:val="auto"/>
         </w:rPr>
       </w:pPr>
-      <w:bookmarkStart w:name="_Toc1074329155" w:id="1035381581"/>
+      <w:bookmarkStart w:name="_Toc1490359239" w:id="121678688"/>
       <w:r>
         <w:rPr>
           <w:b w:val="1"/>
@@ -14845,7 +14810,7 @@
         </w:rPr>
         <w:t>állások</w:t>
       </w:r>
-      <w:bookmarkEnd w:id="1035381581"/>
+      <w:bookmarkEnd w:id="121678688"/>
     </w:p>
     <w:tbl>
       <w:tblPr>
@@ -15306,7 +15271,7 @@
           <w:szCs w:val="32"/>
         </w:rPr>
       </w:pPr>
-      <w:bookmarkStart w:name="_Toc1605206827" w:id="981966508"/>
+      <w:bookmarkStart w:name="_Toc1264953542" w:id="1949031593"/>
       <w:r>
         <w:rPr>
           <w:b w:val="1"/>
@@ -15314,7 +15279,7 @@
         </w:rPr>
         <w:t>Backend</w:t>
       </w:r>
-      <w:bookmarkEnd w:id="981966508"/>
+      <w:bookmarkEnd w:id="1949031593"/>
     </w:p>
     <w:p>
       <w:pPr>
@@ -15327,7 +15292,7 @@
           <w:color w:val="auto"/>
         </w:rPr>
       </w:pPr>
-      <w:bookmarkStart w:name="_Toc1289550728" w:id="1596027069"/>
+      <w:bookmarkStart w:name="_Toc1267610746" w:id="568608062"/>
       <w:r>
         <w:rPr>
           <w:b w:val="1"/>
@@ -15336,7 +15301,7 @@
         </w:rPr>
         <w:t>Áttekintés</w:t>
       </w:r>
-      <w:bookmarkEnd w:id="1596027069"/>
+      <w:bookmarkEnd w:id="568608062"/>
     </w:p>
     <w:p>
       <w:pPr>
@@ -16079,12 +16044,24 @@
         <w:rPr>
           <w:lang w:val="de-DE"/>
         </w:rPr>
-        <w:t>dolgozok</w:t>
+        <w:t>dolgoz</w:t>
       </w:r>
       <w:r>
         <w:rPr>
           <w:lang w:val="de-DE"/>
         </w:rPr>
+        <w:t>ó</w:t>
+      </w:r>
+      <w:r>
+        <w:rPr>
+          <w:lang w:val="de-DE"/>
+        </w:rPr>
+        <w:t>k</w:t>
+      </w:r>
+      <w:r>
+        <w:rPr>
+          <w:lang w:val="de-DE"/>
+        </w:rPr>
         <w:t xml:space="preserve"> </w:t>
       </w:r>
       <w:r>
@@ -16115,7 +16092,13 @@
         <w:rPr>
           <w:lang w:val="de-DE"/>
         </w:rPr>
-        <w:t>megfelelo</w:t>
+        <w:t>megfelel</w:t>
+      </w:r>
+      <w:r>
+        <w:rPr>
+          <w:lang w:val="de-DE"/>
+        </w:rPr>
+        <w:t>ő</w:t>
       </w:r>
       <w:r>
         <w:rPr>
@@ -16217,7 +16200,19 @@
         <w:rPr>
           <w:lang w:val="en-US"/>
         </w:rPr>
-        <w:t>kommunikal</w:t>
+        <w:t>kommunik</w:t>
+      </w:r>
+      <w:r>
+        <w:rPr>
+          <w:lang w:val="en-US"/>
+        </w:rPr>
+        <w:t>á</w:t>
+      </w:r>
+      <w:r>
+        <w:rPr>
+          <w:lang w:val="en-US"/>
+        </w:rPr>
+        <w:t>l</w:t>
       </w:r>
       <w:r>
         <w:rPr>
@@ -16342,7 +16337,7 @@
           <w:lang w:val="en-US"/>
         </w:rPr>
       </w:pPr>
-      <w:bookmarkStart w:name="_Toc1307255194" w:id="232576326"/>
+      <w:bookmarkStart w:name="_Toc339740516" w:id="1422209974"/>
       <w:r>
         <w:rPr>
           <w:b w:val="1"/>
@@ -16370,7 +16365,7 @@
         </w:rPr>
         <w:t>kapcsolataik</w:t>
       </w:r>
-      <w:bookmarkEnd w:id="232576326"/>
+      <w:bookmarkEnd w:id="1422209974"/>
     </w:p>
     <w:p>
       <w:pPr>
@@ -16693,7 +16688,7 @@
           <w:color w:val="auto"/>
         </w:rPr>
       </w:pPr>
-      <w:bookmarkStart w:name="_Toc228637832" w:id="1673358846"/>
+      <w:bookmarkStart w:name="_Toc831365137" w:id="1111787583"/>
       <w:r>
         <w:rPr>
           <w:b w:val="1"/>
@@ -16724,7 +16719,7 @@
         </w:rPr>
         <w:t>Felhasználó</w:t>
       </w:r>
-      <w:bookmarkEnd w:id="1673358846"/>
+      <w:bookmarkEnd w:id="1111787583"/>
     </w:p>
     <w:p>
       <w:pPr>
@@ -17050,7 +17045,7 @@
           <w:color w:val="auto"/>
         </w:rPr>
       </w:pPr>
-      <w:bookmarkStart w:name="_Toc444072593" w:id="867796495"/>
+      <w:bookmarkStart w:name="_Toc2046587704" w:id="368338465"/>
       <w:r>
         <w:rPr>
           <w:b w:val="1"/>
@@ -17081,7 +17076,7 @@
         </w:rPr>
         <w:t>Állás</w:t>
       </w:r>
-      <w:bookmarkEnd w:id="867796495"/>
+      <w:bookmarkEnd w:id="368338465"/>
     </w:p>
     <w:p>
       <w:pPr>
@@ -17384,7 +17379,7 @@
           <w:color w:val="auto"/>
         </w:rPr>
       </w:pPr>
-      <w:bookmarkStart w:name="_Toc814317313" w:id="1447914000"/>
+      <w:bookmarkStart w:name="_Toc247885320" w:id="125989730"/>
       <w:r>
         <w:rPr>
           <w:b w:val="1"/>
@@ -17415,7 +17410,7 @@
         </w:rPr>
         <w:t>Intézmények</w:t>
       </w:r>
-      <w:bookmarkEnd w:id="1447914000"/>
+      <w:bookmarkEnd w:id="125989730"/>
     </w:p>
     <w:p>
       <w:pPr>
@@ -17540,7 +17535,7 @@
           <w:color w:val="auto"/>
         </w:rPr>
       </w:pPr>
-      <w:bookmarkStart w:name="_Toc602365865" w:id="1416922070"/>
+      <w:bookmarkStart w:name="_Toc1680070776" w:id="1798770998"/>
       <w:r>
         <w:rPr>
           <w:b w:val="1"/>
@@ -17581,7 +17576,7 @@
         </w:rPr>
         <w:t>s</w:t>
       </w:r>
-      <w:bookmarkEnd w:id="1416922070"/>
+      <w:bookmarkEnd w:id="1798770998"/>
     </w:p>
     <w:p>
       <w:pPr>
@@ -17735,7 +17730,7 @@
           <w:color w:val="auto"/>
         </w:rPr>
       </w:pPr>
-      <w:bookmarkStart w:name="_Toc1030515302" w:id="2043452525"/>
+      <w:bookmarkStart w:name="_Toc68774467" w:id="119061021"/>
       <w:r>
         <w:rPr>
           <w:b w:val="1"/>
@@ -17766,7 +17761,7 @@
         </w:rPr>
         <w:t xml:space="preserve"> - Levél</w:t>
       </w:r>
-      <w:bookmarkEnd w:id="2043452525"/>
+      <w:bookmarkEnd w:id="119061021"/>
     </w:p>
     <w:p>
       <w:pPr>
@@ -17864,7 +17859,7 @@
           <w:color w:val="auto"/>
         </w:rPr>
       </w:pPr>
-      <w:bookmarkStart w:name="_Toc216093644" w:id="970928708"/>
+      <w:bookmarkStart w:name="_Toc1667559181" w:id="311655283"/>
       <w:r>
         <w:rPr>
           <w:b w:val="1"/>
@@ -17905,7 +17900,7 @@
         </w:rPr>
         <w:t>Értékelés</w:t>
       </w:r>
-      <w:bookmarkEnd w:id="970928708"/>
+      <w:bookmarkEnd w:id="311655283"/>
     </w:p>
     <w:p>
       <w:pPr>
@@ -18017,7 +18012,7 @@
         </w:rPr>
       </w:pPr>
       <w:bookmarkStart w:name="_Requestek" w:id="1129532337"/>
-      <w:bookmarkStart w:name="_Toc1402099775" w:id="972425827"/>
+      <w:bookmarkStart w:name="_Toc763405064" w:id="1416251409"/>
       <w:r>
         <w:rPr>
           <w:b w:val="1"/>
@@ -18035,7 +18030,7 @@
         <w:t>ek</w:t>
       </w:r>
       <w:bookmarkEnd w:id="1129532337"/>
-      <w:bookmarkEnd w:id="972425827"/>
+      <w:bookmarkEnd w:id="1416251409"/>
     </w:p>
     <w:p>
       <w:pPr>
@@ -18611,7 +18606,7 @@
         <w:rPr/>
         <w:t xml:space="preserve"> kell lennie (</w:t>
       </w:r>
-      <w:hyperlink r:id="R6adf567b5fc84e4a">
+      <w:hyperlink r:id="R3b109bf83d184b4c">
         <w:r>
           <w:rPr>
             <w:rStyle w:val="Hyperlink"/>
@@ -19209,7 +19204,7 @@
           <w:color w:val="auto"/>
         </w:rPr>
       </w:pPr>
-      <w:bookmarkStart w:name="_Toc1155059004" w:id="1532839652"/>
+      <w:bookmarkStart w:name="_Toc719906331" w:id="3221545"/>
       <w:r>
         <w:rPr>
           <w:b w:val="1"/>
@@ -19218,7 +19213,7 @@
         </w:rPr>
         <w:t>Controllerek</w:t>
       </w:r>
-      <w:bookmarkEnd w:id="1532839652"/>
+      <w:bookmarkEnd w:id="3221545"/>
     </w:p>
     <w:p>
       <w:pPr>
@@ -19841,7 +19836,7 @@
           <w:color w:val="auto"/>
         </w:rPr>
       </w:pPr>
-      <w:bookmarkStart w:name="_Toc1061346591" w:id="1894751999"/>
+      <w:bookmarkStart w:name="_Toc1196920276" w:id="599353576"/>
       <w:r>
         <w:rPr>
           <w:b w:val="1"/>
@@ -19858,7 +19853,7 @@
         </w:rPr>
         <w:t>Végpontok</w:t>
       </w:r>
-      <w:bookmarkEnd w:id="1894751999"/>
+      <w:bookmarkEnd w:id="599353576"/>
     </w:p>
     <w:tbl>
       <w:tblPr>
@@ -32467,7 +32462,7 @@
           <w:szCs w:val="32"/>
         </w:rPr>
       </w:pPr>
-      <w:bookmarkStart w:name="_Toc1078647349" w:id="1363570709"/>
+      <w:bookmarkStart w:name="_Toc1787642145" w:id="1113862300"/>
       <w:r>
         <w:rPr>
           <w:color w:val="auto"/>
@@ -32480,7 +32475,7 @@
         </w:rPr>
         <w:t>d</w:t>
       </w:r>
-      <w:bookmarkEnd w:id="1363570709"/>
+      <w:bookmarkEnd w:id="1113862300"/>
     </w:p>
     <w:p>
       <w:pPr>
@@ -32493,7 +32488,7 @@
           <w:color w:val="auto"/>
         </w:rPr>
       </w:pPr>
-      <w:bookmarkStart w:name="_Toc369084647" w:id="1352120972"/>
+      <w:bookmarkStart w:name="_Toc1200159949" w:id="1451005123"/>
       <w:r>
         <w:rPr>
           <w:b w:val="1"/>
@@ -32502,7 +32497,7 @@
         </w:rPr>
         <w:t>Áttekintés</w:t>
       </w:r>
-      <w:bookmarkEnd w:id="1352120972"/>
+      <w:bookmarkEnd w:id="1451005123"/>
     </w:p>
     <w:p>
       <w:pPr>
@@ -33745,7 +33740,7 @@
           <w:color w:val="auto"/>
         </w:rPr>
       </w:pPr>
-      <w:bookmarkStart w:name="_Toc677236350" w:id="300339270"/>
+      <w:bookmarkStart w:name="_Toc1479977945" w:id="1520272549"/>
       <w:r>
         <w:rPr>
           <w:b w:val="1"/>
@@ -33754,7 +33749,7 @@
         </w:rPr>
         <w:t>Routing</w:t>
       </w:r>
-      <w:bookmarkEnd w:id="300339270"/>
+      <w:bookmarkEnd w:id="1520272549"/>
     </w:p>
     <w:p>
       <w:pPr>
@@ -35842,7 +35837,7 @@
           <w:color w:val="auto"/>
         </w:rPr>
       </w:pPr>
-      <w:bookmarkStart w:name="_Toc726857261" w:id="1239787610"/>
+      <w:bookmarkStart w:name="_Toc317763173" w:id="1273474620"/>
       <w:r>
         <w:rPr>
           <w:b w:val="1"/>
@@ -35883,7 +35878,7 @@
         </w:rPr>
         <w:t>nézetek</w:t>
       </w:r>
-      <w:bookmarkEnd w:id="1239787610"/>
+      <w:bookmarkEnd w:id="1273474620"/>
     </w:p>
     <w:p>
       <w:pPr>
@@ -36709,7 +36704,7 @@
           <w:szCs w:val="56"/>
         </w:rPr>
       </w:pPr>
-      <w:bookmarkStart w:name="_Toc1145220048" w:id="1224338514"/>
+      <w:bookmarkStart w:name="_Toc2092056091" w:id="266548158"/>
       <w:r>
         <w:rPr>
           <w:sz w:val="56"/>
@@ -36717,7 +36712,7 @@
         </w:rPr>
         <w:t>Felhasználói dokumentáció</w:t>
       </w:r>
-      <w:bookmarkEnd w:id="1224338514"/>
+      <w:bookmarkEnd w:id="266548158"/>
     </w:p>
     <w:p>
       <w:pPr>
@@ -36726,12 +36721,12 @@
         <w:jc w:val="center"/>
         <w:rPr/>
       </w:pPr>
-      <w:bookmarkStart w:name="_Toc743844793" w:id="191588667"/>
+      <w:bookmarkStart w:name="_Toc80250615" w:id="1265877408"/>
       <w:r>
         <w:rPr/>
         <w:t>Telepítés</w:t>
       </w:r>
-      <w:bookmarkEnd w:id="191588667"/>
+      <w:bookmarkEnd w:id="1265877408"/>
     </w:p>
     <w:p>
       <w:pPr>
@@ -36785,7 +36780,7 @@
         <w:rPr/>
         <w:t xml:space="preserve"> a </w:t>
       </w:r>
-      <w:hyperlink r:id="Rf43b1d5977374ebd">
+      <w:hyperlink r:id="R9038542194f24133">
         <w:r>
           <w:rPr>
             <w:rStyle w:val="Hyperlink"/>
@@ -36841,7 +36836,7 @@
         </w:rPr>
         <w:t xml:space="preserve"> </w:t>
       </w:r>
-      <w:hyperlink r:id="R1ccae377f89d4824">
+      <w:hyperlink r:id="Rf3a35fe3e473494a">
         <w:r>
           <w:rPr>
             <w:rStyle w:val="Hyperlink"/>
@@ -36994,7 +36989,7 @@
           <w:color w:val="auto"/>
         </w:rPr>
       </w:pPr>
-      <w:bookmarkStart w:name="_Toc46708096" w:id="1554329529"/>
+      <w:bookmarkStart w:name="_Toc826346716" w:id="1976438791"/>
       <w:r>
         <w:rPr>
           <w:b w:val="1"/>
@@ -37011,7 +37006,7 @@
         </w:rPr>
         <w:t xml:space="preserve"> szoftverek</w:t>
       </w:r>
-      <w:bookmarkEnd w:id="1554329529"/>
+      <w:bookmarkEnd w:id="1976438791"/>
     </w:p>
     <w:p>
       <w:pPr>
@@ -37023,7 +37018,7 @@
         <w:bidi w:val="0"/>
         <w:rPr/>
       </w:pPr>
-      <w:hyperlink r:id="R49657d8218b04baf">
+      <w:hyperlink r:id="Re57ea68bb74c4b1f">
         <w:r>
           <w:rPr>
             <w:rStyle w:val="Hyperlink"/>
@@ -37042,7 +37037,7 @@
         <w:bidi w:val="0"/>
         <w:rPr/>
       </w:pPr>
-      <w:hyperlink r:id="R98ffe32d045040d3">
+      <w:hyperlink r:id="Rc4a44a82176f4b8d">
         <w:r>
           <w:rPr>
             <w:rStyle w:val="Hyperlink"/>
@@ -37061,7 +37056,7 @@
         <w:bidi w:val="0"/>
         <w:rPr/>
       </w:pPr>
-      <w:hyperlink r:id="R4c77c9ef1cb84f4a">
+      <w:hyperlink r:id="R533a1c67c7ea4c27">
         <w:r>
           <w:rPr>
             <w:rStyle w:val="Hyperlink"/>
@@ -37080,7 +37075,7 @@
         <w:bidi w:val="0"/>
         <w:rPr/>
       </w:pPr>
-      <w:hyperlink r:id="R7c0477b9b5c84316">
+      <w:hyperlink r:id="R7b6e6ca4f9fd43cb">
         <w:r>
           <w:rPr>
             <w:rStyle w:val="Hyperlink"/>
@@ -37119,7 +37114,7 @@
           <w:color w:val="auto"/>
         </w:rPr>
       </w:pPr>
-      <w:bookmarkStart w:name="_Toc493597551" w:id="470576276"/>
+      <w:bookmarkStart w:name="_Toc860562680" w:id="950875896"/>
       <w:r>
         <w:rPr>
           <w:b w:val="1"/>
@@ -37144,7 +37139,7 @@
         </w:rPr>
         <w:t>zis</w:t>
       </w:r>
-      <w:bookmarkEnd w:id="470576276"/>
+      <w:bookmarkEnd w:id="950875896"/>
     </w:p>
     <w:p>
       <w:pPr>
@@ -37218,7 +37213,7 @@
           <w:color w:val="auto"/>
         </w:rPr>
       </w:pPr>
-      <w:bookmarkStart w:name="_Toc288512761" w:id="754944754"/>
+      <w:bookmarkStart w:name="_Toc160120663" w:id="1288892436"/>
       <w:r>
         <w:rPr>
           <w:b w:val="1"/>
@@ -37227,7 +37222,7 @@
         </w:rPr>
         <w:t>Backend</w:t>
       </w:r>
-      <w:bookmarkEnd w:id="754944754"/>
+      <w:bookmarkEnd w:id="1288892436"/>
     </w:p>
     <w:p>
       <w:pPr>
@@ -38040,7 +38035,7 @@
           <w:color w:val="auto"/>
         </w:rPr>
       </w:pPr>
-      <w:bookmarkStart w:name="_Toc530404006" w:id="2009402004"/>
+      <w:bookmarkStart w:name="_Toc881790290" w:id="2016529999"/>
       <w:r>
         <w:rPr>
           <w:b w:val="1"/>
@@ -38049,7 +38044,7 @@
         </w:rPr>
         <w:t>Frontend</w:t>
       </w:r>
-      <w:bookmarkEnd w:id="2009402004"/>
+      <w:bookmarkEnd w:id="2016529999"/>
     </w:p>
     <w:p>
       <w:pPr>
@@ -38187,12 +38182,12 @@
           <w:color w:val="auto"/>
         </w:rPr>
       </w:pPr>
-      <w:bookmarkStart w:name="_Toc608246457" w:id="2014230482"/>
+      <w:bookmarkStart w:name="_Toc1833887804" w:id="735031685"/>
       <w:r>
         <w:rPr/>
         <w:t>Regisztráció és bejelentkezés</w:t>
       </w:r>
-      <w:bookmarkEnd w:id="2014230482"/>
+      <w:bookmarkEnd w:id="735031685"/>
     </w:p>
     <w:p>
       <w:pPr>
@@ -38266,7 +38261,7 @@
       </w:pPr>
       <w:r>
         <w:drawing>
-          <wp:inline wp14:editId="394FD8FC" wp14:anchorId="751C59EE">
+          <wp:inline wp14:editId="1D07D650" wp14:anchorId="751C59EE">
             <wp:extent cx="6124575" cy="3448050"/>
             <wp:effectExtent l="0" t="0" r="0" b="0"/>
             <wp:docPr id="1591578298" name="drawing"/>
@@ -38434,7 +38429,7 @@
       </w:pPr>
       <w:r>
         <w:drawing>
-          <wp:inline wp14:editId="59740745" wp14:anchorId="63A3F7B4">
+          <wp:inline wp14:editId="75889192" wp14:anchorId="63A3F7B4">
             <wp:extent cx="6124575" cy="3448050"/>
             <wp:effectExtent l="0" t="0" r="0" b="0"/>
             <wp:docPr id="110587260" name="drawing"/>
@@ -38482,12 +38477,12 @@
         <w:bidi w:val="0"/>
         <w:rPr/>
       </w:pPr>
-      <w:bookmarkStart w:name="_Toc649437938" w:id="394629983"/>
+      <w:bookmarkStart w:name="_Toc1723847590" w:id="2028715385"/>
       <w:r>
         <w:rPr/>
         <w:t>Új állásajánlat feltöltése és szerkesztése</w:t>
       </w:r>
-      <w:bookmarkEnd w:id="394629983"/>
+      <w:bookmarkEnd w:id="2028715385"/>
     </w:p>
     <w:p>
       <w:pPr>
@@ -38496,7 +38491,7 @@
       </w:pPr>
       <w:r>
         <w:rPr/>
-        <w:t>Miutan</w:t>
+        <w:t>Miután</w:t>
       </w:r>
       <w:r>
         <w:rPr/>
@@ -38504,7 +38499,15 @@
       </w:r>
       <w:r>
         <w:rPr/>
-        <w:t>bejelentkeztunk</w:t>
+        <w:t>bejelentkezt</w:t>
+      </w:r>
+      <w:r>
+        <w:rPr/>
+        <w:t>ü</w:t>
+      </w:r>
+      <w:r>
+        <w:rPr/>
+        <w:t>nk</w:t>
       </w:r>
       <w:r>
         <w:rPr/>
@@ -38512,7 +38515,7 @@
       </w:r>
       <w:r>
         <w:rPr/>
-        <w:t>lehetosegunk</w:t>
+        <w:t>lehetőségünk</w:t>
       </w:r>
       <w:r>
         <w:rPr/>
@@ -38520,7 +38523,7 @@
       </w:r>
       <w:r>
         <w:rPr/>
-        <w:t>uj</w:t>
+        <w:t>új</w:t>
       </w:r>
       <w:r>
         <w:rPr/>
@@ -38528,7 +38531,31 @@
       </w:r>
       <w:r>
         <w:rPr/>
-        <w:t>allastajanlast</w:t>
+        <w:t>all</w:t>
+      </w:r>
+      <w:r>
+        <w:rPr/>
+        <w:t>á</w:t>
+      </w:r>
+      <w:r>
+        <w:rPr/>
+        <w:t>saj</w:t>
+      </w:r>
+      <w:r>
+        <w:rPr/>
+        <w:t>á</w:t>
+      </w:r>
+      <w:r>
+        <w:rPr/>
+        <w:t>nl</w:t>
+      </w:r>
+      <w:r>
+        <w:rPr/>
+        <w:t>á</w:t>
+      </w:r>
+      <w:r>
+        <w:rPr/>
+        <w:t>st</w:t>
       </w:r>
       <w:r>
         <w:rPr/>
@@ -38536,7 +38563,7 @@
       </w:r>
       <w:r>
         <w:rPr/>
-        <w:t>letrehozni</w:t>
+        <w:t>létrehozni</w:t>
       </w:r>
       <w:r>
         <w:rPr/>
@@ -38544,7 +38571,7 @@
       </w:r>
       <w:r>
         <w:rPr/>
-        <w:t>navigacios</w:t>
+        <w:t>navigációs</w:t>
       </w:r>
       <w:r>
         <w:rPr/>
@@ -38552,7 +38579,7 @@
       </w:r>
       <w:r>
         <w:rPr/>
-        <w:t>elerheto</w:t>
+        <w:t>elérhető</w:t>
       </w:r>
       <w:r>
         <w:rPr/>
@@ -38560,7 +38587,7 @@
       </w:r>
       <w:r>
         <w:rPr/>
-        <w:t>regisztracio</w:t>
+        <w:t>regisztráció</w:t>
       </w:r>
       <w:r>
         <w:rPr/>
@@ -38568,7 +38595,15 @@
       </w:r>
       <w:r>
         <w:rPr/>
-        <w:t>bejelentkezes</w:t>
+        <w:t>bejelentkez</w:t>
+      </w:r>
+      <w:r>
+        <w:rPr/>
+        <w:t>é</w:t>
+      </w:r>
+      <w:r>
+        <w:rPr/>
+        <w:t>s</w:t>
       </w:r>
       <w:r>
         <w:rPr/>
@@ -38581,7 +38616,7 @@
       </w:pPr>
       <w:r>
         <w:drawing>
-          <wp:inline wp14:editId="294CB33E" wp14:anchorId="2B059988">
+          <wp:inline wp14:editId="470F363A" wp14:anchorId="2B059988">
             <wp:extent cx="6124575" cy="3448050"/>
             <wp:effectExtent l="0" t="0" r="0" b="0"/>
             <wp:docPr id="779278686" name="drawing"/>
@@ -38829,7 +38864,7 @@
       </w:pPr>
       <w:r>
         <w:drawing>
-          <wp:inline wp14:editId="02C74A0A" wp14:anchorId="5C18C527">
+          <wp:inline wp14:editId="5DB50B62" wp14:anchorId="5C18C527">
             <wp:extent cx="5257800" cy="2960068"/>
             <wp:effectExtent l="0" t="0" r="0" b="0"/>
             <wp:docPr id="1977319881" name="drawing"/>
@@ -39013,7 +39048,7 @@
       </w:r>
       <w:r>
         <w:rPr/>
-        <w:t>. E</w:t>
+        <w:t>, e</w:t>
       </w:r>
       <w:r>
         <w:rPr/>
@@ -39030,7 +39065,7 @@
         <w:bidi w:val="0"/>
         <w:rPr/>
       </w:pPr>
-      <w:bookmarkStart w:name="_Toc1733677637" w:id="572999594"/>
+      <w:bookmarkStart w:name="_Toc1690277688" w:id="932496475"/>
       <w:r>
         <w:rPr/>
         <w:t xml:space="preserve">Állás </w:t>
@@ -39039,7 +39074,7 @@
         <w:rPr/>
         <w:t>felület</w:t>
       </w:r>
-      <w:bookmarkEnd w:id="572999594"/>
+      <w:bookmarkEnd w:id="932496475"/>
     </w:p>
     <w:p>
       <w:pPr>
@@ -39052,7 +39087,7 @@
       </w:r>
       <w:r>
         <w:rPr/>
-        <w:t>allas</w:t>
+        <w:t>állás</w:t>
       </w:r>
       <w:r>
         <w:rPr/>
@@ -39060,7 +39095,7 @@
       </w:r>
       <w:r>
         <w:rPr/>
-        <w:t>felulet</w:t>
+        <w:t>felület</w:t>
       </w:r>
       <w:r>
         <w:rPr/>
@@ -39068,11 +39103,19 @@
       </w:r>
       <w:r>
         <w:rPr/>
-        <w:t>ket</w:t>
-      </w:r>
-      <w:r>
-        <w:rPr/>
-        <w:t xml:space="preserve"> fele</w:t>
+        <w:t>két</w:t>
+      </w:r>
+      <w:r>
+        <w:rPr/>
+        <w:t xml:space="preserve"> f</w:t>
+      </w:r>
+      <w:r>
+        <w:rPr/>
+        <w:t>é</w:t>
+      </w:r>
+      <w:r>
+        <w:rPr/>
+        <w:t>le</w:t>
       </w:r>
       <w:r>
         <w:rPr/>
@@ -39080,7 +39123,7 @@
       </w:r>
       <w:r>
         <w:rPr/>
-        <w:t>attol</w:t>
+        <w:t>attól</w:t>
       </w:r>
       <w:r>
         <w:rPr/>
@@ -39088,7 +39131,7 @@
       </w:r>
       <w:r>
         <w:rPr/>
-        <w:t>fugg</w:t>
+        <w:t>függ</w:t>
       </w:r>
       <w:r>
         <w:rPr/>
@@ -39096,7 +39139,7 @@
       </w:r>
       <w:r>
         <w:rPr/>
-        <w:t>allas</w:t>
+        <w:t>állás</w:t>
       </w:r>
       <w:r>
         <w:rPr/>
@@ -39104,7 +39147,7 @@
       </w:r>
       <w:r>
         <w:rPr/>
-        <w:t>feltoltoje</w:t>
+        <w:t>feltöltője</w:t>
       </w:r>
       <w:r>
         <w:rPr/>
@@ -39112,7 +39155,7 @@
       </w:r>
       <w:r>
         <w:rPr/>
-        <w:t>nezi</w:t>
+        <w:t>nézi</w:t>
       </w:r>
       <w:r>
         <w:rPr/>
@@ -39125,7 +39168,7 @@
       </w:pPr>
       <w:r>
         <w:drawing>
-          <wp:inline wp14:editId="047A99D6" wp14:anchorId="58564D26">
+          <wp:inline wp14:editId="377B53EC" wp14:anchorId="58564D26">
             <wp:extent cx="6124575" cy="3448050"/>
             <wp:effectExtent l="0" t="0" r="0" b="0"/>
             <wp:docPr id="505379283" name="drawing"/>
@@ -39181,7 +39224,7 @@
       </w:pPr>
       <w:r>
         <w:drawing>
-          <wp:inline wp14:editId="0C8A278D" wp14:anchorId="647DC8E1">
+          <wp:inline wp14:editId="2F913B76" wp14:anchorId="647DC8E1">
             <wp:extent cx="6124575" cy="3448050"/>
             <wp:effectExtent l="0" t="0" r="0" b="0"/>
             <wp:docPr id="261860662" name="drawing"/>
@@ -39421,7 +39464,7 @@
         <w:bidi w:val="0"/>
         <w:rPr/>
       </w:pPr>
-      <w:bookmarkStart w:name="_Toc337427291" w:id="468361408"/>
+      <w:bookmarkStart w:name="_Toc2110785439" w:id="1958641107"/>
       <w:r>
         <w:rPr/>
         <w:t xml:space="preserve">Levelek </w:t>
@@ -39430,7 +39473,7 @@
         <w:rPr/>
         <w:t>felület</w:t>
       </w:r>
-      <w:bookmarkEnd w:id="468361408"/>
+      <w:bookmarkEnd w:id="1958641107"/>
     </w:p>
     <w:p>
       <w:pPr>
@@ -39496,7 +39539,7 @@
       </w:pPr>
       <w:r>
         <w:drawing>
-          <wp:inline wp14:editId="026C3394" wp14:anchorId="21E63B9F">
+          <wp:inline wp14:editId="7C796BCD" wp14:anchorId="21E63B9F">
             <wp:extent cx="6124575" cy="3448050"/>
             <wp:effectExtent l="0" t="0" r="0" b="0"/>
             <wp:docPr id="13254848" name="drawing"/>
@@ -39593,7 +39636,23 @@
       </w:pPr>
       <w:r>
         <w:rPr/>
-        <w:t>Kertészin</w:t>
+        <w:t>Ker</w:t>
+      </w:r>
+      <w:r>
+        <w:rPr/>
+        <w:t>e</w:t>
+      </w:r>
+      <w:r>
+        <w:rPr/>
+        <w:t>tsz</w:t>
+      </w:r>
+      <w:r>
+        <w:rPr/>
+        <w:t>í</w:t>
+      </w:r>
+      <w:r>
+        <w:rPr/>
+        <w:t>n</w:t>
       </w:r>
     </w:p>
     <w:p>
@@ -39841,7 +39900,7 @@
         <w:bidi w:val="0"/>
         <w:rPr/>
       </w:pPr>
-      <w:bookmarkStart w:name="_Toc2053328625" w:id="1042672079"/>
+      <w:bookmarkStart w:name="_Toc1201948504" w:id="148965328"/>
       <w:r>
         <w:rPr/>
         <w:t xml:space="preserve">Profil </w:t>
@@ -39850,7 +39909,7 @@
         <w:rPr/>
         <w:t>felület</w:t>
       </w:r>
-      <w:bookmarkEnd w:id="1042672079"/>
+      <w:bookmarkEnd w:id="148965328"/>
     </w:p>
     <w:p>
       <w:pPr>
@@ -39924,7 +39983,7 @@
       </w:pPr>
       <w:r>
         <w:drawing>
-          <wp:inline wp14:editId="295C666D" wp14:anchorId="10C24F41">
+          <wp:inline wp14:editId="1C7A0210" wp14:anchorId="10C24F41">
             <wp:extent cx="6124575" cy="3448050"/>
             <wp:effectExtent l="0" t="0" r="0" b="0"/>
             <wp:docPr id="310248813" name="drawing"/>
@@ -40036,7 +40095,7 @@
       </w:pPr>
       <w:r>
         <w:drawing>
-          <wp:inline wp14:editId="3DB690FC" wp14:anchorId="18128EA2">
+          <wp:inline wp14:editId="25D24493" wp14:anchorId="18128EA2">
             <wp:extent cx="6124575" cy="3448050"/>
             <wp:effectExtent l="0" t="0" r="0" b="0"/>
             <wp:docPr id="107390649" name="drawing"/>
@@ -40084,7 +40143,7 @@
         <w:bidi w:val="0"/>
         <w:rPr/>
       </w:pPr>
-      <w:bookmarkStart w:name="_Toc1266664635" w:id="124828565"/>
+      <w:bookmarkStart w:name="_Toc880056022" w:id="75601725"/>
       <w:r>
         <w:rPr/>
         <w:t>Admin</w:t>
@@ -40093,7 +40152,7 @@
         <w:rPr/>
         <w:t xml:space="preserve"> felület</w:t>
       </w:r>
-      <w:bookmarkEnd w:id="124828565"/>
+      <w:bookmarkEnd w:id="75601725"/>
     </w:p>
     <w:p>
       <w:pPr>
@@ -40289,7 +40348,7 @@
         <w:bidi w:val="0"/>
         <w:rPr/>
       </w:pPr>
-      <w:hyperlink r:id="Ree057800562f45b9">
+      <w:hyperlink r:id="R5fbdaad09fe04510">
         <w:r>
           <w:rPr>
             <w:rStyle w:val="Hyperlink"/>
@@ -40312,7 +40371,7 @@
         <w:bidi w:val="0"/>
         <w:rPr/>
       </w:pPr>
-      <w:hyperlink r:id="R75284c43428144a6">
+      <w:hyperlink r:id="Ra9fdf566a01f43ce">
         <w:r>
           <w:rPr>
             <w:rStyle w:val="Hyperlink"/>
@@ -40417,7 +40476,7 @@
       </w:pPr>
       <w:r>
         <w:drawing>
-          <wp:inline wp14:editId="1BBAE46D" wp14:anchorId="01D097F8">
+          <wp:inline wp14:editId="6FE61415" wp14:anchorId="01D097F8">
             <wp:extent cx="6124575" cy="3448050"/>
             <wp:effectExtent l="0" t="0" r="0" b="0"/>
             <wp:docPr id="10194055" name="drawing"/>
@@ -40599,7 +40658,7 @@
         <w:bidi w:val="0"/>
         <w:rPr/>
       </w:pPr>
-      <w:bookmarkStart w:name="_Toc1338234526" w:id="1581113741"/>
+      <w:bookmarkStart w:name="_Toc1856832043" w:id="1221147798"/>
       <w:r>
         <w:rPr/>
         <w:t xml:space="preserve">Hiba </w:t>
@@ -40608,7 +40667,7 @@
         <w:rPr/>
         <w:t>felület</w:t>
       </w:r>
-      <w:bookmarkEnd w:id="1581113741"/>
+      <w:bookmarkEnd w:id="1221147798"/>
     </w:p>
     <w:p>
       <w:pPr>
@@ -40696,7 +40755,7 @@
       </w:pPr>
       <w:r>
         <w:drawing>
-          <wp:inline wp14:editId="24F666C0" wp14:anchorId="700F6258">
+          <wp:inline wp14:editId="46351A81" wp14:anchorId="700F6258">
             <wp:extent cx="6124575" cy="3448050"/>
             <wp:effectExtent l="0" t="0" r="0" b="0"/>
             <wp:docPr id="223293626" name="drawing"/>
@@ -40768,7 +40827,7 @@
       </w:pPr>
       <w:r>
         <w:drawing>
-          <wp:inline wp14:editId="45036315" wp14:anchorId="2B63E2F4">
+          <wp:inline wp14:editId="2339275A" wp14:anchorId="2B63E2F4">
             <wp:extent cx="6124575" cy="3448050"/>
             <wp:effectExtent l="0" t="0" r="0" b="0"/>
             <wp:docPr id="585909033" name="drawing"/>
@@ -40875,7 +40934,7 @@
           <w:szCs w:val="56"/>
         </w:rPr>
       </w:pPr>
-      <w:bookmarkStart w:name="_Toc2136768629" w:id="1438821151"/>
+      <w:bookmarkStart w:name="_Toc1962092277" w:id="1501380606"/>
       <w:r>
         <w:rPr>
           <w:sz w:val="56"/>
@@ -40897,7 +40956,7 @@
         </w:rPr>
         <w:t>?</w:t>
       </w:r>
-      <w:bookmarkEnd w:id="1438821151"/>
+      <w:bookmarkEnd w:id="1501380606"/>
     </w:p>
     <w:p>
       <w:pPr>
@@ -40906,7 +40965,7 @@
         <w:jc w:val="center"/>
         <w:rPr/>
       </w:pPr>
-      <w:bookmarkStart w:name="_Toc431797046" w:id="1950521756"/>
+      <w:bookmarkStart w:name="_Toc1471003770" w:id="2111909679"/>
       <w:r>
         <w:rPr/>
         <w:t xml:space="preserve">Amit nem </w:t>
@@ -40919,7 +40978,7 @@
         <w:rPr/>
         <w:t xml:space="preserve"> elkészítenünk</w:t>
       </w:r>
-      <w:bookmarkEnd w:id="1950521756"/>
+      <w:bookmarkEnd w:id="2111909679"/>
     </w:p>
     <w:p>
       <w:pPr>
@@ -40929,7 +40988,7 @@
           <w:color w:val="auto"/>
         </w:rPr>
       </w:pPr>
-      <w:bookmarkStart w:name="_Toc1693535390" w:id="1626836081"/>
+      <w:bookmarkStart w:name="_Toc1793067883" w:id="98683218"/>
       <w:r>
         <w:rPr>
           <w:color w:val="auto"/>
@@ -40942,7 +41001,7 @@
         </w:rPr>
         <w:t>implementálása</w:t>
       </w:r>
-      <w:bookmarkEnd w:id="1626836081"/>
+      <w:bookmarkEnd w:id="98683218"/>
     </w:p>
     <w:p>
       <w:pPr>
@@ -41010,14 +41069,14 @@
           <w:color w:val="auto"/>
         </w:rPr>
       </w:pPr>
-      <w:bookmarkStart w:name="_Toc1798565071" w:id="843737868"/>
+      <w:bookmarkStart w:name="_Toc1606070839" w:id="786739488"/>
       <w:r>
         <w:rPr>
           <w:color w:val="auto"/>
         </w:rPr>
         <w:t>Felhasználóbarát URL</w:t>
       </w:r>
-      <w:bookmarkEnd w:id="843737868"/>
+      <w:bookmarkEnd w:id="786739488"/>
     </w:p>
     <w:p>
       <w:pPr>
@@ -41093,7 +41152,7 @@
           <w:color w:val="auto"/>
         </w:rPr>
       </w:pPr>
-      <w:bookmarkStart w:name="_Toc1847424445" w:id="839914577"/>
+      <w:bookmarkStart w:name="_Toc1942567202" w:id="1395543347"/>
       <w:r>
         <w:rPr>
           <w:color w:val="auto"/>
@@ -41118,7 +41177,7 @@
         </w:rPr>
         <w:t>lehetőségek</w:t>
       </w:r>
-      <w:bookmarkEnd w:id="839914577"/>
+      <w:bookmarkEnd w:id="1395543347"/>
     </w:p>
     <w:p>
       <w:pPr>
@@ -41203,7 +41262,11 @@
       </w:r>
       <w:r>
         <w:rPr/>
-        <w:t>előléptetése adminn</w:t>
+        <w:t xml:space="preserve">előléptetése </w:t>
+      </w:r>
+      <w:r>
+        <w:rPr/>
+        <w:t>admin</w:t>
       </w:r>
       <w:r>
         <w:rPr/>
@@ -41220,7 +41283,7 @@
           <w:color w:val="auto"/>
         </w:rPr>
       </w:pPr>
-      <w:bookmarkStart w:name="_Toc1647930453" w:id="1201114632"/>
+      <w:bookmarkStart w:name="_Toc1959647598" w:id="1273852600"/>
       <w:r>
         <w:rPr>
           <w:b w:val="0"/>
@@ -41229,7 +41292,7 @@
         </w:rPr>
         <w:t>Törlés, szerkesztés frontend oldalon</w:t>
       </w:r>
-      <w:bookmarkEnd w:id="1201114632"/>
+      <w:bookmarkEnd w:id="1273852600"/>
     </w:p>
     <w:p>
       <w:pPr>
@@ -41452,7 +41515,7 @@
         <w:jc w:val="center"/>
         <w:rPr/>
       </w:pPr>
-      <w:bookmarkStart w:name="_Toc732255676" w:id="1726482580"/>
+      <w:bookmarkStart w:name="_Toc248936108" w:id="662274767"/>
       <w:r>
         <w:rPr/>
         <w:t xml:space="preserve">Amivel </w:t>
@@ -41465,7 +41528,7 @@
         <w:rPr/>
         <w:t xml:space="preserve"> lehetne</w:t>
       </w:r>
-      <w:bookmarkEnd w:id="1726482580"/>
+      <w:bookmarkEnd w:id="662274767"/>
     </w:p>
     <w:p>
       <w:pPr>
@@ -41475,7 +41538,7 @@
           <w:color w:val="auto"/>
         </w:rPr>
       </w:pPr>
-      <w:bookmarkStart w:name="_Toc1554210241" w:id="539168537"/>
+      <w:bookmarkStart w:name="_Toc899592505" w:id="545384597"/>
       <w:r>
         <w:rPr>
           <w:color w:val="auto"/>
@@ -41506,7 +41569,7 @@
         </w:rPr>
         <w:t>opció</w:t>
       </w:r>
-      <w:bookmarkEnd w:id="539168537"/>
+      <w:bookmarkEnd w:id="545384597"/>
     </w:p>
     <w:p>
       <w:pPr>
@@ -41662,7 +41725,7 @@
           <w:color w:val="auto"/>
         </w:rPr>
       </w:pPr>
-      <w:bookmarkStart w:name="_Toc580448976" w:id="757378650"/>
+      <w:bookmarkStart w:name="_Toc264973866" w:id="95294021"/>
       <w:r>
         <w:rPr>
           <w:color w:val="auto"/>
@@ -41681,7 +41744,7 @@
         </w:rPr>
         <w:t>értékelése</w:t>
       </w:r>
-      <w:bookmarkEnd w:id="757378650"/>
+      <w:bookmarkEnd w:id="95294021"/>
     </w:p>
     <w:p>
       <w:pPr>
@@ -41813,7 +41876,7 @@
           <w:color w:val="auto"/>
         </w:rPr>
       </w:pPr>
-      <w:bookmarkStart w:name="_Toc47333483" w:id="522241013"/>
+      <w:bookmarkStart w:name="_Toc1490603036" w:id="1962147151"/>
       <w:r>
         <w:rPr>
           <w:color w:val="auto"/>
@@ -41826,7 +41889,7 @@
         </w:rPr>
         <w:t xml:space="preserve"> beállítása</w:t>
       </w:r>
-      <w:bookmarkEnd w:id="522241013"/>
+      <w:bookmarkEnd w:id="1962147151"/>
     </w:p>
     <w:p>
       <w:pPr>
@@ -41930,7 +41993,7 @@
           <w:color w:val="auto"/>
         </w:rPr>
       </w:pPr>
-      <w:bookmarkStart w:name="_Toc1721852670" w:id="1078853683"/>
+      <w:bookmarkStart w:name="_Toc171624489" w:id="841467731"/>
       <w:r>
         <w:rPr>
           <w:color w:val="auto"/>
@@ -41943,7 +42006,7 @@
         </w:rPr>
         <w:t>lehetőség</w:t>
       </w:r>
-      <w:bookmarkEnd w:id="1078853683"/>
+      <w:bookmarkEnd w:id="841467731"/>
     </w:p>
     <w:p>
       <w:pPr>
@@ -42035,14 +42098,14 @@
           <w:color w:val="auto"/>
         </w:rPr>
       </w:pPr>
-      <w:bookmarkStart w:name="_Toc1529631081" w:id="1153078952"/>
+      <w:bookmarkStart w:name="_Toc1932030674" w:id="1862700632"/>
       <w:r>
         <w:rPr>
           <w:color w:val="auto"/>
         </w:rPr>
         <w:t>Követés / “Ismerősnek jelölés” rendszer</w:t>
       </w:r>
-      <w:bookmarkEnd w:id="1153078952"/>
+      <w:bookmarkEnd w:id="1862700632"/>
     </w:p>
     <w:p>
       <w:pPr>
@@ -47612,7 +47675,7 @@
     <w:unhideWhenUsed/>
     <w:link w:val="Heading4Char"/>
     <w:qFormat/>
-    <w:rsid w:val="7E93FF9E"/>
+    <w:rsid w:val="6504227B"/>
     <w:rPr>
       <w:rFonts w:eastAsia="DejaVu Sans" w:cs="DejaVu Sans" w:eastAsiaTheme="majorEastAsia" w:cstheme="majorBidi"/>
       <w:i w:val="1"/>
@@ -47631,7 +47694,7 @@
     <w:name w:val="Heading 4 Char"/>
     <w:basedOn w:val="DefaultParagraphFont"/>
     <w:link w:val="Heading4"/>
-    <w:rsid w:val="7E93FF9E"/>
+    <w:rsid w:val="6504227B"/>
     <w:rPr>
       <w:rFonts w:eastAsia="DejaVu Sans" w:cs="DejaVu Sans" w:eastAsiaTheme="majorEastAsia" w:cstheme="majorBidi"/>
       <w:i w:val="1"/>
@@ -47645,7 +47708,7 @@
     <w:basedOn w:val="Normal"/>
     <w:next w:val="Normal"/>
     <w:unhideWhenUsed/>
-    <w:rsid w:val="7E93FF9E"/>
+    <w:rsid w:val="6504227B"/>
     <w:pPr>
       <w:spacing w:after="100"/>
       <w:ind w:left="660"/>

</xml_diff>

<commit_message>
slight fixes with typography
</commit_message>
<xml_diff>
--- a/docs/Dokumentacio.docx
+++ b/docs/Dokumentacio.docx
@@ -4469,7 +4469,7 @@
         </w:rPr>
         <w:t xml:space="preserve"> - </w:t>
       </w:r>
-      <w:hyperlink r:id="R247d762b5f4d4603">
+      <w:hyperlink r:id="R05cc8853a64f4425">
         <w:r>
           <w:rPr>
             <w:rStyle w:val="Hyperlink"/>
@@ -4560,13 +4560,31 @@
         <w:rPr>
           <w:lang w:val="en-US"/>
         </w:rPr>
+        <w:t xml:space="preserve">, </w:t>
+      </w:r>
+      <w:r>
+        <w:rPr>
+          <w:lang w:val="en-US"/>
+        </w:rPr>
+        <w:t>Modelek</w:t>
+      </w:r>
+      <w:r>
+        <w:rPr>
+          <w:lang w:val="en-US"/>
+        </w:rPr>
+        <w:t>, Resource-ok</w:t>
+      </w:r>
+      <w:r>
+        <w:rPr>
+          <w:lang w:val="en-US"/>
+        </w:rPr>
         <w:t xml:space="preserve"> </w:t>
       </w:r>
       <w:r>
         <w:rPr>
           <w:lang w:val="en-US"/>
         </w:rPr>
-        <w:t>alap</w:t>
+        <w:t>kezdetleges</w:t>
       </w:r>
       <w:r>
         <w:rPr>
@@ -4591,6 +4609,24 @@
           <w:lang w:val="en-US"/>
         </w:rPr>
         <w:t>sa</w:t>
+      </w:r>
+    </w:p>
+    <w:p>
+      <w:pPr>
+        <w:pStyle w:val="BodyText"/>
+        <w:numPr>
+          <w:ilvl w:val="1"/>
+          <w:numId w:val="46"/>
+        </w:numPr>
+        <w:rPr>
+          <w:lang w:val="en-US"/>
+        </w:rPr>
+      </w:pPr>
+      <w:r>
+        <w:rPr>
+          <w:lang w:val="en-US"/>
+        </w:rPr>
+        <w:t>Frontend</w:t>
       </w:r>
     </w:p>
     <w:p>
@@ -4608,7 +4644,19 @@
         <w:rPr>
           <w:lang w:val="en-US"/>
         </w:rPr>
-        <w:t>Modelek</w:t>
+        <w:t>Diz</w:t>
+      </w:r>
+      <w:r>
+        <w:rPr>
+          <w:lang w:val="en-US"/>
+        </w:rPr>
+        <w:t>á</w:t>
+      </w:r>
+      <w:r>
+        <w:rPr>
+          <w:lang w:val="en-US"/>
+        </w:rPr>
+        <w:t>jn</w:t>
       </w:r>
       <w:r>
         <w:rPr>
@@ -4620,43 +4668,19 @@
         <w:rPr>
           <w:lang w:val="en-US"/>
         </w:rPr>
-        <w:t>alap</w:t>
-      </w:r>
-      <w:r>
-        <w:rPr>
-          <w:lang w:val="en-US"/>
-        </w:rPr>
-        <w:t xml:space="preserve"> kidolgoz</w:t>
-      </w:r>
-      <w:r>
-        <w:rPr>
-          <w:lang w:val="en-US"/>
-        </w:rPr>
-        <w:t>á</w:t>
-      </w:r>
-      <w:r>
-        <w:rPr>
-          <w:lang w:val="en-US"/>
-        </w:rPr>
-        <w:t>sa</w:t>
-      </w:r>
-    </w:p>
-    <w:p>
-      <w:pPr>
-        <w:pStyle w:val="BodyText"/>
-        <w:numPr>
-          <w:ilvl w:val="2"/>
-          <w:numId w:val="46"/>
-        </w:numPr>
-        <w:rPr>
-          <w:lang w:val="en-US"/>
-        </w:rPr>
-      </w:pPr>
-      <w:r>
-        <w:rPr>
-          <w:lang w:val="en-US"/>
-        </w:rPr>
-        <w:t>Requestek</w:t>
+        <w:t>megtervez</w:t>
+      </w:r>
+      <w:r>
+        <w:rPr>
+          <w:lang w:val="en-US"/>
+        </w:rPr>
+        <w:t>é</w:t>
+      </w:r>
+      <w:r>
+        <w:rPr>
+          <w:lang w:val="en-US"/>
+        </w:rPr>
+        <w:t>se</w:t>
       </w:r>
       <w:r>
         <w:rPr>
@@ -4668,169 +4692,13 @@
         <w:rPr>
           <w:lang w:val="en-US"/>
         </w:rPr>
-        <w:t>alap</w:t>
-      </w:r>
-      <w:r>
-        <w:rPr>
-          <w:lang w:val="en-US"/>
-        </w:rPr>
-        <w:t xml:space="preserve"> </w:t>
-      </w:r>
-      <w:r>
-        <w:rPr>
-          <w:lang w:val="en-US"/>
-        </w:rPr>
-        <w:t>kidolgoz</w:t>
-      </w:r>
-      <w:r>
-        <w:rPr>
-          <w:lang w:val="en-US"/>
-        </w:rPr>
-        <w:t>á</w:t>
-      </w:r>
-      <w:r>
-        <w:rPr>
-          <w:lang w:val="en-US"/>
-        </w:rPr>
-        <w:t>sa</w:t>
-      </w:r>
-    </w:p>
-    <w:p>
-      <w:pPr>
-        <w:pStyle w:val="BodyText"/>
-        <w:numPr>
-          <w:ilvl w:val="2"/>
-          <w:numId w:val="46"/>
-        </w:numPr>
-        <w:rPr>
-          <w:lang w:val="en-US"/>
-        </w:rPr>
-      </w:pPr>
-      <w:r>
-        <w:rPr>
-          <w:lang w:val="en-US"/>
-        </w:rPr>
-        <w:t>Resour</w:t>
-      </w:r>
-      <w:r>
-        <w:rPr>
-          <w:lang w:val="en-US"/>
-        </w:rPr>
-        <w:t>c</w:t>
-      </w:r>
-      <w:r>
-        <w:rPr>
-          <w:lang w:val="en-US"/>
-        </w:rPr>
-        <w:t>e</w:t>
-      </w:r>
-      <w:r>
-        <w:rPr>
-          <w:lang w:val="en-US"/>
-        </w:rPr>
-        <w:t>-</w:t>
-      </w:r>
-      <w:r>
-        <w:rPr>
-          <w:lang w:val="en-US"/>
-        </w:rPr>
-        <w:t xml:space="preserve">ok </w:t>
-      </w:r>
-      <w:r>
-        <w:rPr>
-          <w:lang w:val="en-US"/>
-        </w:rPr>
-        <w:t>alap</w:t>
-      </w:r>
-      <w:r>
-        <w:rPr>
-          <w:lang w:val="en-US"/>
-        </w:rPr>
-        <w:t xml:space="preserve"> </w:t>
-      </w:r>
-      <w:r>
-        <w:rPr>
-          <w:lang w:val="en-US"/>
-        </w:rPr>
-        <w:t>kidolgoz</w:t>
-      </w:r>
-      <w:r>
-        <w:rPr>
-          <w:lang w:val="en-US"/>
-        </w:rPr>
-        <w:t>á</w:t>
-      </w:r>
-      <w:r>
-        <w:rPr>
-          <w:lang w:val="en-US"/>
-        </w:rPr>
-        <w:t>sa</w:t>
-      </w:r>
-    </w:p>
-    <w:p>
-      <w:pPr>
-        <w:pStyle w:val="BodyText"/>
-        <w:numPr>
-          <w:ilvl w:val="1"/>
-          <w:numId w:val="46"/>
-        </w:numPr>
-        <w:rPr>
-          <w:lang w:val="en-US"/>
-        </w:rPr>
-      </w:pPr>
-      <w:r>
-        <w:rPr>
-          <w:lang w:val="en-US"/>
-        </w:rPr>
-        <w:t>Frontend</w:t>
-      </w:r>
-    </w:p>
-    <w:p>
-      <w:pPr>
-        <w:pStyle w:val="BodyText"/>
-        <w:numPr>
-          <w:ilvl w:val="2"/>
-          <w:numId w:val="46"/>
-        </w:numPr>
-        <w:rPr>
-          <w:lang w:val="en-US"/>
-        </w:rPr>
-      </w:pPr>
-      <w:r>
-        <w:rPr>
-          <w:lang w:val="en-US"/>
-        </w:rPr>
-        <w:t>Diz</w:t>
-      </w:r>
-      <w:r>
-        <w:rPr>
-          <w:lang w:val="en-US"/>
-        </w:rPr>
-        <w:t>á</w:t>
-      </w:r>
-      <w:r>
-        <w:rPr>
-          <w:lang w:val="en-US"/>
-        </w:rPr>
-        <w:t xml:space="preserve">jn </w:t>
-      </w:r>
-      <w:r>
-        <w:rPr>
-          <w:lang w:val="en-US"/>
-        </w:rPr>
-        <w:t>megtervez</w:t>
-      </w:r>
-      <w:r>
-        <w:rPr>
-          <w:lang w:val="en-US"/>
-        </w:rPr>
-        <w:t>é</w:t>
-      </w:r>
-      <w:r>
-        <w:rPr>
-          <w:lang w:val="en-US"/>
-        </w:rPr>
-        <w:t>se</w:t>
+        <w:t>és</w:t>
+      </w:r>
+      <w:r>
+        <w:rPr>
+          <w:lang w:val="en-US"/>
+        </w:rPr>
+        <w:t xml:space="preserve"> elkeszítése</w:t>
       </w:r>
     </w:p>
     <w:p>
@@ -5065,7 +4933,7 @@
         </w:rPr>
         <w:t xml:space="preserve"> - </w:t>
       </w:r>
-      <w:hyperlink r:id="Rcebb236a9350499b">
+      <w:hyperlink r:id="R8f48e5fb36a04e32">
         <w:r>
           <w:rPr>
             <w:rStyle w:val="Hyperlink"/>
@@ -5152,6 +5020,42 @@
         </w:rPr>
         <w:t>Controllerek</w:t>
       </w:r>
+      <w:r>
+        <w:rPr>
+          <w:lang w:val="en-US"/>
+        </w:rPr>
+        <w:t xml:space="preserve"> </w:t>
+      </w:r>
+      <w:r>
+        <w:rPr>
+          <w:lang w:val="en-US"/>
+        </w:rPr>
+        <w:t>teljes</w:t>
+      </w:r>
+      <w:r>
+        <w:rPr>
+          <w:lang w:val="en-US"/>
+        </w:rPr>
+        <w:t xml:space="preserve"> </w:t>
+      </w:r>
+      <w:r>
+        <w:rPr>
+          <w:lang w:val="en-US"/>
+        </w:rPr>
+        <w:t>kidolgoz</w:t>
+      </w:r>
+      <w:r>
+        <w:rPr>
+          <w:lang w:val="en-US"/>
+        </w:rPr>
+        <w:t>á</w:t>
+      </w:r>
+      <w:r>
+        <w:rPr>
+          <w:lang w:val="en-US"/>
+        </w:rPr>
+        <w:t>sa</w:t>
+      </w:r>
     </w:p>
     <w:p>
       <w:pPr>
@@ -5170,6 +5074,42 @@
         </w:rPr>
         <w:t>Modelek</w:t>
       </w:r>
+      <w:r>
+        <w:rPr>
+          <w:lang w:val="en-US"/>
+        </w:rPr>
+        <w:t xml:space="preserve"> </w:t>
+      </w:r>
+      <w:r>
+        <w:rPr>
+          <w:lang w:val="en-US"/>
+        </w:rPr>
+        <w:t>teljes</w:t>
+      </w:r>
+      <w:r>
+        <w:rPr>
+          <w:lang w:val="en-US"/>
+        </w:rPr>
+        <w:t xml:space="preserve"> </w:t>
+      </w:r>
+      <w:r>
+        <w:rPr>
+          <w:lang w:val="en-US"/>
+        </w:rPr>
+        <w:t>kidolgoz</w:t>
+      </w:r>
+      <w:r>
+        <w:rPr>
+          <w:lang w:val="en-US"/>
+        </w:rPr>
+        <w:t>á</w:t>
+      </w:r>
+      <w:r>
+        <w:rPr>
+          <w:lang w:val="en-US"/>
+        </w:rPr>
+        <w:t>sa</w:t>
+      </w:r>
     </w:p>
     <w:p>
       <w:pPr>
@@ -5188,6 +5128,24 @@
         </w:rPr>
         <w:t>Requestek</w:t>
       </w:r>
+      <w:r>
+        <w:rPr>
+          <w:lang w:val="en-US"/>
+        </w:rPr>
+        <w:t xml:space="preserve"> teljes kidolgoz</w:t>
+      </w:r>
+      <w:r>
+        <w:rPr>
+          <w:lang w:val="en-US"/>
+        </w:rPr>
+        <w:t>á</w:t>
+      </w:r>
+      <w:r>
+        <w:rPr>
+          <w:lang w:val="en-US"/>
+        </w:rPr>
+        <w:t>sa</w:t>
+      </w:r>
     </w:p>
     <w:p>
       <w:pPr>
@@ -5206,6 +5164,24 @@
         </w:rPr>
         <w:t>Resource-ok</w:t>
       </w:r>
+      <w:r>
+        <w:rPr>
+          <w:lang w:val="en-US"/>
+        </w:rPr>
+        <w:t xml:space="preserve"> teljes kidolgoz</w:t>
+      </w:r>
+      <w:r>
+        <w:rPr>
+          <w:lang w:val="en-US"/>
+        </w:rPr>
+        <w:t>á</w:t>
+      </w:r>
+      <w:r>
+        <w:rPr>
+          <w:lang w:val="en-US"/>
+        </w:rPr>
+        <w:t>sa</w:t>
+      </w:r>
     </w:p>
     <w:p>
       <w:pPr>
@@ -5222,7 +5198,85 @@
         <w:rPr>
           <w:lang w:val="en-US"/>
         </w:rPr>
-        <w:t>Api routing</w:t>
+        <w:t>A</w:t>
+      </w:r>
+      <w:r>
+        <w:rPr>
+          <w:lang w:val="en-US"/>
+        </w:rPr>
+        <w:t>PI routing</w:t>
+      </w:r>
+    </w:p>
+    <w:p>
+      <w:pPr>
+        <w:pStyle w:val="BodyText"/>
+        <w:numPr>
+          <w:ilvl w:val="2"/>
+          <w:numId w:val="46"/>
+        </w:numPr>
+        <w:rPr>
+          <w:lang w:val="en-US"/>
+        </w:rPr>
+      </w:pPr>
+      <w:r>
+        <w:rPr>
+          <w:lang w:val="en-US"/>
+        </w:rPr>
+        <w:t xml:space="preserve">Authentikáció </w:t>
+      </w:r>
+      <w:r>
+        <w:rPr>
+          <w:lang w:val="en-US"/>
+        </w:rPr>
+        <w:t>kezelés</w:t>
+      </w:r>
+    </w:p>
+    <w:p>
+      <w:pPr>
+        <w:pStyle w:val="BodyText"/>
+        <w:numPr>
+          <w:ilvl w:val="2"/>
+          <w:numId w:val="46"/>
+        </w:numPr>
+        <w:rPr>
+          <w:lang w:val="en-US"/>
+        </w:rPr>
+      </w:pPr>
+      <w:r>
+        <w:rPr>
+          <w:lang w:val="en-US"/>
+        </w:rPr>
+        <w:t xml:space="preserve">Migration </w:t>
+      </w:r>
+      <w:r>
+        <w:rPr>
+          <w:lang w:val="en-US"/>
+        </w:rPr>
+        <w:t>fileok</w:t>
+      </w:r>
+      <w:r>
+        <w:rPr>
+          <w:lang w:val="en-US"/>
+        </w:rPr>
+        <w:t xml:space="preserve"> </w:t>
+      </w:r>
+      <w:r>
+        <w:rPr>
+          <w:lang w:val="en-US"/>
+        </w:rPr>
+        <w:t>teljes</w:t>
+      </w:r>
+      <w:r>
+        <w:rPr>
+          <w:lang w:val="en-US"/>
+        </w:rPr>
+        <w:t xml:space="preserve"> </w:t>
+      </w:r>
+      <w:r>
+        <w:rPr>
+          <w:lang w:val="en-US"/>
+        </w:rPr>
+        <w:t>kidolgozása</w:t>
       </w:r>
     </w:p>
     <w:p>
@@ -5272,24 +5326,6 @@
         </w:rPr>
         <w:t>jn</w:t>
       </w:r>
-      <w:r>
-        <w:rPr>
-          <w:lang w:val="en-US"/>
-        </w:rPr>
-        <w:t xml:space="preserve"> megtervez</w:t>
-      </w:r>
-      <w:r>
-        <w:rPr>
-          <w:lang w:val="en-US"/>
-        </w:rPr>
-        <w:t>é</w:t>
-      </w:r>
-      <w:r>
-        <w:rPr>
-          <w:lang w:val="en-US"/>
-        </w:rPr>
-        <w:t>se</w:t>
-      </w:r>
     </w:p>
     <w:p>
       <w:pPr>
@@ -5390,13 +5426,7 @@
         <w:rPr>
           <w:lang w:val="en-US"/>
         </w:rPr>
-        <w:t>llas</w:t>
-      </w:r>
-      <w:r>
-        <w:rPr>
-          <w:lang w:val="en-US"/>
-        </w:rPr>
-        <w:t xml:space="preserve"> be</w:t>
+        <w:t>ll</w:t>
       </w:r>
       <w:r>
         <w:rPr>
@@ -5408,6 +5438,36 @@
         <w:rPr>
           <w:lang w:val="en-US"/>
         </w:rPr>
+        <w:t>s</w:t>
+      </w:r>
+      <w:r>
+        <w:rPr>
+          <w:lang w:val="en-US"/>
+        </w:rPr>
+        <w:t xml:space="preserve"> és profil</w:t>
+      </w:r>
+      <w:r>
+        <w:rPr>
+          <w:lang w:val="en-US"/>
+        </w:rPr>
+        <w:t xml:space="preserve"> </w:t>
+      </w:r>
+      <w:r>
+        <w:rPr>
+          <w:lang w:val="en-US"/>
+        </w:rPr>
+        <w:t>be</w:t>
+      </w:r>
+      <w:r>
+        <w:rPr>
+          <w:lang w:val="en-US"/>
+        </w:rPr>
+        <w:t>á</w:t>
+      </w:r>
+      <w:r>
+        <w:rPr>
+          <w:lang w:val="en-US"/>
+        </w:rPr>
         <w:t>ll</w:t>
       </w:r>
       <w:r>
@@ -5426,13 +5486,13 @@
         <w:rPr>
           <w:lang w:val="en-US"/>
         </w:rPr>
-        <w:t>ása</w:t>
-      </w:r>
-      <w:r>
-        <w:rPr>
-          <w:lang w:val="en-US"/>
-        </w:rPr>
-        <w:t>i</w:t>
+        <w:t>ás</w:t>
+      </w:r>
+      <w:r>
+        <w:rPr>
+          <w:lang w:val="en-US"/>
+        </w:rPr>
+        <w:t>ok</w:t>
       </w:r>
     </w:p>
     <w:p>
@@ -5442,27 +5502,121 @@
           <w:ilvl w:val="2"/>
           <w:numId w:val="46"/>
         </w:numPr>
-        <w:rPr>
-          <w:lang w:val="en-US"/>
-        </w:rPr>
-      </w:pPr>
-      <w:r>
-        <w:rPr>
-          <w:lang w:val="en-US"/>
-        </w:rPr>
-        <w:t>Diz</w:t>
-      </w:r>
-      <w:r>
-        <w:rPr>
-          <w:lang w:val="en-US"/>
-        </w:rPr>
-        <w:t>á</w:t>
-      </w:r>
-      <w:r>
-        <w:rPr>
-          <w:lang w:val="en-US"/>
-        </w:rPr>
-        <w:t>jn</w:t>
+        <w:suppressLineNumbers w:val="0"/>
+        <w:bidi w:val="0"/>
+        <w:spacing w:before="0" w:beforeAutospacing="off" w:after="140" w:afterAutospacing="off" w:line="276" w:lineRule="auto"/>
+        <w:ind w:left="2160" w:right="0" w:hanging="360"/>
+        <w:jc w:val="left"/>
+        <w:rPr>
+          <w:lang w:val="en-US"/>
+        </w:rPr>
+      </w:pPr>
+      <w:r>
+        <w:rPr>
+          <w:lang w:val="en-US"/>
+        </w:rPr>
+        <w:t>Kliens oldali validáció</w:t>
+      </w:r>
+    </w:p>
+    <w:p>
+      <w:pPr>
+        <w:pStyle w:val="BodyText"/>
+        <w:numPr>
+          <w:ilvl w:val="2"/>
+          <w:numId w:val="46"/>
+        </w:numPr>
+        <w:suppressLineNumbers w:val="0"/>
+        <w:bidi w:val="0"/>
+        <w:spacing w:before="0" w:beforeAutospacing="off" w:after="140" w:afterAutospacing="off" w:line="276" w:lineRule="auto"/>
+        <w:ind w:left="2160" w:right="0" w:hanging="360"/>
+        <w:jc w:val="left"/>
+        <w:rPr>
+          <w:lang w:val="en-US"/>
+        </w:rPr>
+      </w:pPr>
+      <w:r>
+        <w:rPr>
+          <w:lang w:val="en-US"/>
+        </w:rPr>
+        <w:t>Kisebb</w:t>
+      </w:r>
+      <w:r>
+        <w:rPr>
+          <w:lang w:val="en-US"/>
+        </w:rPr>
+        <w:t xml:space="preserve"> </w:t>
+      </w:r>
+      <w:r>
+        <w:rPr>
+          <w:lang w:val="en-US"/>
+        </w:rPr>
+        <w:t>komponensek</w:t>
+      </w:r>
+      <w:r>
+        <w:rPr>
+          <w:lang w:val="en-US"/>
+        </w:rPr>
+        <w:t xml:space="preserve"> </w:t>
+      </w:r>
+      <w:r>
+        <w:rPr>
+          <w:lang w:val="en-US"/>
+        </w:rPr>
+        <w:t>elkészítése</w:t>
+      </w:r>
+      <w:r>
+        <w:rPr>
+          <w:lang w:val="en-US"/>
+        </w:rPr>
+        <w:t xml:space="preserve"> (</w:t>
+      </w:r>
+      <w:r>
+        <w:rPr>
+          <w:lang w:val="en-US"/>
+        </w:rPr>
+        <w:t>Levél</w:t>
+      </w:r>
+      <w:r>
+        <w:rPr>
+          <w:lang w:val="en-US"/>
+        </w:rPr>
+        <w:t xml:space="preserve">, </w:t>
+      </w:r>
+      <w:r>
+        <w:rPr>
+          <w:lang w:val="en-US"/>
+        </w:rPr>
+        <w:t>Profil</w:t>
+      </w:r>
+      <w:r>
+        <w:rPr>
+          <w:lang w:val="en-US"/>
+        </w:rPr>
+        <w:t xml:space="preserve"> </w:t>
+      </w:r>
+      <w:r>
+        <w:rPr>
+          <w:lang w:val="en-US"/>
+        </w:rPr>
+        <w:t>kártya</w:t>
+      </w:r>
+      <w:r>
+        <w:rPr>
+          <w:lang w:val="en-US"/>
+        </w:rPr>
+        <w:t xml:space="preserve"> </w:t>
+      </w:r>
+      <w:r>
+        <w:rPr>
+          <w:lang w:val="en-US"/>
+        </w:rPr>
+        <w:t>stb</w:t>
+      </w:r>
+      <w:r>
+        <w:rPr>
+          <w:lang w:val="en-US"/>
+        </w:rPr>
+        <w:t>.)</w:t>
       </w:r>
     </w:p>
     <w:p>
@@ -5577,7 +5731,15 @@
       </w:pPr>
       <w:r>
         <w:rPr/>
-        <w:t>Entitástáblák (8db): Ezek a táblák tartalmazzák az alkalmazás legfontosabb részeit. (Felhasználok, Állasok, Értékelések stb.)</w:t>
+        <w:t>Entitástáblák (8db): Ezek a táblák tartalmazzák az alkalmazás legfontosabb részeit. (Felhasználok, Áll</w:t>
+      </w:r>
+      <w:r>
+        <w:rPr/>
+        <w:t>á</w:t>
+      </w:r>
+      <w:r>
+        <w:rPr/>
+        <w:t>sok, Értékelések stb.)</w:t>
       </w:r>
     </w:p>
     <w:p>
@@ -5684,7 +5846,7 @@
       </w:pPr>
       <w:r>
         <w:drawing>
-          <wp:inline wp14:editId="60CC1517" wp14:anchorId="5D85C837">
+          <wp:inline wp14:editId="4F4BA657" wp14:anchorId="5D85C837">
             <wp:extent cx="6124575" cy="3524250"/>
             <wp:effectExtent l="0" t="0" r="0" b="0"/>
             <wp:docPr id="566924178" name="drawing"/>
@@ -5786,7 +5948,7 @@
       </w:pPr>
       <w:r>
         <w:drawing>
-          <wp:inline wp14:editId="01E896EC" wp14:anchorId="06719475">
+          <wp:inline wp14:editId="44CD8695" wp14:anchorId="06719475">
             <wp:extent cx="6124575" cy="4048125"/>
             <wp:effectExtent l="0" t="0" r="0" b="0"/>
             <wp:docPr id="1641956920" name="drawing"/>
@@ -15354,7 +15516,23 @@
       </w:r>
       <w:r>
         <w:rPr/>
-        <w:t xml:space="preserve">t a frontend szamara. A rendszer </w:t>
+        <w:t>t a frontend sz</w:t>
+      </w:r>
+      <w:r>
+        <w:rPr/>
+        <w:t>á</w:t>
+      </w:r>
+      <w:r>
+        <w:rPr/>
+        <w:t>m</w:t>
+      </w:r>
+      <w:r>
+        <w:rPr/>
+        <w:t>á</w:t>
+      </w:r>
+      <w:r>
+        <w:rPr/>
+        <w:t xml:space="preserve">ra. A rendszer </w:t>
       </w:r>
       <w:r>
         <w:rPr/>
@@ -15636,7 +15814,23 @@
       </w:r>
       <w:r>
         <w:rPr/>
-        <w:t xml:space="preserve"> szamara</w:t>
+        <w:t xml:space="preserve"> sz</w:t>
+      </w:r>
+      <w:r>
+        <w:rPr/>
+        <w:t>á</w:t>
+      </w:r>
+      <w:r>
+        <w:rPr/>
+        <w:t>m</w:t>
+      </w:r>
+      <w:r>
+        <w:rPr/>
+        <w:t>á</w:t>
+      </w:r>
+      <w:r>
+        <w:rPr/>
+        <w:t>ra</w:t>
       </w:r>
     </w:p>
     <w:p>
@@ -16038,7 +16232,13 @@
         <w:rPr>
           <w:lang w:val="de-DE"/>
         </w:rPr>
-        <w:t xml:space="preserve">es </w:t>
+        <w:t>é</w:t>
+      </w:r>
+      <w:r>
+        <w:rPr>
+          <w:lang w:val="de-DE"/>
+        </w:rPr>
+        <w:t xml:space="preserve">s </w:t>
       </w:r>
       <w:r>
         <w:rPr>
@@ -16421,19 +16621,19 @@
         <w:rPr>
           <w:lang w:val="en-US"/>
         </w:rPr>
-        <w:t>egyed</w:t>
-      </w:r>
-      <w:r>
-        <w:rPr>
-          <w:lang w:val="en-US"/>
-        </w:rPr>
-        <w:t>é</w:t>
-      </w:r>
-      <w:r>
-        <w:rPr>
-          <w:lang w:val="en-US"/>
-        </w:rPr>
-        <w:t>hez</w:t>
+        <w:t>e</w:t>
+      </w:r>
+      <w:r>
+        <w:rPr>
+          <w:lang w:val="en-US"/>
+        </w:rPr>
+        <w:t>ntitásáho</w:t>
+      </w:r>
+      <w:r>
+        <w:rPr>
+          <w:lang w:val="en-US"/>
+        </w:rPr>
+        <w:t>z</w:t>
       </w:r>
       <w:r>
         <w:rPr>
@@ -18606,7 +18806,7 @@
         <w:rPr/>
         <w:t xml:space="preserve"> kell lennie (</w:t>
       </w:r>
-      <w:hyperlink r:id="R3b109bf83d184b4c">
+      <w:hyperlink r:id="R5f80cf88a69441df">
         <w:r>
           <w:rPr>
             <w:rStyle w:val="Hyperlink"/>
@@ -34195,7 +34395,15 @@
             </w:r>
             <w:r>
               <w:rPr/>
-              <w:t>állas</w:t>
+              <w:t>áll</w:t>
+            </w:r>
+            <w:r>
+              <w:rPr/>
+              <w:t>á</w:t>
+            </w:r>
+            <w:r>
+              <w:rPr/>
+              <w:t>s</w:t>
             </w:r>
           </w:p>
         </w:tc>
@@ -34257,7 +34465,15 @@
             </w:r>
             <w:r>
               <w:rPr/>
-              <w:t>állas</w:t>
+              <w:t>áll</w:t>
+            </w:r>
+            <w:r>
+              <w:rPr/>
+              <w:t>á</w:t>
+            </w:r>
+            <w:r>
+              <w:rPr/>
+              <w:t>s</w:t>
             </w:r>
             <w:r>
               <w:rPr/>
@@ -34649,7 +34865,11 @@
             </w:r>
             <w:r>
               <w:rPr/>
-              <w:t>állasok</w:t>
+              <w:t>állás</w:t>
+            </w:r>
+            <w:r>
+              <w:rPr/>
+              <w:t>ok</w:t>
             </w:r>
           </w:p>
         </w:tc>
@@ -34825,7 +35045,7 @@
             </w:r>
             <w:r>
               <w:rPr/>
-              <w:t>állas</w:t>
+              <w:t>állás</w:t>
             </w:r>
             <w:r>
               <w:rPr/>
@@ -34917,11 +35137,7 @@
             </w:r>
             <w:r>
               <w:rPr/>
-              <w:t>állas</w:t>
-            </w:r>
-            <w:r>
-              <w:rPr/>
-              <w:t xml:space="preserve"> </w:t>
+              <w:t xml:space="preserve">állás </w:t>
             </w:r>
             <w:r>
               <w:rPr/>
@@ -35105,7 +35321,11 @@
             </w:r>
             <w:r>
               <w:rPr/>
-              <w:t>állasból</w:t>
+              <w:t>állás</w:t>
+            </w:r>
+            <w:r>
+              <w:rPr/>
+              <w:t>ból</w:t>
             </w:r>
           </w:p>
         </w:tc>
@@ -35193,11 +35413,11 @@
             </w:r>
             <w:r>
               <w:rPr/>
-              <w:t>á</w:t>
-            </w:r>
-            <w:r>
-              <w:rPr/>
-              <w:t>llasnak</w:t>
+              <w:t>állás</w:t>
+            </w:r>
+            <w:r>
+              <w:rPr/>
+              <w:t>nak</w:t>
             </w:r>
           </w:p>
         </w:tc>
@@ -36003,7 +36223,7 @@
       </w:r>
       <w:r>
         <w:rPr/>
-        <w:t>állas</w:t>
+        <w:t>állás</w:t>
       </w:r>
     </w:p>
     <w:p>
@@ -36018,11 +36238,7 @@
       </w:pPr>
       <w:r>
         <w:rPr/>
-        <w:t>Állas</w:t>
-      </w:r>
-      <w:r>
-        <w:rPr/>
-        <w:t xml:space="preserve"> </w:t>
+        <w:t xml:space="preserve">Állás </w:t>
       </w:r>
       <w:r>
         <w:rPr/>
@@ -36294,7 +36510,11 @@
       </w:pPr>
       <w:r>
         <w:rPr/>
-        <w:t>Állasok</w:t>
+        <w:t>Állás</w:t>
+      </w:r>
+      <w:r>
+        <w:rPr/>
+        <w:t>ok</w:t>
       </w:r>
       <w:r>
         <w:rPr/>
@@ -36780,7 +37000,7 @@
         <w:rPr/>
         <w:t xml:space="preserve"> a </w:t>
       </w:r>
-      <w:hyperlink r:id="R9038542194f24133">
+      <w:hyperlink r:id="Rf6b4a81c55004bf9">
         <w:r>
           <w:rPr>
             <w:rStyle w:val="Hyperlink"/>
@@ -36836,7 +37056,7 @@
         </w:rPr>
         <w:t xml:space="preserve"> </w:t>
       </w:r>
-      <w:hyperlink r:id="Rf3a35fe3e473494a">
+      <w:hyperlink r:id="R4a8e1e8708044fc4">
         <w:r>
           <w:rPr>
             <w:rStyle w:val="Hyperlink"/>
@@ -37018,7 +37238,7 @@
         <w:bidi w:val="0"/>
         <w:rPr/>
       </w:pPr>
-      <w:hyperlink r:id="Re57ea68bb74c4b1f">
+      <w:hyperlink r:id="Re743abb2590444e9">
         <w:r>
           <w:rPr>
             <w:rStyle w:val="Hyperlink"/>
@@ -37037,7 +37257,7 @@
         <w:bidi w:val="0"/>
         <w:rPr/>
       </w:pPr>
-      <w:hyperlink r:id="Rc4a44a82176f4b8d">
+      <w:hyperlink r:id="Re1d253fdb53c4d21">
         <w:r>
           <w:rPr>
             <w:rStyle w:val="Hyperlink"/>
@@ -37056,7 +37276,7 @@
         <w:bidi w:val="0"/>
         <w:rPr/>
       </w:pPr>
-      <w:hyperlink r:id="R533a1c67c7ea4c27">
+      <w:hyperlink r:id="R04051ca1b661406d">
         <w:r>
           <w:rPr>
             <w:rStyle w:val="Hyperlink"/>
@@ -37075,7 +37295,7 @@
         <w:bidi w:val="0"/>
         <w:rPr/>
       </w:pPr>
-      <w:hyperlink r:id="R7b6e6ca4f9fd43cb">
+      <w:hyperlink r:id="R8e9552fe165e4656">
         <w:r>
           <w:rPr>
             <w:rStyle w:val="Hyperlink"/>
@@ -38261,7 +38481,7 @@
       </w:pPr>
       <w:r>
         <w:drawing>
-          <wp:inline wp14:editId="1D07D650" wp14:anchorId="751C59EE">
+          <wp:inline wp14:editId="213B7DFB" wp14:anchorId="751C59EE">
             <wp:extent cx="6124575" cy="3448050"/>
             <wp:effectExtent l="0" t="0" r="0" b="0"/>
             <wp:docPr id="1591578298" name="drawing"/>
@@ -38429,7 +38649,7 @@
       </w:pPr>
       <w:r>
         <w:drawing>
-          <wp:inline wp14:editId="75889192" wp14:anchorId="63A3F7B4">
+          <wp:inline wp14:editId="3610DA9D" wp14:anchorId="63A3F7B4">
             <wp:extent cx="6124575" cy="3448050"/>
             <wp:effectExtent l="0" t="0" r="0" b="0"/>
             <wp:docPr id="110587260" name="drawing"/>
@@ -38616,7 +38836,7 @@
       </w:pPr>
       <w:r>
         <w:drawing>
-          <wp:inline wp14:editId="470F363A" wp14:anchorId="2B059988">
+          <wp:inline wp14:editId="48258BEE" wp14:anchorId="2B059988">
             <wp:extent cx="6124575" cy="3448050"/>
             <wp:effectExtent l="0" t="0" r="0" b="0"/>
             <wp:docPr id="779278686" name="drawing"/>
@@ -38864,7 +39084,7 @@
       </w:pPr>
       <w:r>
         <w:drawing>
-          <wp:inline wp14:editId="5DB50B62" wp14:anchorId="5C18C527">
+          <wp:inline wp14:editId="11CB435D" wp14:anchorId="5C18C527">
             <wp:extent cx="5257800" cy="2960068"/>
             <wp:effectExtent l="0" t="0" r="0" b="0"/>
             <wp:docPr id="1977319881" name="drawing"/>
@@ -39168,7 +39388,7 @@
       </w:pPr>
       <w:r>
         <w:drawing>
-          <wp:inline wp14:editId="377B53EC" wp14:anchorId="58564D26">
+          <wp:inline wp14:editId="29CFDD19" wp14:anchorId="58564D26">
             <wp:extent cx="6124575" cy="3448050"/>
             <wp:effectExtent l="0" t="0" r="0" b="0"/>
             <wp:docPr id="505379283" name="drawing"/>
@@ -39224,7 +39444,7 @@
       </w:pPr>
       <w:r>
         <w:drawing>
-          <wp:inline wp14:editId="2F913B76" wp14:anchorId="647DC8E1">
+          <wp:inline wp14:editId="580BF7E1" wp14:anchorId="647DC8E1">
             <wp:extent cx="6124575" cy="3448050"/>
             <wp:effectExtent l="0" t="0" r="0" b="0"/>
             <wp:docPr id="261860662" name="drawing"/>
@@ -39539,7 +39759,7 @@
       </w:pPr>
       <w:r>
         <w:drawing>
-          <wp:inline wp14:editId="7C796BCD" wp14:anchorId="21E63B9F">
+          <wp:inline wp14:editId="0529F3DF" wp14:anchorId="21E63B9F">
             <wp:extent cx="6124575" cy="3448050"/>
             <wp:effectExtent l="0" t="0" r="0" b="0"/>
             <wp:docPr id="13254848" name="drawing"/>
@@ -39983,7 +40203,7 @@
       </w:pPr>
       <w:r>
         <w:drawing>
-          <wp:inline wp14:editId="1C7A0210" wp14:anchorId="10C24F41">
+          <wp:inline wp14:editId="503E7002" wp14:anchorId="10C24F41">
             <wp:extent cx="6124575" cy="3448050"/>
             <wp:effectExtent l="0" t="0" r="0" b="0"/>
             <wp:docPr id="310248813" name="drawing"/>
@@ -40095,7 +40315,7 @@
       </w:pPr>
       <w:r>
         <w:drawing>
-          <wp:inline wp14:editId="25D24493" wp14:anchorId="18128EA2">
+          <wp:inline wp14:editId="00EE76F4" wp14:anchorId="18128EA2">
             <wp:extent cx="6124575" cy="3448050"/>
             <wp:effectExtent l="0" t="0" r="0" b="0"/>
             <wp:docPr id="107390649" name="drawing"/>
@@ -40348,7 +40568,7 @@
         <w:bidi w:val="0"/>
         <w:rPr/>
       </w:pPr>
-      <w:hyperlink r:id="R5fbdaad09fe04510">
+      <w:hyperlink r:id="R9292a424a4bf4103">
         <w:r>
           <w:rPr>
             <w:rStyle w:val="Hyperlink"/>
@@ -40371,7 +40591,7 @@
         <w:bidi w:val="0"/>
         <w:rPr/>
       </w:pPr>
-      <w:hyperlink r:id="Ra9fdf566a01f43ce">
+      <w:hyperlink r:id="R42517852c9bb4f69">
         <w:r>
           <w:rPr>
             <w:rStyle w:val="Hyperlink"/>
@@ -40476,7 +40696,7 @@
       </w:pPr>
       <w:r>
         <w:drawing>
-          <wp:inline wp14:editId="6FE61415" wp14:anchorId="01D097F8">
+          <wp:inline wp14:editId="7ABBE2E8" wp14:anchorId="01D097F8">
             <wp:extent cx="6124575" cy="3448050"/>
             <wp:effectExtent l="0" t="0" r="0" b="0"/>
             <wp:docPr id="10194055" name="drawing"/>
@@ -40755,7 +40975,7 @@
       </w:pPr>
       <w:r>
         <w:drawing>
-          <wp:inline wp14:editId="46351A81" wp14:anchorId="700F6258">
+          <wp:inline wp14:editId="6104E54B" wp14:anchorId="700F6258">
             <wp:extent cx="6124575" cy="3448050"/>
             <wp:effectExtent l="0" t="0" r="0" b="0"/>
             <wp:docPr id="223293626" name="drawing"/>
@@ -40806,11 +41026,19 @@
       </w:r>
       <w:r>
         <w:rPr/>
-        <w:t xml:space="preserve"> akkor kap egy felhasznalo, amikor nem </w:t>
-      </w:r>
-      <w:r>
-        <w:rPr/>
-        <w:t>letezo</w:t>
+        <w:t xml:space="preserve"> akkor kap egy </w:t>
+      </w:r>
+      <w:r>
+        <w:rPr/>
+        <w:t>felhasználó</w:t>
+      </w:r>
+      <w:r>
+        <w:rPr/>
+        <w:t xml:space="preserve">, amikor nem </w:t>
+      </w:r>
+      <w:r>
+        <w:rPr/>
+        <w:t>létező</w:t>
       </w:r>
       <w:r>
         <w:rPr/>
@@ -40818,7 +41046,7 @@
       </w:r>
       <w:r>
         <w:rPr/>
-        <w:t>navigal</w:t>
+        <w:t>navigál</w:t>
       </w:r>
     </w:p>
     <w:p>
@@ -40827,7 +41055,7 @@
       </w:pPr>
       <w:r>
         <w:drawing>
-          <wp:inline wp14:editId="2339275A" wp14:anchorId="2B63E2F4">
+          <wp:inline wp14:editId="7C2831DF" wp14:anchorId="2B63E2F4">
             <wp:extent cx="6124575" cy="3448050"/>
             <wp:effectExtent l="0" t="0" r="0" b="0"/>
             <wp:docPr id="585909033" name="drawing"/>
@@ -41267,6 +41495,10 @@
       <w:r>
         <w:rPr/>
         <w:t>admin</w:t>
+      </w:r>
+      <w:r>
+        <w:rPr/>
+        <w:t>ná</w:t>
       </w:r>
       <w:r>
         <w:rPr/>
@@ -47675,7 +47907,7 @@
     <w:unhideWhenUsed/>
     <w:link w:val="Heading4Char"/>
     <w:qFormat/>
-    <w:rsid w:val="6504227B"/>
+    <w:rsid w:val="6FD4B6DF"/>
     <w:rPr>
       <w:rFonts w:eastAsia="DejaVu Sans" w:cs="DejaVu Sans" w:eastAsiaTheme="majorEastAsia" w:cstheme="majorBidi"/>
       <w:i w:val="1"/>
@@ -47694,7 +47926,7 @@
     <w:name w:val="Heading 4 Char"/>
     <w:basedOn w:val="DefaultParagraphFont"/>
     <w:link w:val="Heading4"/>
-    <w:rsid w:val="6504227B"/>
+    <w:rsid w:val="6FD4B6DF"/>
     <w:rPr>
       <w:rFonts w:eastAsia="DejaVu Sans" w:cs="DejaVu Sans" w:eastAsiaTheme="majorEastAsia" w:cstheme="majorBidi"/>
       <w:i w:val="1"/>
@@ -47708,7 +47940,7 @@
     <w:basedOn w:val="Normal"/>
     <w:next w:val="Normal"/>
     <w:unhideWhenUsed/>
-    <w:rsid w:val="6504227B"/>
+    <w:rsid w:val="6FD4B6DF"/>
     <w:pPr>
       <w:spacing w:after="100"/>
       <w:ind w:left="660"/>

</xml_diff>